<commit_message>
ci: relocate github actions workflow to repository root
</commit_message>
<xml_diff>
--- a/cloud-engineering-roadmap/Certifications/CV/RAAFINDRA WAHYU PRATAMA.docx
+++ b/cloud-engineering-roadmap/Certifications/CV/RAAFINDRA WAHYU PRATAMA.docx
@@ -32,19 +32,43 @@
         <w:spacing w:before="100" w:beforeAutospacing="1" w:after="100" w:afterAutospacing="1" w:line="240" w:lineRule="auto"/>
         <w:rPr>
           <w:rFonts w:ascii="Times New Roman" w:eastAsia="Times New Roman" w:hAnsi="Times New Roman" w:cs="Times New Roman"/>
-          <w:sz w:val="24"/>
-          <w:szCs w:val="24"/>
-        </w:rPr>
-      </w:pPr>
-      <w:r>
-        <w:rPr>
-          <w:rFonts w:ascii="Times New Roman" w:eastAsia="Times New Roman" w:hAnsi="Times New Roman" w:cs="Times New Roman"/>
-          <w:b/>
-          <w:bCs/>
-          <w:sz w:val="24"/>
-          <w:szCs w:val="24"/>
-        </w:rPr>
-        <w:t>System Engineer | Cloud &amp; Infrastructure | Linux | Automation | Docker &amp; Kubernetes</w:t>
+          <w:b/>
+          <w:bCs/>
+          <w:sz w:val="24"/>
+          <w:szCs w:val="24"/>
+        </w:rPr>
+      </w:pPr>
+      <w:r>
+        <w:rPr>
+          <w:rFonts w:ascii="Times New Roman" w:eastAsia="Times New Roman" w:hAnsi="Times New Roman" w:cs="Times New Roman"/>
+          <w:b/>
+          <w:bCs/>
+          <w:sz w:val="24"/>
+          <w:szCs w:val="24"/>
+        </w:rPr>
+        <w:t xml:space="preserve">Cloud &amp; DevOps Infrastructure Engineer | Linux Enterprise | Terraform &amp; </w:t>
+      </w:r>
+      <w:proofErr w:type="spellStart"/>
+      <w:r>
+        <w:rPr>
+          <w:rFonts w:ascii="Times New Roman" w:eastAsia="Times New Roman" w:hAnsi="Times New Roman" w:cs="Times New Roman"/>
+          <w:b/>
+          <w:bCs/>
+          <w:sz w:val="24"/>
+          <w:szCs w:val="24"/>
+        </w:rPr>
+        <w:t>IaC</w:t>
+      </w:r>
+      <w:proofErr w:type="spellEnd"/>
+      <w:r>
+        <w:rPr>
+          <w:rFonts w:ascii="Times New Roman" w:eastAsia="Times New Roman" w:hAnsi="Times New Roman" w:cs="Times New Roman"/>
+          <w:b/>
+          <w:bCs/>
+          <w:sz w:val="24"/>
+          <w:szCs w:val="24"/>
+        </w:rPr>
+        <w:t xml:space="preserve"> | Production Operations</w:t>
       </w:r>
     </w:p>
     <w:p>
@@ -102,8 +126,23 @@
           <w:sz w:val="20"/>
           <w:szCs w:val="20"/>
         </w:rPr>
-        <w:br/>
-        <w:t>LinkedIn: [</w:t>
+        <w:t xml:space="preserve"> | </w:t>
+      </w:r>
+      <w:r>
+        <w:rPr>
+          <w:rFonts w:ascii="Times New Roman" w:eastAsia="Times New Roman" w:hAnsi="Times New Roman" w:cs="Times New Roman"/>
+          <w:sz w:val="20"/>
+          <w:szCs w:val="20"/>
+        </w:rPr>
+        <w:t xml:space="preserve">LinkedIn: </w:t>
+      </w:r>
+      <w:r>
+        <w:rPr>
+          <w:rFonts w:ascii="Times New Roman" w:eastAsia="Times New Roman" w:hAnsi="Times New Roman" w:cs="Times New Roman"/>
+          <w:sz w:val="20"/>
+          <w:szCs w:val="20"/>
+        </w:rPr>
+        <w:t>[</w:t>
       </w:r>
       <w:r>
         <w:rPr>
@@ -129,8 +168,6 @@
         </w:rPr>
         <w:t>https://github.com/raafindra</w:t>
       </w:r>
-      <w:bookmarkStart w:id="0" w:name="_GoBack"/>
-      <w:bookmarkEnd w:id="0"/>
       <w:r>
         <w:rPr>
           <w:rFonts w:ascii="Times New Roman" w:eastAsia="Times New Roman" w:hAnsi="Times New Roman" w:cs="Times New Roman"/>
@@ -185,45 +222,61 @@
     </w:p>
     <w:p>
       <w:pPr>
-        <w:spacing w:before="100" w:beforeAutospacing="1" w:after="100" w:afterAutospacing="1" w:line="240" w:lineRule="auto"/>
-        <w:rPr>
-          <w:rFonts w:ascii="Times New Roman" w:eastAsia="Times New Roman" w:hAnsi="Times New Roman" w:cs="Times New Roman"/>
-          <w:sz w:val="20"/>
-          <w:szCs w:val="20"/>
-        </w:rPr>
-      </w:pPr>
-      <w:r>
-        <w:rPr>
-          <w:rFonts w:ascii="Times New Roman" w:eastAsia="Times New Roman" w:hAnsi="Times New Roman" w:cs="Times New Roman"/>
-          <w:sz w:val="20"/>
-          <w:szCs w:val="20"/>
-        </w:rPr>
-        <w:t xml:space="preserve">System Engineer with </w:t>
-      </w:r>
-      <w:r>
-        <w:rPr>
-          <w:rFonts w:ascii="Times New Roman" w:eastAsia="Times New Roman" w:hAnsi="Times New Roman" w:cs="Times New Roman"/>
-          <w:b/>
-          <w:bCs/>
-          <w:sz w:val="20"/>
-          <w:szCs w:val="20"/>
-        </w:rPr>
-        <w:t>8+ years of experience</w:t>
-      </w:r>
-      <w:r>
-        <w:rPr>
-          <w:rFonts w:ascii="Times New Roman" w:eastAsia="Times New Roman" w:hAnsi="Times New Roman" w:cs="Times New Roman"/>
-          <w:sz w:val="20"/>
-          <w:szCs w:val="20"/>
-        </w:rPr>
-        <w:t xml:space="preserve"> in enterprise IT operations, production support, systems integration, troubleshooting, and automation. Experienced in supporting high-reliability environments for enterprise and telecommunications clients, with professional experience at </w:t>
+        <w:spacing w:after="0" w:line="240" w:lineRule="auto"/>
+        <w:rPr>
+          <w:rFonts w:ascii="Times New Roman" w:eastAsia="Times New Roman" w:hAnsi="Times New Roman" w:cs="Times New Roman"/>
+          <w:sz w:val="20"/>
+          <w:szCs w:val="20"/>
+        </w:rPr>
+      </w:pPr>
+      <w:r>
+        <w:rPr>
+          <w:rFonts w:ascii="Times New Roman" w:hAnsi="Times New Roman" w:cs="Times New Roman"/>
+          <w:sz w:val="20"/>
+          <w:szCs w:val="20"/>
+        </w:rPr>
+        <w:t>Results-driven Systems &amp; Cloud Infrastructure Engineer with 8+ years of enterprise experience supporting mission-critical telecom environments (</w:t>
       </w:r>
       <w:proofErr w:type="spellStart"/>
       <w:r>
         <w:rPr>
-          <w:rFonts w:ascii="Times New Roman" w:eastAsia="Times New Roman" w:hAnsi="Times New Roman" w:cs="Times New Roman"/>
-          <w:b/>
-          <w:bCs/>
+          <w:rFonts w:ascii="Times New Roman" w:hAnsi="Times New Roman" w:cs="Times New Roman"/>
+          <w:sz w:val="20"/>
+          <w:szCs w:val="20"/>
+        </w:rPr>
+        <w:t>Indosat</w:t>
+      </w:r>
+      <w:proofErr w:type="spellEnd"/>
+      <w:r>
+        <w:rPr>
+          <w:rFonts w:ascii="Times New Roman" w:hAnsi="Times New Roman" w:cs="Times New Roman"/>
+          <w:sz w:val="20"/>
+          <w:szCs w:val="20"/>
+        </w:rPr>
+        <w:t xml:space="preserve"> </w:t>
+      </w:r>
+      <w:proofErr w:type="spellStart"/>
+      <w:r>
+        <w:rPr>
+          <w:rFonts w:ascii="Times New Roman" w:hAnsi="Times New Roman" w:cs="Times New Roman"/>
+          <w:sz w:val="20"/>
+          <w:szCs w:val="20"/>
+        </w:rPr>
+        <w:t>Ooredoo</w:t>
+      </w:r>
+      <w:proofErr w:type="spellEnd"/>
+      <w:r>
+        <w:rPr>
+          <w:rFonts w:ascii="Times New Roman" w:hAnsi="Times New Roman" w:cs="Times New Roman"/>
+          <w:sz w:val="20"/>
+          <w:szCs w:val="20"/>
+        </w:rPr>
+        <w:t xml:space="preserve"> Hutchison) across </w:t>
+      </w:r>
+      <w:proofErr w:type="spellStart"/>
+      <w:r>
+        <w:rPr>
+          <w:rFonts w:ascii="Times New Roman" w:hAnsi="Times New Roman" w:cs="Times New Roman"/>
           <w:sz w:val="20"/>
           <w:szCs w:val="20"/>
         </w:rPr>
@@ -232,9 +285,7 @@
       <w:proofErr w:type="spellEnd"/>
       <w:r>
         <w:rPr>
-          <w:rFonts w:ascii="Times New Roman" w:eastAsia="Times New Roman" w:hAnsi="Times New Roman" w:cs="Times New Roman"/>
-          <w:b/>
-          <w:bCs/>
+          <w:rFonts w:ascii="Times New Roman" w:hAnsi="Times New Roman" w:cs="Times New Roman"/>
           <w:sz w:val="20"/>
           <w:szCs w:val="20"/>
         </w:rPr>
@@ -243,9 +294,7 @@
       <w:proofErr w:type="spellStart"/>
       <w:r>
         <w:rPr>
-          <w:rFonts w:ascii="Times New Roman" w:eastAsia="Times New Roman" w:hAnsi="Times New Roman" w:cs="Times New Roman"/>
-          <w:b/>
-          <w:bCs/>
+          <w:rFonts w:ascii="Times New Roman" w:hAnsi="Times New Roman" w:cs="Times New Roman"/>
           <w:sz w:val="20"/>
           <w:szCs w:val="20"/>
         </w:rPr>
@@ -254,85 +303,27 @@
       <w:proofErr w:type="spellEnd"/>
       <w:r>
         <w:rPr>
-          <w:rFonts w:ascii="Times New Roman" w:eastAsia="Times New Roman" w:hAnsi="Times New Roman" w:cs="Times New Roman"/>
-          <w:b/>
-          <w:bCs/>
-          <w:sz w:val="20"/>
-          <w:szCs w:val="20"/>
-        </w:rPr>
-        <w:t xml:space="preserve">, IBM, and </w:t>
-      </w:r>
-      <w:proofErr w:type="spellStart"/>
-      <w:r>
-        <w:rPr>
-          <w:rFonts w:ascii="Times New Roman" w:eastAsia="Times New Roman" w:hAnsi="Times New Roman" w:cs="Times New Roman"/>
-          <w:b/>
-          <w:bCs/>
-          <w:sz w:val="20"/>
-          <w:szCs w:val="20"/>
-        </w:rPr>
-        <w:t>Indocyber</w:t>
-      </w:r>
-      <w:proofErr w:type="spellEnd"/>
-      <w:r>
-        <w:rPr>
-          <w:rFonts w:ascii="Times New Roman" w:eastAsia="Times New Roman" w:hAnsi="Times New Roman" w:cs="Times New Roman"/>
-          <w:sz w:val="20"/>
-          <w:szCs w:val="20"/>
-        </w:rPr>
-        <w:t xml:space="preserve">. Strong technical background in </w:t>
-      </w:r>
-      <w:r>
-        <w:rPr>
-          <w:rFonts w:ascii="Times New Roman" w:eastAsia="Times New Roman" w:hAnsi="Times New Roman" w:cs="Times New Roman"/>
-          <w:b/>
-          <w:bCs/>
-          <w:sz w:val="20"/>
-          <w:szCs w:val="20"/>
-        </w:rPr>
-        <w:t>Linux/Unix, Shell scripting, Python automation, Docker, Kubernetes, monitoring, systems integration, and application support</w:t>
-      </w:r>
-      <w:r>
-        <w:rPr>
-          <w:rFonts w:ascii="Times New Roman" w:eastAsia="Times New Roman" w:hAnsi="Times New Roman" w:cs="Times New Roman"/>
-          <w:sz w:val="20"/>
-          <w:szCs w:val="20"/>
-        </w:rPr>
-        <w:t xml:space="preserve">. Experienced in collaborating across L1/L3 teams to investigate incidents and implement temporary or permanent solutions. Currently expanding hands-on expertise in </w:t>
-      </w:r>
-      <w:r>
-        <w:rPr>
-          <w:rFonts w:ascii="Times New Roman" w:eastAsia="Times New Roman" w:hAnsi="Times New Roman" w:cs="Times New Roman"/>
-          <w:b/>
-          <w:bCs/>
-          <w:sz w:val="20"/>
-          <w:szCs w:val="20"/>
-        </w:rPr>
-        <w:t>cloud infrastructure, DevOps, containerization, networking, and AWS</w:t>
-      </w:r>
-      <w:r>
-        <w:rPr>
-          <w:rFonts w:ascii="Times New Roman" w:eastAsia="Times New Roman" w:hAnsi="Times New Roman" w:cs="Times New Roman"/>
-          <w:sz w:val="20"/>
-          <w:szCs w:val="20"/>
-        </w:rPr>
-        <w:t>, with a long-term focus on Cloud Engineering opportunities in Singapore.</w:t>
-      </w:r>
-    </w:p>
-    <w:p>
-      <w:pPr>
-        <w:spacing w:after="0" w:line="240" w:lineRule="auto"/>
-        <w:rPr>
-          <w:rFonts w:ascii="Times New Roman" w:eastAsia="Times New Roman" w:hAnsi="Times New Roman" w:cs="Times New Roman"/>
-          <w:sz w:val="24"/>
-          <w:szCs w:val="24"/>
-        </w:rPr>
-      </w:pPr>
-      <w:r>
-        <w:rPr>
-          <w:rFonts w:ascii="Times New Roman" w:eastAsia="Times New Roman" w:hAnsi="Times New Roman" w:cs="Times New Roman"/>
-          <w:sz w:val="24"/>
-          <w:szCs w:val="24"/>
+          <w:rFonts w:ascii="Times New Roman" w:hAnsi="Times New Roman" w:cs="Times New Roman"/>
+          <w:sz w:val="20"/>
+          <w:szCs w:val="20"/>
+        </w:rPr>
+        <w:t xml:space="preserve">, and IBM. Proven expertise in enterprise Linux administration, Python/Shell automation, and modern Infrastructure as Code </w:t>
+      </w:r>
+      <w:bookmarkStart w:id="0" w:name="_GoBack"/>
+      <w:bookmarkEnd w:id="0"/>
+      <w:r>
+        <w:rPr>
+          <w:rFonts w:ascii="Times New Roman" w:hAnsi="Times New Roman" w:cs="Times New Roman"/>
+          <w:sz w:val="20"/>
+          <w:szCs w:val="20"/>
+        </w:rPr>
+        <w:t>(Terraform) on AWS. Skilled in architecting multi-tier high-availability systems, containerized environments (Docker), and automated production operations with zero-downtime standards.</w:t>
+      </w:r>
+      <w:r>
+        <w:rPr>
+          <w:rFonts w:ascii="Times New Roman" w:eastAsia="Times New Roman" w:hAnsi="Times New Roman" w:cs="Times New Roman"/>
+          <w:sz w:val="20"/>
+          <w:szCs w:val="20"/>
         </w:rPr>
         <w:pict>
           <v:rect id="_x0000_i1026" style="width:0;height:1.5pt" o:hralign="center" o:hrstd="t" o:hr="t" fillcolor="#a0a0a0" stroked="f"/>
@@ -366,96 +357,493 @@
     </w:p>
     <w:p>
       <w:pPr>
+        <w:spacing w:after="0" w:line="240" w:lineRule="auto"/>
+        <w:rPr>
+          <w:rFonts w:ascii="Times New Roman" w:eastAsia="Times New Roman" w:hAnsi="Times New Roman" w:cs="Times New Roman"/>
+          <w:b/>
+          <w:bCs/>
+          <w:sz w:val="20"/>
+          <w:szCs w:val="20"/>
+        </w:rPr>
+      </w:pPr>
+      <w:r>
+        <w:rPr>
+          <w:rFonts w:ascii="Times New Roman" w:eastAsia="Times New Roman" w:hAnsi="Times New Roman" w:cs="Times New Roman"/>
+          <w:b/>
+          <w:bCs/>
+          <w:sz w:val="20"/>
+          <w:szCs w:val="20"/>
+        </w:rPr>
+        <w:t>Cloud &amp; Infrastructure as Code:</w:t>
+      </w:r>
+    </w:p>
+    <w:p>
+      <w:pPr>
+        <w:spacing w:after="0" w:line="240" w:lineRule="auto"/>
+        <w:rPr>
+          <w:rFonts w:ascii="Times New Roman" w:eastAsia="Times New Roman" w:hAnsi="Times New Roman" w:cs="Times New Roman"/>
+          <w:bCs/>
+          <w:sz w:val="20"/>
+          <w:szCs w:val="20"/>
+        </w:rPr>
+      </w:pPr>
+      <w:r>
+        <w:rPr>
+          <w:rFonts w:ascii="Times New Roman" w:eastAsia="Times New Roman" w:hAnsi="Times New Roman" w:cs="Times New Roman"/>
+          <w:bCs/>
+          <w:sz w:val="20"/>
+          <w:szCs w:val="20"/>
+        </w:rPr>
+        <w:t xml:space="preserve">AWS (VPC, EC2, ALB, Auto Scaling, RDS PostgreSQL, S3, </w:t>
+      </w:r>
+      <w:proofErr w:type="spellStart"/>
+      <w:r>
+        <w:rPr>
+          <w:rFonts w:ascii="Times New Roman" w:eastAsia="Times New Roman" w:hAnsi="Times New Roman" w:cs="Times New Roman"/>
+          <w:bCs/>
+          <w:sz w:val="20"/>
+          <w:szCs w:val="20"/>
+        </w:rPr>
+        <w:t>DynamoDB</w:t>
+      </w:r>
+      <w:proofErr w:type="spellEnd"/>
+      <w:r>
+        <w:rPr>
+          <w:rFonts w:ascii="Times New Roman" w:eastAsia="Times New Roman" w:hAnsi="Times New Roman" w:cs="Times New Roman"/>
+          <w:bCs/>
+          <w:sz w:val="20"/>
+          <w:szCs w:val="20"/>
+        </w:rPr>
+        <w:t>) | Terraform (Modular Architecture, Remote State, State Locking)</w:t>
+      </w:r>
+    </w:p>
+    <w:p>
+      <w:pPr>
+        <w:spacing w:after="0" w:line="240" w:lineRule="auto"/>
+        <w:rPr>
+          <w:rFonts w:ascii="Times New Roman" w:eastAsia="Times New Roman" w:hAnsi="Times New Roman" w:cs="Times New Roman"/>
+          <w:bCs/>
+          <w:sz w:val="20"/>
+          <w:szCs w:val="20"/>
+        </w:rPr>
+      </w:pPr>
+    </w:p>
+    <w:p>
+      <w:pPr>
+        <w:spacing w:after="0" w:line="240" w:lineRule="auto"/>
+        <w:rPr>
+          <w:rFonts w:ascii="Times New Roman" w:eastAsia="Times New Roman" w:hAnsi="Times New Roman" w:cs="Times New Roman"/>
+          <w:b/>
+          <w:bCs/>
+          <w:sz w:val="20"/>
+          <w:szCs w:val="20"/>
+        </w:rPr>
+      </w:pPr>
+      <w:r>
+        <w:rPr>
+          <w:rFonts w:ascii="Times New Roman" w:eastAsia="Times New Roman" w:hAnsi="Times New Roman" w:cs="Times New Roman"/>
+          <w:b/>
+          <w:bCs/>
+          <w:sz w:val="20"/>
+          <w:szCs w:val="20"/>
+        </w:rPr>
+        <w:t>Operating Systems &amp; Scripting:</w:t>
+      </w:r>
+    </w:p>
+    <w:p>
+      <w:pPr>
+        <w:spacing w:after="0" w:line="240" w:lineRule="auto"/>
+        <w:rPr>
+          <w:rFonts w:ascii="Times New Roman" w:eastAsia="Times New Roman" w:hAnsi="Times New Roman" w:cs="Times New Roman"/>
+          <w:bCs/>
+          <w:sz w:val="20"/>
+          <w:szCs w:val="20"/>
+        </w:rPr>
+      </w:pPr>
+      <w:r>
+        <w:rPr>
+          <w:rFonts w:ascii="Times New Roman" w:eastAsia="Times New Roman" w:hAnsi="Times New Roman" w:cs="Times New Roman"/>
+          <w:bCs/>
+          <w:sz w:val="20"/>
+          <w:szCs w:val="20"/>
+        </w:rPr>
+        <w:t>Enterprise Linux (Ubuntu, RHEL/CentOS) | Shell Scripting (Bash) | Python Automation | Windows Server</w:t>
+      </w:r>
+    </w:p>
+    <w:p>
+      <w:pPr>
+        <w:spacing w:after="0" w:line="240" w:lineRule="auto"/>
+        <w:rPr>
+          <w:rFonts w:ascii="Times New Roman" w:eastAsia="Times New Roman" w:hAnsi="Times New Roman" w:cs="Times New Roman"/>
+          <w:bCs/>
+          <w:sz w:val="20"/>
+          <w:szCs w:val="20"/>
+        </w:rPr>
+      </w:pPr>
+    </w:p>
+    <w:p>
+      <w:pPr>
+        <w:spacing w:after="0" w:line="240" w:lineRule="auto"/>
+        <w:rPr>
+          <w:rFonts w:ascii="Times New Roman" w:eastAsia="Times New Roman" w:hAnsi="Times New Roman" w:cs="Times New Roman"/>
+          <w:bCs/>
+          <w:sz w:val="20"/>
+          <w:szCs w:val="20"/>
+        </w:rPr>
+      </w:pPr>
+      <w:r>
+        <w:rPr>
+          <w:rFonts w:ascii="Times New Roman" w:eastAsia="Times New Roman" w:hAnsi="Times New Roman" w:cs="Times New Roman"/>
+          <w:b/>
+          <w:bCs/>
+          <w:sz w:val="20"/>
+          <w:szCs w:val="20"/>
+        </w:rPr>
+        <w:t>Containerization &amp; Orchestratio</w:t>
+      </w:r>
+      <w:r>
+        <w:rPr>
+          <w:rFonts w:ascii="Times New Roman" w:eastAsia="Times New Roman" w:hAnsi="Times New Roman" w:cs="Times New Roman"/>
+          <w:b/>
+          <w:bCs/>
+          <w:sz w:val="20"/>
+          <w:szCs w:val="20"/>
+        </w:rPr>
+        <w:t>n:</w:t>
+      </w:r>
+    </w:p>
+    <w:p>
+      <w:pPr>
+        <w:spacing w:after="0" w:line="240" w:lineRule="auto"/>
+        <w:rPr>
+          <w:rFonts w:ascii="Times New Roman" w:eastAsia="Times New Roman" w:hAnsi="Times New Roman" w:cs="Times New Roman"/>
+          <w:bCs/>
+          <w:sz w:val="20"/>
+          <w:szCs w:val="20"/>
+        </w:rPr>
+      </w:pPr>
+      <w:r>
+        <w:rPr>
+          <w:rFonts w:ascii="Times New Roman" w:eastAsia="Times New Roman" w:hAnsi="Times New Roman" w:cs="Times New Roman"/>
+          <w:bCs/>
+          <w:sz w:val="20"/>
+          <w:szCs w:val="20"/>
+        </w:rPr>
+        <w:t xml:space="preserve">Docker | Docker Compose | Container Networking | Persistent Volumes | Kubernetes (Basic)  </w:t>
+      </w:r>
+    </w:p>
+    <w:p>
+      <w:pPr>
+        <w:spacing w:after="0" w:line="240" w:lineRule="auto"/>
+        <w:rPr>
+          <w:rFonts w:ascii="Times New Roman" w:eastAsia="Times New Roman" w:hAnsi="Times New Roman" w:cs="Times New Roman"/>
+          <w:bCs/>
+          <w:sz w:val="20"/>
+          <w:szCs w:val="20"/>
+        </w:rPr>
+      </w:pPr>
+    </w:p>
+    <w:p>
+      <w:pPr>
+        <w:spacing w:after="0" w:line="240" w:lineRule="auto"/>
+        <w:rPr>
+          <w:rFonts w:ascii="Times New Roman" w:eastAsia="Times New Roman" w:hAnsi="Times New Roman" w:cs="Times New Roman"/>
+          <w:b/>
+          <w:bCs/>
+          <w:sz w:val="20"/>
+          <w:szCs w:val="20"/>
+        </w:rPr>
+      </w:pPr>
+      <w:r>
+        <w:rPr>
+          <w:rFonts w:ascii="Times New Roman" w:eastAsia="Times New Roman" w:hAnsi="Times New Roman" w:cs="Times New Roman"/>
+          <w:b/>
+          <w:bCs/>
+          <w:sz w:val="20"/>
+          <w:szCs w:val="20"/>
+        </w:rPr>
+        <w:t>CI/CD &amp; DevOps Tools:</w:t>
+      </w:r>
+    </w:p>
+    <w:p>
+      <w:pPr>
+        <w:spacing w:after="0" w:line="240" w:lineRule="auto"/>
+        <w:rPr>
+          <w:rFonts w:ascii="Times New Roman" w:eastAsia="Times New Roman" w:hAnsi="Times New Roman" w:cs="Times New Roman"/>
+          <w:bCs/>
+          <w:sz w:val="20"/>
+          <w:szCs w:val="20"/>
+        </w:rPr>
+      </w:pPr>
+      <w:proofErr w:type="spellStart"/>
+      <w:r>
+        <w:rPr>
+          <w:rFonts w:ascii="Times New Roman" w:eastAsia="Times New Roman" w:hAnsi="Times New Roman" w:cs="Times New Roman"/>
+          <w:bCs/>
+          <w:sz w:val="20"/>
+          <w:szCs w:val="20"/>
+        </w:rPr>
+        <w:t>Git</w:t>
+      </w:r>
+      <w:proofErr w:type="spellEnd"/>
+      <w:r>
+        <w:rPr>
+          <w:rFonts w:ascii="Times New Roman" w:eastAsia="Times New Roman" w:hAnsi="Times New Roman" w:cs="Times New Roman"/>
+          <w:bCs/>
+          <w:sz w:val="20"/>
+          <w:szCs w:val="20"/>
+        </w:rPr>
+        <w:t xml:space="preserve"> | GitHub | Jenkins | CI/CD Concepts  </w:t>
+      </w:r>
+    </w:p>
+    <w:p>
+      <w:pPr>
+        <w:spacing w:after="0" w:line="240" w:lineRule="auto"/>
+        <w:rPr>
+          <w:rFonts w:ascii="Times New Roman" w:eastAsia="Times New Roman" w:hAnsi="Times New Roman" w:cs="Times New Roman"/>
+          <w:bCs/>
+          <w:sz w:val="20"/>
+          <w:szCs w:val="20"/>
+        </w:rPr>
+      </w:pPr>
+    </w:p>
+    <w:p>
+      <w:pPr>
+        <w:spacing w:after="0" w:line="240" w:lineRule="auto"/>
+        <w:rPr>
+          <w:rFonts w:ascii="Times New Roman" w:eastAsia="Times New Roman" w:hAnsi="Times New Roman" w:cs="Times New Roman"/>
+          <w:b/>
+          <w:bCs/>
+          <w:sz w:val="20"/>
+          <w:szCs w:val="20"/>
+        </w:rPr>
+      </w:pPr>
+      <w:r>
+        <w:rPr>
+          <w:rFonts w:ascii="Times New Roman" w:eastAsia="Times New Roman" w:hAnsi="Times New Roman" w:cs="Times New Roman"/>
+          <w:b/>
+          <w:bCs/>
+          <w:sz w:val="20"/>
+          <w:szCs w:val="20"/>
+        </w:rPr>
+        <w:t>Monitoring &amp; Production Operations:</w:t>
+      </w:r>
+    </w:p>
+    <w:p>
+      <w:pPr>
+        <w:spacing w:after="0" w:line="240" w:lineRule="auto"/>
+        <w:rPr>
+          <w:rFonts w:ascii="Times New Roman" w:eastAsia="Times New Roman" w:hAnsi="Times New Roman" w:cs="Times New Roman"/>
+          <w:bCs/>
+          <w:sz w:val="20"/>
+          <w:szCs w:val="20"/>
+        </w:rPr>
+      </w:pPr>
+      <w:proofErr w:type="spellStart"/>
+      <w:r>
+        <w:rPr>
+          <w:rFonts w:ascii="Times New Roman" w:eastAsia="Times New Roman" w:hAnsi="Times New Roman" w:cs="Times New Roman"/>
+          <w:bCs/>
+          <w:sz w:val="20"/>
+          <w:szCs w:val="20"/>
+        </w:rPr>
+        <w:t>Grafana</w:t>
+      </w:r>
+      <w:proofErr w:type="spellEnd"/>
+      <w:r>
+        <w:rPr>
+          <w:rFonts w:ascii="Times New Roman" w:eastAsia="Times New Roman" w:hAnsi="Times New Roman" w:cs="Times New Roman"/>
+          <w:bCs/>
+          <w:sz w:val="20"/>
+          <w:szCs w:val="20"/>
+        </w:rPr>
+        <w:t xml:space="preserve"> | Log Management | Incident Investigation | System Health Checks | Production Support | Troubleshooting  </w:t>
+      </w:r>
+    </w:p>
+    <w:p>
+      <w:pPr>
+        <w:spacing w:after="0" w:line="240" w:lineRule="auto"/>
+        <w:rPr>
+          <w:rFonts w:ascii="Times New Roman" w:eastAsia="Times New Roman" w:hAnsi="Times New Roman" w:cs="Times New Roman"/>
+          <w:bCs/>
+          <w:sz w:val="20"/>
+          <w:szCs w:val="20"/>
+        </w:rPr>
+      </w:pPr>
+    </w:p>
+    <w:p>
+      <w:pPr>
+        <w:spacing w:after="0" w:line="240" w:lineRule="auto"/>
+        <w:rPr>
+          <w:rFonts w:ascii="Times New Roman" w:eastAsia="Times New Roman" w:hAnsi="Times New Roman" w:cs="Times New Roman"/>
+          <w:b/>
+          <w:bCs/>
+          <w:sz w:val="20"/>
+          <w:szCs w:val="20"/>
+        </w:rPr>
+      </w:pPr>
+      <w:r>
+        <w:rPr>
+          <w:rFonts w:ascii="Times New Roman" w:eastAsia="Times New Roman" w:hAnsi="Times New Roman" w:cs="Times New Roman"/>
+          <w:b/>
+          <w:bCs/>
+          <w:sz w:val="20"/>
+          <w:szCs w:val="20"/>
+        </w:rPr>
+        <w:t>Networking &amp; Protocols:</w:t>
+      </w:r>
+    </w:p>
+    <w:p>
+      <w:pPr>
+        <w:spacing w:after="0" w:line="240" w:lineRule="auto"/>
+        <w:rPr>
+          <w:rFonts w:ascii="Times New Roman" w:eastAsia="Times New Roman" w:hAnsi="Times New Roman" w:cs="Times New Roman"/>
+          <w:bCs/>
+          <w:sz w:val="20"/>
+          <w:szCs w:val="20"/>
+        </w:rPr>
+      </w:pPr>
+      <w:r>
+        <w:rPr>
+          <w:rFonts w:ascii="Times New Roman" w:eastAsia="Times New Roman" w:hAnsi="Times New Roman" w:cs="Times New Roman"/>
+          <w:bCs/>
+          <w:sz w:val="20"/>
+          <w:szCs w:val="20"/>
+        </w:rPr>
+        <w:t xml:space="preserve">TCP/IP | DNS | HTTP/HTTPS | Network Troubleshooting  </w:t>
+      </w:r>
+    </w:p>
+    <w:p>
+      <w:pPr>
+        <w:spacing w:after="0" w:line="240" w:lineRule="auto"/>
+        <w:rPr>
+          <w:rFonts w:ascii="Times New Roman" w:eastAsia="Times New Roman" w:hAnsi="Times New Roman" w:cs="Times New Roman"/>
+          <w:bCs/>
+          <w:sz w:val="20"/>
+          <w:szCs w:val="20"/>
+        </w:rPr>
+      </w:pPr>
+    </w:p>
+    <w:p>
+      <w:pPr>
+        <w:spacing w:after="0" w:line="240" w:lineRule="auto"/>
+        <w:rPr>
+          <w:rFonts w:ascii="Times New Roman" w:eastAsia="Times New Roman" w:hAnsi="Times New Roman" w:cs="Times New Roman"/>
+          <w:b/>
+          <w:bCs/>
+          <w:sz w:val="20"/>
+          <w:szCs w:val="20"/>
+        </w:rPr>
+      </w:pPr>
+      <w:r>
+        <w:rPr>
+          <w:rFonts w:ascii="Times New Roman" w:eastAsia="Times New Roman" w:hAnsi="Times New Roman" w:cs="Times New Roman"/>
+          <w:b/>
+          <w:bCs/>
+          <w:sz w:val="20"/>
+          <w:szCs w:val="20"/>
+        </w:rPr>
+        <w:t>Database &amp; Middleware:</w:t>
+      </w:r>
+    </w:p>
+    <w:p>
+      <w:pPr>
+        <w:spacing w:after="0" w:line="240" w:lineRule="auto"/>
+        <w:rPr>
+          <w:rFonts w:ascii="Times New Roman" w:eastAsia="Times New Roman" w:hAnsi="Times New Roman" w:cs="Times New Roman"/>
+          <w:bCs/>
+          <w:sz w:val="20"/>
+          <w:szCs w:val="20"/>
+        </w:rPr>
+      </w:pPr>
+      <w:r>
+        <w:rPr>
+          <w:rFonts w:ascii="Times New Roman" w:eastAsia="Times New Roman" w:hAnsi="Times New Roman" w:cs="Times New Roman"/>
+          <w:bCs/>
+          <w:sz w:val="20"/>
+          <w:szCs w:val="20"/>
+        </w:rPr>
+        <w:t>PostgreSQL | Oracle SQL | MySQL | SQL Server | Oracle WebLogic</w:t>
+      </w:r>
+    </w:p>
+    <w:p>
+      <w:pPr>
+        <w:spacing w:after="0" w:line="240" w:lineRule="auto"/>
+        <w:rPr>
+          <w:rFonts w:ascii="Times New Roman" w:eastAsia="Times New Roman" w:hAnsi="Times New Roman" w:cs="Times New Roman"/>
+          <w:sz w:val="24"/>
+          <w:szCs w:val="24"/>
+        </w:rPr>
+      </w:pPr>
+      <w:r>
+        <w:rPr>
+          <w:rFonts w:ascii="Times New Roman" w:eastAsia="Times New Roman" w:hAnsi="Times New Roman" w:cs="Times New Roman"/>
+          <w:sz w:val="24"/>
+          <w:szCs w:val="24"/>
+        </w:rPr>
+        <w:pict>
+          <v:rect id="_x0000_i1033" style="width:0;height:1.5pt" o:hralign="center" o:hrstd="t" o:hr="t" fillcolor="#a0a0a0" stroked="f"/>
+        </w:pict>
+      </w:r>
+    </w:p>
+    <w:p>
+      <w:pPr>
         <w:spacing w:before="100" w:beforeAutospacing="1" w:after="100" w:afterAutospacing="1" w:line="240" w:lineRule="auto"/>
-        <w:rPr>
-          <w:rFonts w:ascii="Times New Roman" w:eastAsia="Times New Roman" w:hAnsi="Times New Roman" w:cs="Times New Roman"/>
-          <w:sz w:val="20"/>
-          <w:szCs w:val="20"/>
-        </w:rPr>
-      </w:pPr>
-      <w:r>
-        <w:rPr>
-          <w:rFonts w:ascii="Times New Roman" w:eastAsia="Times New Roman" w:hAnsi="Times New Roman" w:cs="Times New Roman"/>
-          <w:b/>
-          <w:bCs/>
-          <w:sz w:val="20"/>
-          <w:szCs w:val="20"/>
-        </w:rPr>
-        <w:t>Cloud &amp; Infrastructure</w:t>
-      </w:r>
-      <w:r>
-        <w:rPr>
-          <w:rFonts w:ascii="Times New Roman" w:eastAsia="Times New Roman" w:hAnsi="Times New Roman" w:cs="Times New Roman"/>
-          <w:sz w:val="20"/>
-          <w:szCs w:val="20"/>
-        </w:rPr>
-        <w:br/>
-        <w:t xml:space="preserve">AWS | GCP | Linux | </w:t>
-      </w:r>
-      <w:proofErr w:type="gramStart"/>
-      <w:r>
-        <w:rPr>
-          <w:rFonts w:ascii="Times New Roman" w:eastAsia="Times New Roman" w:hAnsi="Times New Roman" w:cs="Times New Roman"/>
-          <w:sz w:val="20"/>
-          <w:szCs w:val="20"/>
-        </w:rPr>
-        <w:t>Unix</w:t>
-      </w:r>
-      <w:proofErr w:type="gramEnd"/>
-      <w:r>
-        <w:rPr>
-          <w:rFonts w:ascii="Times New Roman" w:eastAsia="Times New Roman" w:hAnsi="Times New Roman" w:cs="Times New Roman"/>
-          <w:sz w:val="20"/>
-          <w:szCs w:val="20"/>
-        </w:rPr>
-        <w:t xml:space="preserve"> | Windows | Docker | Kubernetes</w:t>
+        <w:outlineLvl w:val="0"/>
+        <w:rPr>
+          <w:rFonts w:ascii="Times New Roman" w:eastAsia="Times New Roman" w:hAnsi="Times New Roman" w:cs="Times New Roman"/>
+          <w:b/>
+          <w:bCs/>
+          <w:kern w:val="36"/>
+          <w:sz w:val="24"/>
+          <w:szCs w:val="24"/>
+        </w:rPr>
+      </w:pPr>
+      <w:r>
+        <w:rPr>
+          <w:rFonts w:ascii="Times New Roman" w:eastAsia="Times New Roman" w:hAnsi="Times New Roman" w:cs="Times New Roman"/>
+          <w:b/>
+          <w:bCs/>
+          <w:kern w:val="36"/>
+          <w:sz w:val="24"/>
+          <w:szCs w:val="24"/>
+        </w:rPr>
+        <w:t>PROFESSIONAL EXPERIENCE</w:t>
       </w:r>
     </w:p>
     <w:p>
       <w:pPr>
         <w:spacing w:before="100" w:beforeAutospacing="1" w:after="100" w:afterAutospacing="1" w:line="240" w:lineRule="auto"/>
-        <w:rPr>
-          <w:rFonts w:ascii="Times New Roman" w:eastAsia="Times New Roman" w:hAnsi="Times New Roman" w:cs="Times New Roman"/>
-          <w:sz w:val="20"/>
-          <w:szCs w:val="20"/>
-        </w:rPr>
-      </w:pPr>
-      <w:r>
-        <w:rPr>
-          <w:rFonts w:ascii="Times New Roman" w:eastAsia="Times New Roman" w:hAnsi="Times New Roman" w:cs="Times New Roman"/>
-          <w:b/>
-          <w:bCs/>
-          <w:sz w:val="20"/>
-          <w:szCs w:val="20"/>
-        </w:rPr>
-        <w:t>Automation &amp; DevOps</w:t>
-      </w:r>
-      <w:r>
-        <w:rPr>
-          <w:rFonts w:ascii="Times New Roman" w:eastAsia="Times New Roman" w:hAnsi="Times New Roman" w:cs="Times New Roman"/>
-          <w:sz w:val="20"/>
-          <w:szCs w:val="20"/>
-        </w:rPr>
-        <w:br/>
-        <w:t xml:space="preserve">Python | Shell Scripting | </w:t>
-      </w:r>
+        <w:outlineLvl w:val="1"/>
+        <w:rPr>
+          <w:rFonts w:ascii="Times New Roman" w:eastAsia="Times New Roman" w:hAnsi="Times New Roman" w:cs="Times New Roman"/>
+          <w:b/>
+          <w:bCs/>
+          <w:sz w:val="20"/>
+          <w:szCs w:val="20"/>
+        </w:rPr>
+      </w:pPr>
       <w:proofErr w:type="spellStart"/>
       <w:r>
         <w:rPr>
           <w:rFonts w:ascii="Times New Roman" w:eastAsia="Times New Roman" w:hAnsi="Times New Roman" w:cs="Times New Roman"/>
-          <w:sz w:val="20"/>
-          <w:szCs w:val="20"/>
-        </w:rPr>
-        <w:t>Git</w:t>
+          <w:b/>
+          <w:bCs/>
+          <w:sz w:val="20"/>
+          <w:szCs w:val="20"/>
+        </w:rPr>
+        <w:t>TechMahindra</w:t>
       </w:r>
       <w:proofErr w:type="spellEnd"/>
       <w:r>
         <w:rPr>
           <w:rFonts w:ascii="Times New Roman" w:eastAsia="Times New Roman" w:hAnsi="Times New Roman" w:cs="Times New Roman"/>
-          <w:sz w:val="20"/>
-          <w:szCs w:val="20"/>
-        </w:rPr>
-        <w:t xml:space="preserve"> | GitHub | Jenkins | CI/CD | Automation</w:t>
+          <w:b/>
+          <w:bCs/>
+          <w:sz w:val="20"/>
+          <w:szCs w:val="20"/>
+        </w:rPr>
+        <w:t xml:space="preserve"> Indonesia</w:t>
       </w:r>
     </w:p>
     <w:p>
@@ -475,15 +863,38 @@
           <w:sz w:val="20"/>
           <w:szCs w:val="20"/>
         </w:rPr>
-        <w:t>Monitoring &amp; Operations</w:t>
-      </w:r>
-      <w:r>
-        <w:rPr>
-          <w:rFonts w:ascii="Times New Roman" w:eastAsia="Times New Roman" w:hAnsi="Times New Roman" w:cs="Times New Roman"/>
-          <w:sz w:val="20"/>
-          <w:szCs w:val="20"/>
-        </w:rPr>
-        <w:br/>
+        <w:t>System Engineer</w:t>
+      </w:r>
+      <w:r>
+        <w:rPr>
+          <w:rFonts w:ascii="Times New Roman" w:eastAsia="Times New Roman" w:hAnsi="Times New Roman" w:cs="Times New Roman"/>
+          <w:sz w:val="20"/>
+          <w:szCs w:val="20"/>
+        </w:rPr>
+        <w:t xml:space="preserve"> | June 2023 – Present</w:t>
+      </w:r>
+    </w:p>
+    <w:p>
+      <w:pPr>
+        <w:pStyle w:val="ListParagraph"/>
+        <w:numPr>
+          <w:ilvl w:val="0"/>
+          <w:numId w:val="9"/>
+        </w:numPr>
+        <w:spacing w:after="0" w:line="240" w:lineRule="auto"/>
+        <w:rPr>
+          <w:rFonts w:ascii="Times New Roman" w:eastAsia="Times New Roman" w:hAnsi="Times New Roman" w:cs="Times New Roman"/>
+          <w:sz w:val="20"/>
+          <w:szCs w:val="20"/>
+        </w:rPr>
+      </w:pPr>
+      <w:r>
+        <w:rPr>
+          <w:rFonts w:ascii="Times New Roman" w:eastAsia="Times New Roman" w:hAnsi="Times New Roman" w:cs="Times New Roman"/>
+          <w:sz w:val="20"/>
+          <w:szCs w:val="20"/>
+        </w:rPr>
+        <w:t xml:space="preserve">Support high-reliability enterprise solutions in a production environment for </w:t>
       </w:r>
       <w:proofErr w:type="spellStart"/>
       <w:r>
@@ -492,7 +903,7 @@
           <w:sz w:val="20"/>
           <w:szCs w:val="20"/>
         </w:rPr>
-        <w:t>Grafana</w:t>
+        <w:t>Indosat</w:t>
       </w:r>
       <w:proofErr w:type="spellEnd"/>
       <w:r>
@@ -501,94 +912,7 @@
           <w:sz w:val="20"/>
           <w:szCs w:val="20"/>
         </w:rPr>
-        <w:t xml:space="preserve"> | Log Management | Troubleshooting | Production Support | Incident Investigation | System Health Checks</w:t>
-      </w:r>
-    </w:p>
-    <w:p>
-      <w:pPr>
-        <w:spacing w:before="100" w:beforeAutospacing="1" w:after="100" w:afterAutospacing="1" w:line="240" w:lineRule="auto"/>
-        <w:rPr>
-          <w:rFonts w:ascii="Times New Roman" w:eastAsia="Times New Roman" w:hAnsi="Times New Roman" w:cs="Times New Roman"/>
-          <w:sz w:val="20"/>
-          <w:szCs w:val="20"/>
-        </w:rPr>
-      </w:pPr>
-      <w:r>
-        <w:rPr>
-          <w:rFonts w:ascii="Times New Roman" w:eastAsia="Times New Roman" w:hAnsi="Times New Roman" w:cs="Times New Roman"/>
-          <w:b/>
-          <w:bCs/>
-          <w:sz w:val="20"/>
-          <w:szCs w:val="20"/>
-        </w:rPr>
-        <w:t>Application &amp; Middleware</w:t>
-      </w:r>
-      <w:r>
-        <w:rPr>
-          <w:rFonts w:ascii="Times New Roman" w:eastAsia="Times New Roman" w:hAnsi="Times New Roman" w:cs="Times New Roman"/>
-          <w:sz w:val="20"/>
-          <w:szCs w:val="20"/>
-        </w:rPr>
-        <w:br/>
-        <w:t>Oracle WebLogic | Java | .NET | JavaScript | HTML | CSS</w:t>
-      </w:r>
-    </w:p>
-    <w:p>
-      <w:pPr>
-        <w:spacing w:before="100" w:beforeAutospacing="1" w:after="100" w:afterAutospacing="1" w:line="240" w:lineRule="auto"/>
-        <w:rPr>
-          <w:rFonts w:ascii="Times New Roman" w:eastAsia="Times New Roman" w:hAnsi="Times New Roman" w:cs="Times New Roman"/>
-          <w:sz w:val="20"/>
-          <w:szCs w:val="20"/>
-        </w:rPr>
-      </w:pPr>
-      <w:r>
-        <w:rPr>
-          <w:rFonts w:ascii="Times New Roman" w:eastAsia="Times New Roman" w:hAnsi="Times New Roman" w:cs="Times New Roman"/>
-          <w:b/>
-          <w:bCs/>
-          <w:sz w:val="20"/>
-          <w:szCs w:val="20"/>
-        </w:rPr>
-        <w:t>Database</w:t>
-      </w:r>
-      <w:r>
-        <w:rPr>
-          <w:rFonts w:ascii="Times New Roman" w:eastAsia="Times New Roman" w:hAnsi="Times New Roman" w:cs="Times New Roman"/>
-          <w:sz w:val="20"/>
-          <w:szCs w:val="20"/>
-        </w:rPr>
-        <w:br/>
-        <w:t>Oracle SQL | SQL Server | MySQL</w:t>
-      </w:r>
-    </w:p>
-    <w:p>
-      <w:pPr>
-        <w:spacing w:before="100" w:beforeAutospacing="1" w:after="100" w:afterAutospacing="1" w:line="240" w:lineRule="auto"/>
-        <w:rPr>
-          <w:rFonts w:ascii="Times New Roman" w:eastAsia="Times New Roman" w:hAnsi="Times New Roman" w:cs="Times New Roman"/>
-          <w:sz w:val="20"/>
-          <w:szCs w:val="20"/>
-        </w:rPr>
-      </w:pPr>
-      <w:r>
-        <w:rPr>
-          <w:rFonts w:ascii="Times New Roman" w:eastAsia="Times New Roman" w:hAnsi="Times New Roman" w:cs="Times New Roman"/>
-          <w:b/>
-          <w:bCs/>
-          <w:sz w:val="20"/>
-          <w:szCs w:val="20"/>
-        </w:rPr>
-        <w:t>Other Technologies</w:t>
-      </w:r>
-      <w:r>
-        <w:rPr>
-          <w:rFonts w:ascii="Times New Roman" w:eastAsia="Times New Roman" w:hAnsi="Times New Roman" w:cs="Times New Roman"/>
-          <w:sz w:val="20"/>
-          <w:szCs w:val="20"/>
-        </w:rPr>
-        <w:br/>
-        <w:t xml:space="preserve">Salesforce Administration | </w:t>
+        <w:t xml:space="preserve"> </w:t>
       </w:r>
       <w:proofErr w:type="spellStart"/>
       <w:r>
@@ -597,7 +921,7 @@
           <w:sz w:val="20"/>
           <w:szCs w:val="20"/>
         </w:rPr>
-        <w:t>MkDocs</w:t>
+        <w:t>Ooredoo</w:t>
       </w:r>
       <w:proofErr w:type="spellEnd"/>
       <w:r>
@@ -606,56 +930,161 @@
           <w:sz w:val="20"/>
           <w:szCs w:val="20"/>
         </w:rPr>
-        <w:t xml:space="preserve"> | Technical Documentation | Systems Integration</w:t>
-      </w:r>
-    </w:p>
-    <w:p>
-      <w:pPr>
-        <w:spacing w:before="100" w:beforeAutospacing="1" w:after="100" w:afterAutospacing="1" w:line="240" w:lineRule="auto"/>
-        <w:rPr>
-          <w:rFonts w:ascii="Times New Roman" w:eastAsia="Times New Roman" w:hAnsi="Times New Roman" w:cs="Times New Roman"/>
-          <w:sz w:val="20"/>
-          <w:szCs w:val="20"/>
-        </w:rPr>
-      </w:pPr>
-    </w:p>
-    <w:p>
-      <w:pPr>
-        <w:spacing w:before="100" w:beforeAutospacing="1" w:after="100" w:afterAutospacing="1" w:line="240" w:lineRule="auto"/>
-        <w:rPr>
-          <w:rFonts w:ascii="Times New Roman" w:eastAsia="Times New Roman" w:hAnsi="Times New Roman" w:cs="Times New Roman"/>
-          <w:sz w:val="20"/>
-          <w:szCs w:val="20"/>
-        </w:rPr>
-      </w:pPr>
-    </w:p>
-    <w:p>
-      <w:pPr>
-        <w:spacing w:before="100" w:beforeAutospacing="1" w:after="100" w:afterAutospacing="1" w:line="240" w:lineRule="auto"/>
-        <w:rPr>
-          <w:rFonts w:ascii="Times New Roman" w:eastAsia="Times New Roman" w:hAnsi="Times New Roman" w:cs="Times New Roman"/>
-          <w:sz w:val="20"/>
-          <w:szCs w:val="20"/>
-        </w:rPr>
-      </w:pPr>
-    </w:p>
-    <w:p>
-      <w:pPr>
-        <w:spacing w:before="100" w:beforeAutospacing="1" w:after="100" w:afterAutospacing="1" w:line="240" w:lineRule="auto"/>
-        <w:rPr>
-          <w:rFonts w:ascii="Times New Roman" w:eastAsia="Times New Roman" w:hAnsi="Times New Roman" w:cs="Times New Roman"/>
-          <w:sz w:val="20"/>
-          <w:szCs w:val="20"/>
-        </w:rPr>
-      </w:pPr>
-    </w:p>
-    <w:p>
-      <w:pPr>
+        <w:t xml:space="preserve"> Hutchison. </w:t>
+      </w:r>
+    </w:p>
+    <w:p>
+      <w:pPr>
+        <w:pStyle w:val="ListParagraph"/>
+        <w:numPr>
+          <w:ilvl w:val="0"/>
+          <w:numId w:val="9"/>
+        </w:numPr>
         <w:spacing w:after="0" w:line="240" w:lineRule="auto"/>
         <w:rPr>
           <w:rFonts w:ascii="Times New Roman" w:eastAsia="Times New Roman" w:hAnsi="Times New Roman" w:cs="Times New Roman"/>
-          <w:sz w:val="24"/>
-          <w:szCs w:val="24"/>
+          <w:sz w:val="20"/>
+          <w:szCs w:val="20"/>
+        </w:rPr>
+      </w:pPr>
+      <w:r>
+        <w:rPr>
+          <w:rFonts w:ascii="Times New Roman" w:eastAsia="Times New Roman" w:hAnsi="Times New Roman" w:cs="Times New Roman"/>
+          <w:sz w:val="20"/>
+          <w:szCs w:val="20"/>
+        </w:rPr>
+        <w:t xml:space="preserve">Support Linux/Unix-based environments, application services, middleware components, and operational infrastructure. </w:t>
+      </w:r>
+    </w:p>
+    <w:p>
+      <w:pPr>
+        <w:pStyle w:val="ListParagraph"/>
+        <w:numPr>
+          <w:ilvl w:val="0"/>
+          <w:numId w:val="9"/>
+        </w:numPr>
+        <w:spacing w:after="0" w:line="240" w:lineRule="auto"/>
+        <w:rPr>
+          <w:rFonts w:ascii="Times New Roman" w:eastAsia="Times New Roman" w:hAnsi="Times New Roman" w:cs="Times New Roman"/>
+          <w:sz w:val="20"/>
+          <w:szCs w:val="20"/>
+        </w:rPr>
+      </w:pPr>
+      <w:r>
+        <w:rPr>
+          <w:rFonts w:ascii="Times New Roman" w:eastAsia="Times New Roman" w:hAnsi="Times New Roman" w:cs="Times New Roman"/>
+          <w:sz w:val="20"/>
+          <w:szCs w:val="20"/>
+        </w:rPr>
+        <w:t xml:space="preserve">Perform system analysis, systems integration, testing, troubleshooting, log management, and incident investigation. </w:t>
+      </w:r>
+    </w:p>
+    <w:p>
+      <w:pPr>
+        <w:pStyle w:val="ListParagraph"/>
+        <w:numPr>
+          <w:ilvl w:val="0"/>
+          <w:numId w:val="9"/>
+        </w:numPr>
+        <w:spacing w:after="0" w:line="240" w:lineRule="auto"/>
+        <w:rPr>
+          <w:rFonts w:ascii="Times New Roman" w:eastAsia="Times New Roman" w:hAnsi="Times New Roman" w:cs="Times New Roman"/>
+          <w:sz w:val="20"/>
+          <w:szCs w:val="20"/>
+        </w:rPr>
+      </w:pPr>
+      <w:r>
+        <w:rPr>
+          <w:rFonts w:ascii="Times New Roman" w:eastAsia="Times New Roman" w:hAnsi="Times New Roman" w:cs="Times New Roman"/>
+          <w:sz w:val="20"/>
+          <w:szCs w:val="20"/>
+        </w:rPr>
+        <w:t xml:space="preserve">Troubleshoot production incidents and coordinate with L1 and L3 teams to implement temporary and permanent solutions. </w:t>
+      </w:r>
+    </w:p>
+    <w:p>
+      <w:pPr>
+        <w:pStyle w:val="ListParagraph"/>
+        <w:numPr>
+          <w:ilvl w:val="0"/>
+          <w:numId w:val="9"/>
+        </w:numPr>
+        <w:spacing w:after="0" w:line="240" w:lineRule="auto"/>
+        <w:rPr>
+          <w:rFonts w:ascii="Times New Roman" w:eastAsia="Times New Roman" w:hAnsi="Times New Roman" w:cs="Times New Roman"/>
+          <w:sz w:val="20"/>
+          <w:szCs w:val="20"/>
+        </w:rPr>
+      </w:pPr>
+      <w:r>
+        <w:rPr>
+          <w:rFonts w:ascii="Times New Roman" w:eastAsia="Times New Roman" w:hAnsi="Times New Roman" w:cs="Times New Roman"/>
+          <w:sz w:val="20"/>
+          <w:szCs w:val="20"/>
+        </w:rPr>
+        <w:t xml:space="preserve">Develop Shell and Python automation to reduce repetitive operational tasks. </w:t>
+      </w:r>
+    </w:p>
+    <w:p>
+      <w:pPr>
+        <w:pStyle w:val="ListParagraph"/>
+        <w:numPr>
+          <w:ilvl w:val="0"/>
+          <w:numId w:val="9"/>
+        </w:numPr>
+        <w:spacing w:after="0" w:line="240" w:lineRule="auto"/>
+        <w:rPr>
+          <w:rFonts w:ascii="Times New Roman" w:eastAsia="Times New Roman" w:hAnsi="Times New Roman" w:cs="Times New Roman"/>
+          <w:sz w:val="20"/>
+          <w:szCs w:val="20"/>
+        </w:rPr>
+      </w:pPr>
+      <w:r>
+        <w:rPr>
+          <w:rFonts w:ascii="Times New Roman" w:eastAsia="Times New Roman" w:hAnsi="Times New Roman" w:cs="Times New Roman"/>
+          <w:sz w:val="20"/>
+          <w:szCs w:val="20"/>
+        </w:rPr>
+        <w:t>Perform operational monitoring and investigate system/application issues using logs and monitoring tools.</w:t>
+      </w:r>
+    </w:p>
+    <w:p>
+      <w:pPr>
+        <w:spacing w:after="0" w:line="240" w:lineRule="auto"/>
+        <w:rPr>
+          <w:rFonts w:ascii="Times New Roman" w:eastAsia="Times New Roman" w:hAnsi="Times New Roman" w:cs="Times New Roman"/>
+          <w:sz w:val="20"/>
+          <w:szCs w:val="20"/>
+        </w:rPr>
+      </w:pPr>
+    </w:p>
+    <w:p>
+      <w:pPr>
+        <w:spacing w:after="0" w:line="240" w:lineRule="auto"/>
+        <w:rPr>
+          <w:rFonts w:ascii="Times New Roman" w:eastAsia="Times New Roman" w:hAnsi="Times New Roman" w:cs="Times New Roman"/>
+          <w:sz w:val="20"/>
+          <w:szCs w:val="20"/>
+        </w:rPr>
+      </w:pPr>
+    </w:p>
+    <w:p>
+      <w:pPr>
+        <w:spacing w:after="0" w:line="240" w:lineRule="auto"/>
+        <w:rPr>
+          <w:rFonts w:ascii="Times New Roman" w:eastAsia="Times New Roman" w:hAnsi="Times New Roman" w:cs="Times New Roman"/>
+          <w:sz w:val="20"/>
+          <w:szCs w:val="20"/>
+        </w:rPr>
+      </w:pPr>
+    </w:p>
+    <w:p>
+      <w:pPr>
+        <w:spacing w:after="0" w:line="240" w:lineRule="auto"/>
+        <w:rPr>
+          <w:rFonts w:ascii="Times New Roman" w:eastAsia="Times New Roman" w:hAnsi="Times New Roman" w:cs="Times New Roman"/>
+          <w:sz w:val="20"/>
+          <w:szCs w:val="20"/>
         </w:rPr>
       </w:pPr>
       <w:r>
@@ -666,437 +1095,7 @@
         </w:rPr>
         <w:lastRenderedPageBreak/>
         <w:pict>
-          <v:rect id="_x0000_i1027" style="width:0;height:1.5pt" o:hralign="center" o:hrstd="t" o:hr="t" fillcolor="#a0a0a0" stroked="f"/>
-        </w:pict>
-      </w:r>
-    </w:p>
-    <w:p>
-      <w:pPr>
-        <w:spacing w:before="100" w:beforeAutospacing="1" w:after="100" w:afterAutospacing="1" w:line="240" w:lineRule="auto"/>
-        <w:outlineLvl w:val="0"/>
-        <w:rPr>
-          <w:rFonts w:ascii="Times New Roman" w:eastAsia="Times New Roman" w:hAnsi="Times New Roman" w:cs="Times New Roman"/>
-          <w:b/>
-          <w:bCs/>
-          <w:kern w:val="36"/>
-          <w:sz w:val="24"/>
-          <w:szCs w:val="24"/>
-        </w:rPr>
-      </w:pPr>
-      <w:r>
-        <w:rPr>
-          <w:rFonts w:ascii="Times New Roman" w:eastAsia="Times New Roman" w:hAnsi="Times New Roman" w:cs="Times New Roman"/>
-          <w:b/>
-          <w:bCs/>
-          <w:kern w:val="36"/>
-          <w:sz w:val="24"/>
-          <w:szCs w:val="24"/>
-        </w:rPr>
-        <w:t>PROFESSIONAL EXPERIENCE</w:t>
-      </w:r>
-    </w:p>
-    <w:p>
-      <w:pPr>
-        <w:spacing w:before="100" w:beforeAutospacing="1" w:after="100" w:afterAutospacing="1" w:line="240" w:lineRule="auto"/>
-        <w:outlineLvl w:val="1"/>
-        <w:rPr>
-          <w:rFonts w:ascii="Times New Roman" w:eastAsia="Times New Roman" w:hAnsi="Times New Roman" w:cs="Times New Roman"/>
-          <w:b/>
-          <w:bCs/>
-          <w:sz w:val="20"/>
-          <w:szCs w:val="20"/>
-        </w:rPr>
-      </w:pPr>
-      <w:proofErr w:type="spellStart"/>
-      <w:r>
-        <w:rPr>
-          <w:rFonts w:ascii="Times New Roman" w:eastAsia="Times New Roman" w:hAnsi="Times New Roman" w:cs="Times New Roman"/>
-          <w:b/>
-          <w:bCs/>
-          <w:sz w:val="20"/>
-          <w:szCs w:val="20"/>
-        </w:rPr>
-        <w:t>TechMahindra</w:t>
-      </w:r>
-      <w:proofErr w:type="spellEnd"/>
-      <w:r>
-        <w:rPr>
-          <w:rFonts w:ascii="Times New Roman" w:eastAsia="Times New Roman" w:hAnsi="Times New Roman" w:cs="Times New Roman"/>
-          <w:b/>
-          <w:bCs/>
-          <w:sz w:val="20"/>
-          <w:szCs w:val="20"/>
-        </w:rPr>
-        <w:t xml:space="preserve"> Indonesia</w:t>
-      </w:r>
-    </w:p>
-    <w:p>
-      <w:pPr>
-        <w:spacing w:before="100" w:beforeAutospacing="1" w:after="100" w:afterAutospacing="1" w:line="240" w:lineRule="auto"/>
-        <w:rPr>
-          <w:rFonts w:ascii="Times New Roman" w:eastAsia="Times New Roman" w:hAnsi="Times New Roman" w:cs="Times New Roman"/>
-          <w:sz w:val="20"/>
-          <w:szCs w:val="20"/>
-        </w:rPr>
-      </w:pPr>
-      <w:r>
-        <w:rPr>
-          <w:rFonts w:ascii="Times New Roman" w:eastAsia="Times New Roman" w:hAnsi="Times New Roman" w:cs="Times New Roman"/>
-          <w:b/>
-          <w:bCs/>
-          <w:sz w:val="20"/>
-          <w:szCs w:val="20"/>
-        </w:rPr>
-        <w:t>System Engineer</w:t>
-      </w:r>
-      <w:r>
-        <w:rPr>
-          <w:rFonts w:ascii="Times New Roman" w:eastAsia="Times New Roman" w:hAnsi="Times New Roman" w:cs="Times New Roman"/>
-          <w:sz w:val="20"/>
-          <w:szCs w:val="20"/>
-        </w:rPr>
-        <w:t xml:space="preserve"> | June 2023 – Present</w:t>
-      </w:r>
-    </w:p>
-    <w:p>
-      <w:pPr>
-        <w:numPr>
-          <w:ilvl w:val="0"/>
-          <w:numId w:val="1"/>
-        </w:numPr>
-        <w:spacing w:before="100" w:beforeAutospacing="1" w:after="100" w:afterAutospacing="1" w:line="240" w:lineRule="auto"/>
-        <w:rPr>
-          <w:rFonts w:ascii="Times New Roman" w:eastAsia="Times New Roman" w:hAnsi="Times New Roman" w:cs="Times New Roman"/>
-          <w:sz w:val="20"/>
-          <w:szCs w:val="20"/>
-        </w:rPr>
-      </w:pPr>
-      <w:r>
-        <w:rPr>
-          <w:rFonts w:ascii="Times New Roman" w:eastAsia="Times New Roman" w:hAnsi="Times New Roman" w:cs="Times New Roman"/>
-          <w:sz w:val="20"/>
-          <w:szCs w:val="20"/>
-        </w:rPr>
-        <w:t xml:space="preserve">Support the operation of </w:t>
-      </w:r>
-      <w:r>
-        <w:rPr>
-          <w:rFonts w:ascii="Times New Roman" w:eastAsia="Times New Roman" w:hAnsi="Times New Roman" w:cs="Times New Roman"/>
-          <w:b/>
-          <w:bCs/>
-          <w:sz w:val="20"/>
-          <w:szCs w:val="20"/>
-        </w:rPr>
-        <w:t>high-reliability enterprise solutions</w:t>
-      </w:r>
-      <w:r>
-        <w:rPr>
-          <w:rFonts w:ascii="Times New Roman" w:eastAsia="Times New Roman" w:hAnsi="Times New Roman" w:cs="Times New Roman"/>
-          <w:sz w:val="20"/>
-          <w:szCs w:val="20"/>
-        </w:rPr>
-        <w:t xml:space="preserve"> for </w:t>
-      </w:r>
-      <w:proofErr w:type="spellStart"/>
-      <w:r>
-        <w:rPr>
-          <w:rFonts w:ascii="Times New Roman" w:eastAsia="Times New Roman" w:hAnsi="Times New Roman" w:cs="Times New Roman"/>
-          <w:b/>
-          <w:bCs/>
-          <w:sz w:val="20"/>
-          <w:szCs w:val="20"/>
-        </w:rPr>
-        <w:t>Indosat</w:t>
-      </w:r>
-      <w:proofErr w:type="spellEnd"/>
-      <w:r>
-        <w:rPr>
-          <w:rFonts w:ascii="Times New Roman" w:eastAsia="Times New Roman" w:hAnsi="Times New Roman" w:cs="Times New Roman"/>
-          <w:b/>
-          <w:bCs/>
-          <w:sz w:val="20"/>
-          <w:szCs w:val="20"/>
-        </w:rPr>
-        <w:t xml:space="preserve"> </w:t>
-      </w:r>
-      <w:proofErr w:type="spellStart"/>
-      <w:r>
-        <w:rPr>
-          <w:rFonts w:ascii="Times New Roman" w:eastAsia="Times New Roman" w:hAnsi="Times New Roman" w:cs="Times New Roman"/>
-          <w:b/>
-          <w:bCs/>
-          <w:sz w:val="20"/>
-          <w:szCs w:val="20"/>
-        </w:rPr>
-        <w:t>Ooredoo</w:t>
-      </w:r>
-      <w:proofErr w:type="spellEnd"/>
-      <w:r>
-        <w:rPr>
-          <w:rFonts w:ascii="Times New Roman" w:eastAsia="Times New Roman" w:hAnsi="Times New Roman" w:cs="Times New Roman"/>
-          <w:b/>
-          <w:bCs/>
-          <w:sz w:val="20"/>
-          <w:szCs w:val="20"/>
-        </w:rPr>
-        <w:t xml:space="preserve"> Hutchison</w:t>
-      </w:r>
-      <w:r>
-        <w:rPr>
-          <w:rFonts w:ascii="Times New Roman" w:eastAsia="Times New Roman" w:hAnsi="Times New Roman" w:cs="Times New Roman"/>
-          <w:sz w:val="20"/>
-          <w:szCs w:val="20"/>
-        </w:rPr>
-        <w:t xml:space="preserve">, responding to technical and business requirements. </w:t>
-      </w:r>
-    </w:p>
-    <w:p>
-      <w:pPr>
-        <w:numPr>
-          <w:ilvl w:val="0"/>
-          <w:numId w:val="1"/>
-        </w:numPr>
-        <w:spacing w:before="100" w:beforeAutospacing="1" w:after="100" w:afterAutospacing="1" w:line="240" w:lineRule="auto"/>
-        <w:rPr>
-          <w:rFonts w:ascii="Times New Roman" w:eastAsia="Times New Roman" w:hAnsi="Times New Roman" w:cs="Times New Roman"/>
-          <w:sz w:val="20"/>
-          <w:szCs w:val="20"/>
-        </w:rPr>
-      </w:pPr>
-      <w:r>
-        <w:rPr>
-          <w:rFonts w:ascii="Times New Roman" w:eastAsia="Times New Roman" w:hAnsi="Times New Roman" w:cs="Times New Roman"/>
-          <w:sz w:val="20"/>
-          <w:szCs w:val="20"/>
-        </w:rPr>
-        <w:t xml:space="preserve">Perform technical activities including </w:t>
-      </w:r>
-      <w:r>
-        <w:rPr>
-          <w:rFonts w:ascii="Times New Roman" w:eastAsia="Times New Roman" w:hAnsi="Times New Roman" w:cs="Times New Roman"/>
-          <w:b/>
-          <w:bCs/>
-          <w:sz w:val="20"/>
-          <w:szCs w:val="20"/>
-        </w:rPr>
-        <w:t>system analysis, solution design, development, product installation, systems integration, testing, troubleshooting, and log management</w:t>
-      </w:r>
-      <w:r>
-        <w:rPr>
-          <w:rFonts w:ascii="Times New Roman" w:eastAsia="Times New Roman" w:hAnsi="Times New Roman" w:cs="Times New Roman"/>
-          <w:sz w:val="20"/>
-          <w:szCs w:val="20"/>
-        </w:rPr>
-        <w:t xml:space="preserve">. </w:t>
-      </w:r>
-    </w:p>
-    <w:p>
-      <w:pPr>
-        <w:numPr>
-          <w:ilvl w:val="0"/>
-          <w:numId w:val="1"/>
-        </w:numPr>
-        <w:spacing w:before="100" w:beforeAutospacing="1" w:after="100" w:afterAutospacing="1" w:line="240" w:lineRule="auto"/>
-        <w:rPr>
-          <w:rFonts w:ascii="Times New Roman" w:eastAsia="Times New Roman" w:hAnsi="Times New Roman" w:cs="Times New Roman"/>
-          <w:sz w:val="20"/>
-          <w:szCs w:val="20"/>
-        </w:rPr>
-      </w:pPr>
-      <w:r>
-        <w:rPr>
-          <w:rFonts w:ascii="Times New Roman" w:eastAsia="Times New Roman" w:hAnsi="Times New Roman" w:cs="Times New Roman"/>
-          <w:sz w:val="20"/>
-          <w:szCs w:val="20"/>
-        </w:rPr>
-        <w:t xml:space="preserve">Troubleshoot production issues across application and infrastructure environments and coordinate with </w:t>
-      </w:r>
-      <w:r>
-        <w:rPr>
-          <w:rFonts w:ascii="Times New Roman" w:eastAsia="Times New Roman" w:hAnsi="Times New Roman" w:cs="Times New Roman"/>
-          <w:b/>
-          <w:bCs/>
-          <w:sz w:val="20"/>
-          <w:szCs w:val="20"/>
-        </w:rPr>
-        <w:t>L1 and L3 teams</w:t>
-      </w:r>
-      <w:r>
-        <w:rPr>
-          <w:rFonts w:ascii="Times New Roman" w:eastAsia="Times New Roman" w:hAnsi="Times New Roman" w:cs="Times New Roman"/>
-          <w:sz w:val="20"/>
-          <w:szCs w:val="20"/>
-        </w:rPr>
-        <w:t xml:space="preserve"> to implement temporary and permanent solutions. </w:t>
-      </w:r>
-    </w:p>
-    <w:p>
-      <w:pPr>
-        <w:numPr>
-          <w:ilvl w:val="0"/>
-          <w:numId w:val="1"/>
-        </w:numPr>
-        <w:spacing w:before="100" w:beforeAutospacing="1" w:after="100" w:afterAutospacing="1" w:line="240" w:lineRule="auto"/>
-        <w:rPr>
-          <w:rFonts w:ascii="Times New Roman" w:eastAsia="Times New Roman" w:hAnsi="Times New Roman" w:cs="Times New Roman"/>
-          <w:sz w:val="20"/>
-          <w:szCs w:val="20"/>
-        </w:rPr>
-      </w:pPr>
-      <w:r>
-        <w:rPr>
-          <w:rFonts w:ascii="Times New Roman" w:eastAsia="Times New Roman" w:hAnsi="Times New Roman" w:cs="Times New Roman"/>
-          <w:sz w:val="20"/>
-          <w:szCs w:val="20"/>
-        </w:rPr>
-        <w:t xml:space="preserve">Develop and maintain </w:t>
-      </w:r>
-      <w:r>
-        <w:rPr>
-          <w:rFonts w:ascii="Times New Roman" w:eastAsia="Times New Roman" w:hAnsi="Times New Roman" w:cs="Times New Roman"/>
-          <w:b/>
-          <w:bCs/>
-          <w:sz w:val="20"/>
-          <w:szCs w:val="20"/>
-        </w:rPr>
-        <w:t>Shell and Python automation</w:t>
-      </w:r>
-      <w:r>
-        <w:rPr>
-          <w:rFonts w:ascii="Times New Roman" w:eastAsia="Times New Roman" w:hAnsi="Times New Roman" w:cs="Times New Roman"/>
-          <w:sz w:val="20"/>
-          <w:szCs w:val="20"/>
-        </w:rPr>
-        <w:t xml:space="preserve"> to reduce repetitive operational tasks and improve operational efficiency. </w:t>
-      </w:r>
-    </w:p>
-    <w:p>
-      <w:pPr>
-        <w:numPr>
-          <w:ilvl w:val="0"/>
-          <w:numId w:val="1"/>
-        </w:numPr>
-        <w:spacing w:before="100" w:beforeAutospacing="1" w:after="100" w:afterAutospacing="1" w:line="240" w:lineRule="auto"/>
-        <w:rPr>
-          <w:rFonts w:ascii="Times New Roman" w:eastAsia="Times New Roman" w:hAnsi="Times New Roman" w:cs="Times New Roman"/>
-          <w:sz w:val="20"/>
-          <w:szCs w:val="20"/>
-        </w:rPr>
-      </w:pPr>
-      <w:r>
-        <w:rPr>
-          <w:rFonts w:ascii="Times New Roman" w:eastAsia="Times New Roman" w:hAnsi="Times New Roman" w:cs="Times New Roman"/>
-          <w:sz w:val="20"/>
-          <w:szCs w:val="20"/>
-        </w:rPr>
-        <w:t xml:space="preserve">Perform operational monitoring and investigation of system and application issues using logs and monitoring tools. </w:t>
-      </w:r>
-    </w:p>
-    <w:p>
-      <w:pPr>
-        <w:numPr>
-          <w:ilvl w:val="0"/>
-          <w:numId w:val="1"/>
-        </w:numPr>
-        <w:spacing w:before="100" w:beforeAutospacing="1" w:after="100" w:afterAutospacing="1" w:line="240" w:lineRule="auto"/>
-        <w:rPr>
-          <w:rFonts w:ascii="Times New Roman" w:eastAsia="Times New Roman" w:hAnsi="Times New Roman" w:cs="Times New Roman"/>
-          <w:sz w:val="20"/>
-          <w:szCs w:val="20"/>
-        </w:rPr>
-      </w:pPr>
-      <w:r>
-        <w:rPr>
-          <w:rFonts w:ascii="Times New Roman" w:eastAsia="Times New Roman" w:hAnsi="Times New Roman" w:cs="Times New Roman"/>
-          <w:sz w:val="20"/>
-          <w:szCs w:val="20"/>
-        </w:rPr>
-        <w:t xml:space="preserve">Support </w:t>
-      </w:r>
-      <w:r>
-        <w:rPr>
-          <w:rFonts w:ascii="Times New Roman" w:eastAsia="Times New Roman" w:hAnsi="Times New Roman" w:cs="Times New Roman"/>
-          <w:b/>
-          <w:bCs/>
-          <w:sz w:val="20"/>
-          <w:szCs w:val="20"/>
-        </w:rPr>
-        <w:t>Linux/Unix-based environments</w:t>
-      </w:r>
-      <w:r>
-        <w:rPr>
-          <w:rFonts w:ascii="Times New Roman" w:eastAsia="Times New Roman" w:hAnsi="Times New Roman" w:cs="Times New Roman"/>
-          <w:sz w:val="20"/>
-          <w:szCs w:val="20"/>
-        </w:rPr>
-        <w:t xml:space="preserve">, application services, and middleware components as part of day-to-day operations. </w:t>
-      </w:r>
-    </w:p>
-    <w:p>
-      <w:pPr>
-        <w:numPr>
-          <w:ilvl w:val="0"/>
-          <w:numId w:val="1"/>
-        </w:numPr>
-        <w:spacing w:before="100" w:beforeAutospacing="1" w:after="100" w:afterAutospacing="1" w:line="240" w:lineRule="auto"/>
-        <w:rPr>
-          <w:rFonts w:ascii="Times New Roman" w:eastAsia="Times New Roman" w:hAnsi="Times New Roman" w:cs="Times New Roman"/>
-          <w:sz w:val="24"/>
-          <w:szCs w:val="24"/>
-        </w:rPr>
-      </w:pPr>
-      <w:r>
-        <w:rPr>
-          <w:rFonts w:ascii="Times New Roman" w:eastAsia="Times New Roman" w:hAnsi="Times New Roman" w:cs="Times New Roman"/>
-          <w:sz w:val="20"/>
-          <w:szCs w:val="20"/>
-        </w:rPr>
-        <w:t xml:space="preserve">Perform </w:t>
-      </w:r>
-      <w:r>
-        <w:rPr>
-          <w:rFonts w:ascii="Times New Roman" w:eastAsia="Times New Roman" w:hAnsi="Times New Roman" w:cs="Times New Roman"/>
-          <w:b/>
-          <w:bCs/>
-          <w:sz w:val="20"/>
-          <w:szCs w:val="20"/>
-        </w:rPr>
-        <w:t>Salesforce administration</w:t>
-      </w:r>
-      <w:r>
-        <w:rPr>
-          <w:rFonts w:ascii="Times New Roman" w:eastAsia="Times New Roman" w:hAnsi="Times New Roman" w:cs="Times New Roman"/>
-          <w:sz w:val="20"/>
-          <w:szCs w:val="20"/>
-        </w:rPr>
-        <w:t xml:space="preserve"> as part of assigned technical responsibilities.</w:t>
-      </w:r>
-      <w:r>
-        <w:rPr>
-          <w:rFonts w:ascii="Times New Roman" w:eastAsia="Times New Roman" w:hAnsi="Times New Roman" w:cs="Times New Roman"/>
-          <w:sz w:val="24"/>
-          <w:szCs w:val="24"/>
-        </w:rPr>
-        <w:t xml:space="preserve"> </w:t>
-      </w:r>
-    </w:p>
-    <w:p>
-      <w:pPr>
-        <w:spacing w:after="0" w:line="240" w:lineRule="auto"/>
-        <w:rPr>
-          <w:rFonts w:ascii="Times New Roman" w:eastAsia="Times New Roman" w:hAnsi="Times New Roman" w:cs="Times New Roman"/>
-          <w:sz w:val="24"/>
-          <w:szCs w:val="24"/>
-        </w:rPr>
-      </w:pPr>
-      <w:r>
-        <w:rPr>
-          <w:rFonts w:ascii="Times New Roman" w:eastAsia="Times New Roman" w:hAnsi="Times New Roman" w:cs="Times New Roman"/>
-          <w:sz w:val="24"/>
-          <w:szCs w:val="24"/>
-        </w:rPr>
-        <w:pict>
-          <v:rect id="_x0000_i1028" style="width:0;height:1.5pt" o:hralign="center" o:hrstd="t" o:hr="t" fillcolor="#a0a0a0" stroked="f"/>
+          <v:rect id="_x0000_i1034" style="width:0;height:1.5pt" o:hralign="center" o:hrstd="t" o:hr="t" fillcolor="#a0a0a0" stroked="f"/>
         </w:pict>
       </w:r>
     </w:p>
@@ -1417,7 +1416,7 @@
           <w:szCs w:val="24"/>
         </w:rPr>
         <w:pict>
-          <v:rect id="_x0000_i1029" style="width:0;height:1.5pt" o:hralign="center" o:hrstd="t" o:hr="t" fillcolor="#a0a0a0" stroked="f"/>
+          <v:rect id="_x0000_i1027" style="width:0;height:1.5pt" o:hralign="center" o:hrstd="t" o:hr="t" fillcolor="#a0a0a0" stroked="f"/>
         </w:pict>
       </w:r>
     </w:p>
@@ -1685,7 +1684,6 @@
           <w:sz w:val="20"/>
           <w:szCs w:val="20"/>
         </w:rPr>
-        <w:lastRenderedPageBreak/>
         <w:t xml:space="preserve">Developed and maintained </w:t>
       </w:r>
       <w:r>
@@ -1757,7 +1755,7 @@
           <w:szCs w:val="24"/>
         </w:rPr>
         <w:pict>
-          <v:rect id="_x0000_i1030" style="width:0;height:1.5pt" o:hralign="center" o:hrstd="t" o:hr="t" fillcolor="#a0a0a0" stroked="f"/>
+          <v:rect id="_x0000_i1028" style="width:0;height:1.5pt" o:hralign="center" o:hrstd="t" o:hr="t" fillcolor="#a0a0a0" stroked="f"/>
         </w:pict>
       </w:r>
     </w:p>
@@ -2014,7 +2012,7 @@
           <w:szCs w:val="24"/>
         </w:rPr>
         <w:pict>
-          <v:rect id="_x0000_i1031" style="width:0;height:1.5pt" o:hralign="center" o:hrstd="t" o:hr="t" fillcolor="#a0a0a0" stroked="f"/>
+          <v:rect id="_x0000_i1029" style="width:0;height:1.5pt" o:hralign="center" o:hrstd="t" o:hr="t" fillcolor="#a0a0a0" stroked="f"/>
         </w:pict>
       </w:r>
     </w:p>
@@ -2063,27 +2061,52 @@
           <w:sz w:val="24"/>
           <w:szCs w:val="24"/>
         </w:rPr>
-        <w:t>Linux Server Health Check Automation</w:t>
+        <w:t>AWS Multi-Tier High-Availability Infrastructure (</w:t>
+      </w:r>
+      <w:proofErr w:type="spellStart"/>
+      <w:r>
+        <w:rPr>
+          <w:rFonts w:ascii="Times New Roman" w:eastAsia="Times New Roman" w:hAnsi="Times New Roman" w:cs="Times New Roman"/>
+          <w:b/>
+          <w:bCs/>
+          <w:sz w:val="24"/>
+          <w:szCs w:val="24"/>
+        </w:rPr>
+        <w:t>IaC</w:t>
+      </w:r>
+      <w:proofErr w:type="spellEnd"/>
+      <w:r>
+        <w:rPr>
+          <w:rFonts w:ascii="Times New Roman" w:eastAsia="Times New Roman" w:hAnsi="Times New Roman" w:cs="Times New Roman"/>
+          <w:b/>
+          <w:bCs/>
+          <w:sz w:val="24"/>
+          <w:szCs w:val="24"/>
+        </w:rPr>
+        <w:t xml:space="preserve"> with Terraform)</w:t>
       </w:r>
     </w:p>
     <w:p>
       <w:pPr>
         <w:spacing w:before="100" w:beforeAutospacing="1" w:after="100" w:afterAutospacing="1" w:line="240" w:lineRule="auto"/>
-        <w:rPr>
-          <w:rFonts w:ascii="Times New Roman" w:eastAsia="Times New Roman" w:hAnsi="Times New Roman" w:cs="Times New Roman"/>
-          <w:sz w:val="20"/>
-          <w:szCs w:val="20"/>
-        </w:rPr>
-      </w:pPr>
-      <w:r>
-        <w:rPr>
-          <w:rFonts w:ascii="Times New Roman" w:eastAsia="Times New Roman" w:hAnsi="Times New Roman" w:cs="Times New Roman"/>
-          <w:b/>
-          <w:bCs/>
-          <w:sz w:val="20"/>
-          <w:szCs w:val="20"/>
-        </w:rPr>
-        <w:t xml:space="preserve">Bash | Linux | </w:t>
+        <w:outlineLvl w:val="2"/>
+        <w:rPr>
+          <w:rFonts w:ascii="Times New Roman" w:eastAsia="Times New Roman" w:hAnsi="Times New Roman" w:cs="Times New Roman"/>
+          <w:b/>
+          <w:bCs/>
+          <w:sz w:val="24"/>
+          <w:szCs w:val="24"/>
+        </w:rPr>
+      </w:pPr>
+      <w:r>
+        <w:rPr>
+          <w:rFonts w:ascii="Times New Roman" w:eastAsia="Times New Roman" w:hAnsi="Times New Roman" w:cs="Times New Roman"/>
+          <w:b/>
+          <w:bCs/>
+          <w:sz w:val="24"/>
+          <w:szCs w:val="24"/>
+        </w:rPr>
+        <w:t xml:space="preserve">Terraform | AWS (VPC, ALB, ASG, RDS) | S3 &amp; </w:t>
       </w:r>
       <w:proofErr w:type="spellStart"/>
       <w:r>
@@ -2091,10 +2114,10 @@
           <w:rFonts w:ascii="Times New Roman" w:eastAsia="Times New Roman" w:hAnsi="Times New Roman" w:cs="Times New Roman"/>
           <w:b/>
           <w:bCs/>
-          <w:sz w:val="20"/>
-          <w:szCs w:val="20"/>
-        </w:rPr>
-        <w:t>Cron</w:t>
+          <w:sz w:val="24"/>
+          <w:szCs w:val="24"/>
+        </w:rPr>
+        <w:t>DynamoDB</w:t>
       </w:r>
       <w:proofErr w:type="spellEnd"/>
       <w:r>
@@ -2102,615 +2125,637 @@
           <w:rFonts w:ascii="Times New Roman" w:eastAsia="Times New Roman" w:hAnsi="Times New Roman" w:cs="Times New Roman"/>
           <w:b/>
           <w:bCs/>
-          <w:sz w:val="20"/>
-          <w:szCs w:val="20"/>
-        </w:rPr>
-        <w:t xml:space="preserve"> | System Monitoring | Automation</w:t>
-      </w:r>
-    </w:p>
-    <w:p>
-      <w:pPr>
+          <w:sz w:val="24"/>
+          <w:szCs w:val="24"/>
+        </w:rPr>
+        <w:t xml:space="preserve"> Remote State | Nginx</w:t>
+      </w:r>
+    </w:p>
+    <w:p>
+      <w:pPr>
+        <w:pStyle w:val="ListParagraph"/>
         <w:numPr>
           <w:ilvl w:val="0"/>
-          <w:numId w:val="5"/>
+          <w:numId w:val="12"/>
         </w:numPr>
         <w:spacing w:before="100" w:beforeAutospacing="1" w:after="100" w:afterAutospacing="1" w:line="240" w:lineRule="auto"/>
-        <w:rPr>
-          <w:rFonts w:ascii="Times New Roman" w:eastAsia="Times New Roman" w:hAnsi="Times New Roman" w:cs="Times New Roman"/>
-          <w:sz w:val="20"/>
-          <w:szCs w:val="20"/>
-        </w:rPr>
-      </w:pPr>
-      <w:r>
-        <w:rPr>
-          <w:rFonts w:ascii="Times New Roman" w:eastAsia="Times New Roman" w:hAnsi="Times New Roman" w:cs="Times New Roman"/>
-          <w:sz w:val="20"/>
-          <w:szCs w:val="20"/>
-        </w:rPr>
-        <w:t xml:space="preserve">Developed a Bash-based server health-check solution to monitor </w:t>
-      </w:r>
-      <w:r>
-        <w:rPr>
-          <w:rFonts w:ascii="Times New Roman" w:eastAsia="Times New Roman" w:hAnsi="Times New Roman" w:cs="Times New Roman"/>
-          <w:b/>
-          <w:bCs/>
-          <w:sz w:val="20"/>
-          <w:szCs w:val="20"/>
-        </w:rPr>
-        <w:t xml:space="preserve">disk usage, memory availability, SSH, </w:t>
-      </w:r>
-      <w:proofErr w:type="spellStart"/>
-      <w:r>
-        <w:rPr>
-          <w:rFonts w:ascii="Times New Roman" w:eastAsia="Times New Roman" w:hAnsi="Times New Roman" w:cs="Times New Roman"/>
-          <w:b/>
-          <w:bCs/>
-          <w:sz w:val="20"/>
-          <w:szCs w:val="20"/>
-        </w:rPr>
-        <w:t>Cron</w:t>
-      </w:r>
-      <w:proofErr w:type="spellEnd"/>
-      <w:r>
-        <w:rPr>
-          <w:rFonts w:ascii="Times New Roman" w:eastAsia="Times New Roman" w:hAnsi="Times New Roman" w:cs="Times New Roman"/>
-          <w:b/>
-          <w:bCs/>
-          <w:sz w:val="20"/>
-          <w:szCs w:val="20"/>
-        </w:rPr>
-        <w:t>, and Docker services</w:t>
-      </w:r>
-      <w:r>
-        <w:rPr>
-          <w:rFonts w:ascii="Times New Roman" w:eastAsia="Times New Roman" w:hAnsi="Times New Roman" w:cs="Times New Roman"/>
-          <w:sz w:val="20"/>
-          <w:szCs w:val="20"/>
-        </w:rPr>
-        <w:t xml:space="preserve">. </w:t>
-      </w:r>
-    </w:p>
-    <w:p>
-      <w:pPr>
+        <w:outlineLvl w:val="2"/>
+        <w:rPr>
+          <w:rFonts w:ascii="Times New Roman" w:eastAsia="Times New Roman" w:hAnsi="Times New Roman" w:cs="Times New Roman"/>
+          <w:bCs/>
+          <w:sz w:val="20"/>
+          <w:szCs w:val="20"/>
+        </w:rPr>
+      </w:pPr>
+      <w:r>
+        <w:rPr>
+          <w:rFonts w:ascii="Times New Roman" w:eastAsia="Times New Roman" w:hAnsi="Times New Roman" w:cs="Times New Roman"/>
+          <w:bCs/>
+          <w:sz w:val="20"/>
+          <w:szCs w:val="20"/>
+        </w:rPr>
+        <w:t>Designed and provisioned an automated 3-tier enterprise architecture across multiple Availability Zones in AWS using modular Terraform.</w:t>
+      </w:r>
+    </w:p>
+    <w:p>
+      <w:pPr>
+        <w:pStyle w:val="ListParagraph"/>
         <w:numPr>
           <w:ilvl w:val="0"/>
-          <w:numId w:val="5"/>
+          <w:numId w:val="12"/>
         </w:numPr>
         <w:spacing w:before="100" w:beforeAutospacing="1" w:after="100" w:afterAutospacing="1" w:line="240" w:lineRule="auto"/>
-        <w:rPr>
-          <w:rFonts w:ascii="Times New Roman" w:eastAsia="Times New Roman" w:hAnsi="Times New Roman" w:cs="Times New Roman"/>
-          <w:sz w:val="20"/>
-          <w:szCs w:val="20"/>
-        </w:rPr>
-      </w:pPr>
-      <w:r>
-        <w:rPr>
-          <w:rFonts w:ascii="Times New Roman" w:eastAsia="Times New Roman" w:hAnsi="Times New Roman" w:cs="Times New Roman"/>
-          <w:sz w:val="20"/>
-          <w:szCs w:val="20"/>
-        </w:rPr>
-        <w:t xml:space="preserve">Implemented reusable functions and service loops to make health checks modular and extensible. </w:t>
-      </w:r>
-    </w:p>
-    <w:p>
-      <w:pPr>
+        <w:outlineLvl w:val="2"/>
+        <w:rPr>
+          <w:rFonts w:ascii="Times New Roman" w:eastAsia="Times New Roman" w:hAnsi="Times New Roman" w:cs="Times New Roman"/>
+          <w:bCs/>
+          <w:sz w:val="20"/>
+          <w:szCs w:val="20"/>
+        </w:rPr>
+      </w:pPr>
+      <w:r>
+        <w:rPr>
+          <w:rFonts w:ascii="Times New Roman" w:eastAsia="Times New Roman" w:hAnsi="Times New Roman" w:cs="Times New Roman"/>
+          <w:bCs/>
+          <w:sz w:val="20"/>
+          <w:szCs w:val="20"/>
+        </w:rPr>
+        <w:t xml:space="preserve">Configured robust remote state management using Amazon S3 with server-side encryption and distributed state locking via </w:t>
+      </w:r>
+      <w:proofErr w:type="spellStart"/>
+      <w:r>
+        <w:rPr>
+          <w:rFonts w:ascii="Times New Roman" w:eastAsia="Times New Roman" w:hAnsi="Times New Roman" w:cs="Times New Roman"/>
+          <w:bCs/>
+          <w:sz w:val="20"/>
+          <w:szCs w:val="20"/>
+        </w:rPr>
+        <w:t>DynamoDB</w:t>
+      </w:r>
+      <w:proofErr w:type="spellEnd"/>
+      <w:r>
+        <w:rPr>
+          <w:rFonts w:ascii="Times New Roman" w:eastAsia="Times New Roman" w:hAnsi="Times New Roman" w:cs="Times New Roman"/>
+          <w:bCs/>
+          <w:sz w:val="20"/>
+          <w:szCs w:val="20"/>
+        </w:rPr>
+        <w:t xml:space="preserve"> to prevent concurrent pipeline conflicts.</w:t>
+      </w:r>
+    </w:p>
+    <w:p>
+      <w:pPr>
+        <w:pStyle w:val="ListParagraph"/>
         <w:numPr>
           <w:ilvl w:val="0"/>
-          <w:numId w:val="5"/>
+          <w:numId w:val="12"/>
         </w:numPr>
         <w:spacing w:before="100" w:beforeAutospacing="1" w:after="100" w:afterAutospacing="1" w:line="240" w:lineRule="auto"/>
-        <w:rPr>
-          <w:rFonts w:ascii="Times New Roman" w:eastAsia="Times New Roman" w:hAnsi="Times New Roman" w:cs="Times New Roman"/>
-          <w:sz w:val="20"/>
-          <w:szCs w:val="20"/>
-        </w:rPr>
-      </w:pPr>
-      <w:r>
-        <w:rPr>
-          <w:rFonts w:ascii="Times New Roman" w:eastAsia="Times New Roman" w:hAnsi="Times New Roman" w:cs="Times New Roman"/>
-          <w:sz w:val="20"/>
-          <w:szCs w:val="20"/>
-        </w:rPr>
-        <w:t xml:space="preserve">Implemented structured logging with </w:t>
-      </w:r>
-      <w:r>
-        <w:rPr>
-          <w:rFonts w:ascii="Times New Roman" w:eastAsia="Times New Roman" w:hAnsi="Times New Roman" w:cs="Times New Roman"/>
-          <w:b/>
-          <w:bCs/>
-          <w:sz w:val="20"/>
-          <w:szCs w:val="20"/>
-        </w:rPr>
-        <w:t>timestamps, severity levels, hostname, and overall health status</w:t>
-      </w:r>
-      <w:r>
-        <w:rPr>
-          <w:rFonts w:ascii="Times New Roman" w:eastAsia="Times New Roman" w:hAnsi="Times New Roman" w:cs="Times New Roman"/>
-          <w:sz w:val="20"/>
-          <w:szCs w:val="20"/>
-        </w:rPr>
-        <w:t xml:space="preserve">. </w:t>
-      </w:r>
-    </w:p>
-    <w:p>
-      <w:pPr>
+        <w:outlineLvl w:val="2"/>
+        <w:rPr>
+          <w:rFonts w:ascii="Times New Roman" w:eastAsia="Times New Roman" w:hAnsi="Times New Roman" w:cs="Times New Roman"/>
+          <w:bCs/>
+          <w:sz w:val="20"/>
+          <w:szCs w:val="20"/>
+        </w:rPr>
+      </w:pPr>
+      <w:r>
+        <w:rPr>
+          <w:rFonts w:ascii="Times New Roman" w:eastAsia="Times New Roman" w:hAnsi="Times New Roman" w:cs="Times New Roman"/>
+          <w:bCs/>
+          <w:sz w:val="20"/>
+          <w:szCs w:val="20"/>
+        </w:rPr>
+        <w:t>Built a self-healing compute tier utilizing Auto Scaling Groups (ASG) and Launch Templates fronted by an Application Load Balancer (ALB) with automated health check routing.</w:t>
+      </w:r>
+    </w:p>
+    <w:p>
+      <w:pPr>
+        <w:pStyle w:val="ListParagraph"/>
         <w:numPr>
           <w:ilvl w:val="0"/>
-          <w:numId w:val="5"/>
+          <w:numId w:val="12"/>
         </w:numPr>
         <w:spacing w:before="100" w:beforeAutospacing="1" w:after="100" w:afterAutospacing="1" w:line="240" w:lineRule="auto"/>
-        <w:rPr>
-          <w:rFonts w:ascii="Times New Roman" w:eastAsia="Times New Roman" w:hAnsi="Times New Roman" w:cs="Times New Roman"/>
-          <w:sz w:val="20"/>
-          <w:szCs w:val="20"/>
-        </w:rPr>
-      </w:pPr>
-      <w:r>
-        <w:rPr>
-          <w:rFonts w:ascii="Times New Roman" w:eastAsia="Times New Roman" w:hAnsi="Times New Roman" w:cs="Times New Roman"/>
-          <w:sz w:val="20"/>
-          <w:szCs w:val="20"/>
-        </w:rPr>
-        <w:t xml:space="preserve">Designed aggregated health-check logic that performs all checks before returning the final </w:t>
-      </w:r>
-      <w:r>
-        <w:rPr>
-          <w:rFonts w:ascii="Times New Roman" w:eastAsia="Times New Roman" w:hAnsi="Times New Roman" w:cs="Times New Roman"/>
-          <w:b/>
-          <w:bCs/>
-          <w:sz w:val="20"/>
-          <w:szCs w:val="20"/>
-        </w:rPr>
-        <w:t>exit code</w:t>
-      </w:r>
-      <w:r>
-        <w:rPr>
-          <w:rFonts w:ascii="Times New Roman" w:eastAsia="Times New Roman" w:hAnsi="Times New Roman" w:cs="Times New Roman"/>
-          <w:sz w:val="20"/>
-          <w:szCs w:val="20"/>
-        </w:rPr>
-        <w:t xml:space="preserve">. </w:t>
-      </w:r>
-    </w:p>
-    <w:p>
-      <w:pPr>
+        <w:outlineLvl w:val="2"/>
+        <w:rPr>
+          <w:rFonts w:ascii="Times New Roman" w:eastAsia="Times New Roman" w:hAnsi="Times New Roman" w:cs="Times New Roman"/>
+          <w:bCs/>
+          <w:sz w:val="20"/>
+          <w:szCs w:val="20"/>
+        </w:rPr>
+      </w:pPr>
+      <w:r>
+        <w:rPr>
+          <w:rFonts w:ascii="Times New Roman" w:eastAsia="Times New Roman" w:hAnsi="Times New Roman" w:cs="Times New Roman"/>
+          <w:bCs/>
+          <w:sz w:val="20"/>
+          <w:szCs w:val="20"/>
+        </w:rPr>
+        <w:lastRenderedPageBreak/>
+        <w:t>Enforced network segmentation and least-privilege security by isolating Amazon RDS PostgreSQL inside Private Subnets, strictly chained to accept inbound traffic only from application security groups.</w:t>
+      </w:r>
+    </w:p>
+    <w:p>
+      <w:pPr>
+        <w:spacing w:before="100" w:beforeAutospacing="1" w:after="100" w:afterAutospacing="1" w:line="240" w:lineRule="auto"/>
+        <w:outlineLvl w:val="2"/>
+        <w:rPr>
+          <w:rFonts w:ascii="Times New Roman" w:eastAsia="Times New Roman" w:hAnsi="Times New Roman" w:cs="Times New Roman"/>
+          <w:b/>
+          <w:bCs/>
+          <w:sz w:val="24"/>
+          <w:szCs w:val="24"/>
+        </w:rPr>
+      </w:pPr>
+      <w:proofErr w:type="spellStart"/>
+      <w:r>
+        <w:rPr>
+          <w:rFonts w:ascii="Times New Roman" w:eastAsia="Times New Roman" w:hAnsi="Times New Roman" w:cs="Times New Roman"/>
+          <w:b/>
+          <w:bCs/>
+          <w:sz w:val="24"/>
+          <w:szCs w:val="24"/>
+        </w:rPr>
+        <w:t>PaySecure</w:t>
+      </w:r>
+      <w:proofErr w:type="spellEnd"/>
+      <w:r>
+        <w:rPr>
+          <w:rFonts w:ascii="Times New Roman" w:eastAsia="Times New Roman" w:hAnsi="Times New Roman" w:cs="Times New Roman"/>
+          <w:b/>
+          <w:bCs/>
+          <w:sz w:val="24"/>
+          <w:szCs w:val="24"/>
+        </w:rPr>
+        <w:t xml:space="preserve"> </w:t>
+      </w:r>
+      <w:proofErr w:type="spellStart"/>
+      <w:r>
+        <w:rPr>
+          <w:rFonts w:ascii="Times New Roman" w:eastAsia="Times New Roman" w:hAnsi="Times New Roman" w:cs="Times New Roman"/>
+          <w:b/>
+          <w:bCs/>
+          <w:sz w:val="24"/>
+          <w:szCs w:val="24"/>
+        </w:rPr>
+        <w:t>Microservices</w:t>
+      </w:r>
+      <w:proofErr w:type="spellEnd"/>
+      <w:r>
+        <w:rPr>
+          <w:rFonts w:ascii="Times New Roman" w:eastAsia="Times New Roman" w:hAnsi="Times New Roman" w:cs="Times New Roman"/>
+          <w:b/>
+          <w:bCs/>
+          <w:sz w:val="24"/>
+          <w:szCs w:val="24"/>
+        </w:rPr>
+        <w:t xml:space="preserve"> Deployment &amp; Orchestration (Terraform, Docker &amp; Kubernetes)</w:t>
+      </w:r>
+    </w:p>
+    <w:p>
+      <w:pPr>
+        <w:spacing w:before="100" w:beforeAutospacing="1" w:after="100" w:afterAutospacing="1" w:line="240" w:lineRule="auto"/>
+        <w:outlineLvl w:val="2"/>
+        <w:rPr>
+          <w:rFonts w:ascii="Times New Roman" w:eastAsia="Times New Roman" w:hAnsi="Times New Roman" w:cs="Times New Roman"/>
+          <w:b/>
+          <w:bCs/>
+          <w:sz w:val="24"/>
+          <w:szCs w:val="24"/>
+        </w:rPr>
+      </w:pPr>
+      <w:r>
+        <w:rPr>
+          <w:rFonts w:ascii="Times New Roman" w:eastAsia="Times New Roman" w:hAnsi="Times New Roman" w:cs="Times New Roman"/>
+          <w:b/>
+          <w:bCs/>
+          <w:sz w:val="24"/>
+          <w:szCs w:val="24"/>
+        </w:rPr>
+        <w:t xml:space="preserve">Terraform | Kubernetes | Docker | </w:t>
+      </w:r>
+      <w:proofErr w:type="spellStart"/>
+      <w:r>
+        <w:rPr>
+          <w:rFonts w:ascii="Times New Roman" w:eastAsia="Times New Roman" w:hAnsi="Times New Roman" w:cs="Times New Roman"/>
+          <w:b/>
+          <w:bCs/>
+          <w:sz w:val="24"/>
+          <w:szCs w:val="24"/>
+        </w:rPr>
+        <w:t>Microservices</w:t>
+      </w:r>
+      <w:proofErr w:type="spellEnd"/>
+      <w:r>
+        <w:rPr>
+          <w:rFonts w:ascii="Times New Roman" w:eastAsia="Times New Roman" w:hAnsi="Times New Roman" w:cs="Times New Roman"/>
+          <w:b/>
+          <w:bCs/>
+          <w:sz w:val="24"/>
+          <w:szCs w:val="24"/>
+        </w:rPr>
+        <w:t xml:space="preserve"> | Networking</w:t>
+      </w:r>
+    </w:p>
+    <w:p>
+      <w:pPr>
+        <w:pStyle w:val="ListParagraph"/>
         <w:numPr>
           <w:ilvl w:val="0"/>
-          <w:numId w:val="5"/>
+          <w:numId w:val="13"/>
         </w:numPr>
         <w:spacing w:before="100" w:beforeAutospacing="1" w:after="100" w:afterAutospacing="1" w:line="240" w:lineRule="auto"/>
-        <w:rPr>
-          <w:rFonts w:ascii="Times New Roman" w:eastAsia="Times New Roman" w:hAnsi="Times New Roman" w:cs="Times New Roman"/>
-          <w:sz w:val="20"/>
-          <w:szCs w:val="20"/>
-        </w:rPr>
-      </w:pPr>
-      <w:r>
-        <w:rPr>
-          <w:rFonts w:ascii="Times New Roman" w:eastAsia="Times New Roman" w:hAnsi="Times New Roman" w:cs="Times New Roman"/>
-          <w:sz w:val="20"/>
-          <w:szCs w:val="20"/>
-        </w:rPr>
-        <w:t xml:space="preserve">Integrated the health-check script with </w:t>
+        <w:outlineLvl w:val="2"/>
+        <w:rPr>
+          <w:rFonts w:ascii="Times New Roman" w:eastAsia="Times New Roman" w:hAnsi="Times New Roman" w:cs="Times New Roman"/>
+          <w:bCs/>
+          <w:sz w:val="20"/>
+          <w:szCs w:val="20"/>
+        </w:rPr>
+      </w:pPr>
+      <w:r>
+        <w:rPr>
+          <w:rFonts w:ascii="Times New Roman" w:eastAsia="Times New Roman" w:hAnsi="Times New Roman" w:cs="Times New Roman"/>
+          <w:bCs/>
+          <w:sz w:val="20"/>
+          <w:szCs w:val="20"/>
+        </w:rPr>
+        <w:t xml:space="preserve">Designed and provisioned </w:t>
       </w:r>
       <w:proofErr w:type="spellStart"/>
       <w:r>
         <w:rPr>
           <w:rFonts w:ascii="Times New Roman" w:eastAsia="Times New Roman" w:hAnsi="Times New Roman" w:cs="Times New Roman"/>
-          <w:b/>
-          <w:bCs/>
-          <w:sz w:val="20"/>
-          <w:szCs w:val="20"/>
-        </w:rPr>
-        <w:t>Cron</w:t>
+          <w:bCs/>
+          <w:sz w:val="20"/>
+          <w:szCs w:val="20"/>
+        </w:rPr>
+        <w:t>microservices</w:t>
       </w:r>
       <w:proofErr w:type="spellEnd"/>
       <w:r>
         <w:rPr>
           <w:rFonts w:ascii="Times New Roman" w:eastAsia="Times New Roman" w:hAnsi="Times New Roman" w:cs="Times New Roman"/>
-          <w:sz w:val="20"/>
-          <w:szCs w:val="20"/>
-        </w:rPr>
-        <w:t xml:space="preserve"> for scheduled automation. </w:t>
-      </w:r>
-    </w:p>
-    <w:p>
-      <w:pPr>
+          <w:bCs/>
+          <w:sz w:val="20"/>
+          <w:szCs w:val="20"/>
+        </w:rPr>
+        <w:t xml:space="preserve"> infrastructure using modular Terraform configurations with isolated network architectures.</w:t>
+      </w:r>
+    </w:p>
+    <w:p>
+      <w:pPr>
+        <w:pStyle w:val="ListParagraph"/>
         <w:numPr>
           <w:ilvl w:val="0"/>
-          <w:numId w:val="5"/>
+          <w:numId w:val="13"/>
         </w:numPr>
         <w:spacing w:before="100" w:beforeAutospacing="1" w:after="100" w:afterAutospacing="1" w:line="240" w:lineRule="auto"/>
-        <w:rPr>
-          <w:rFonts w:ascii="Times New Roman" w:eastAsia="Times New Roman" w:hAnsi="Times New Roman" w:cs="Times New Roman"/>
-          <w:sz w:val="20"/>
-          <w:szCs w:val="20"/>
-        </w:rPr>
-      </w:pPr>
-      <w:r>
-        <w:rPr>
-          <w:rFonts w:ascii="Times New Roman" w:eastAsia="Times New Roman" w:hAnsi="Times New Roman" w:cs="Times New Roman"/>
-          <w:sz w:val="20"/>
-          <w:szCs w:val="20"/>
-        </w:rPr>
-        <w:t xml:space="preserve">Designed the script to return </w:t>
-      </w:r>
-      <w:r>
-        <w:rPr>
-          <w:rFonts w:ascii="Courier New" w:eastAsia="Times New Roman" w:hAnsi="Courier New" w:cs="Courier New"/>
-          <w:sz w:val="20"/>
-          <w:szCs w:val="20"/>
-        </w:rPr>
-        <w:t>0</w:t>
-      </w:r>
-      <w:r>
-        <w:rPr>
-          <w:rFonts w:ascii="Times New Roman" w:eastAsia="Times New Roman" w:hAnsi="Times New Roman" w:cs="Times New Roman"/>
-          <w:sz w:val="20"/>
-          <w:szCs w:val="20"/>
-        </w:rPr>
-        <w:t xml:space="preserve"> for healthy systems and </w:t>
-      </w:r>
-      <w:r>
-        <w:rPr>
-          <w:rFonts w:ascii="Courier New" w:eastAsia="Times New Roman" w:hAnsi="Courier New" w:cs="Courier New"/>
-          <w:sz w:val="20"/>
-          <w:szCs w:val="20"/>
-        </w:rPr>
-        <w:t>1</w:t>
-      </w:r>
-      <w:r>
-        <w:rPr>
-          <w:rFonts w:ascii="Times New Roman" w:eastAsia="Times New Roman" w:hAnsi="Times New Roman" w:cs="Times New Roman"/>
-          <w:sz w:val="20"/>
-          <w:szCs w:val="20"/>
-        </w:rPr>
-        <w:t xml:space="preserve"> for unhealthy systems, allowing monitoring and automation systems to consume the result. </w:t>
-      </w:r>
-    </w:p>
-    <w:p>
-      <w:pPr>
+        <w:outlineLvl w:val="2"/>
+        <w:rPr>
+          <w:rFonts w:ascii="Times New Roman" w:eastAsia="Times New Roman" w:hAnsi="Times New Roman" w:cs="Times New Roman"/>
+          <w:bCs/>
+          <w:sz w:val="20"/>
+          <w:szCs w:val="20"/>
+        </w:rPr>
+      </w:pPr>
+      <w:r>
+        <w:rPr>
+          <w:rFonts w:ascii="Times New Roman" w:eastAsia="Times New Roman" w:hAnsi="Times New Roman" w:cs="Times New Roman"/>
+          <w:bCs/>
+          <w:sz w:val="20"/>
+          <w:szCs w:val="20"/>
+        </w:rPr>
+        <w:t xml:space="preserve">Packaged multi-tier application workloads with production-grade </w:t>
+      </w:r>
+      <w:proofErr w:type="spellStart"/>
+      <w:r>
+        <w:rPr>
+          <w:rFonts w:ascii="Times New Roman" w:eastAsia="Times New Roman" w:hAnsi="Times New Roman" w:cs="Times New Roman"/>
+          <w:bCs/>
+          <w:sz w:val="20"/>
+          <w:szCs w:val="20"/>
+        </w:rPr>
+        <w:t>Dockerfiles</w:t>
+      </w:r>
+      <w:proofErr w:type="spellEnd"/>
+      <w:r>
+        <w:rPr>
+          <w:rFonts w:ascii="Times New Roman" w:eastAsia="Times New Roman" w:hAnsi="Times New Roman" w:cs="Times New Roman"/>
+          <w:bCs/>
+          <w:sz w:val="20"/>
+          <w:szCs w:val="20"/>
+        </w:rPr>
+        <w:t>, optimizing image layers, persistent volumes, and non-root security.</w:t>
+      </w:r>
+    </w:p>
+    <w:p>
+      <w:pPr>
+        <w:pStyle w:val="ListParagraph"/>
+        <w:numPr>
+          <w:ilvl w:val="0"/>
+          <w:numId w:val="13"/>
+        </w:numPr>
         <w:spacing w:before="100" w:beforeAutospacing="1" w:after="100" w:afterAutospacing="1" w:line="240" w:lineRule="auto"/>
         <w:outlineLvl w:val="2"/>
         <w:rPr>
           <w:rFonts w:ascii="Times New Roman" w:eastAsia="Times New Roman" w:hAnsi="Times New Roman" w:cs="Times New Roman"/>
-          <w:b/>
-          <w:bCs/>
-          <w:sz w:val="24"/>
-          <w:szCs w:val="24"/>
-        </w:rPr>
-      </w:pPr>
-      <w:r>
-        <w:rPr>
-          <w:rFonts w:ascii="Times New Roman" w:eastAsia="Times New Roman" w:hAnsi="Times New Roman" w:cs="Times New Roman"/>
-          <w:b/>
-          <w:bCs/>
-          <w:sz w:val="24"/>
-          <w:szCs w:val="24"/>
-        </w:rPr>
-        <w:t>Docker Infrastructure &amp; Containerization Lab</w:t>
-      </w:r>
-    </w:p>
-    <w:p>
-      <w:pPr>
-        <w:spacing w:before="100" w:beforeAutospacing="1" w:after="100" w:afterAutospacing="1" w:line="240" w:lineRule="auto"/>
-        <w:rPr>
-          <w:rFonts w:ascii="Times New Roman" w:eastAsia="Times New Roman" w:hAnsi="Times New Roman" w:cs="Times New Roman"/>
-          <w:sz w:val="20"/>
-          <w:szCs w:val="20"/>
-        </w:rPr>
-      </w:pPr>
-      <w:r>
-        <w:rPr>
-          <w:rFonts w:ascii="Times New Roman" w:eastAsia="Times New Roman" w:hAnsi="Times New Roman" w:cs="Times New Roman"/>
-          <w:b/>
-          <w:bCs/>
-          <w:sz w:val="20"/>
-          <w:szCs w:val="20"/>
-        </w:rPr>
-        <w:t>Docker | Linux | Networking | Volumes | Environment Variables</w:t>
-      </w:r>
-    </w:p>
-    <w:p>
-      <w:pPr>
+          <w:bCs/>
+          <w:sz w:val="20"/>
+          <w:szCs w:val="20"/>
+        </w:rPr>
+      </w:pPr>
+      <w:r>
+        <w:rPr>
+          <w:rFonts w:ascii="Times New Roman" w:eastAsia="Times New Roman" w:hAnsi="Times New Roman" w:cs="Times New Roman"/>
+          <w:bCs/>
+          <w:sz w:val="20"/>
+          <w:szCs w:val="20"/>
+        </w:rPr>
+        <w:t xml:space="preserve">Deployed containerized </w:t>
+      </w:r>
+      <w:proofErr w:type="spellStart"/>
+      <w:r>
+        <w:rPr>
+          <w:rFonts w:ascii="Times New Roman" w:eastAsia="Times New Roman" w:hAnsi="Times New Roman" w:cs="Times New Roman"/>
+          <w:bCs/>
+          <w:sz w:val="20"/>
+          <w:szCs w:val="20"/>
+        </w:rPr>
+        <w:t>microservices</w:t>
+      </w:r>
+      <w:proofErr w:type="spellEnd"/>
+      <w:r>
+        <w:rPr>
+          <w:rFonts w:ascii="Times New Roman" w:eastAsia="Times New Roman" w:hAnsi="Times New Roman" w:cs="Times New Roman"/>
+          <w:bCs/>
+          <w:sz w:val="20"/>
+          <w:szCs w:val="20"/>
+        </w:rPr>
+        <w:t xml:space="preserve"> to a local Kubernetes cluster, defining declarative manifests for Deployments, </w:t>
+      </w:r>
+      <w:proofErr w:type="spellStart"/>
+      <w:r>
+        <w:rPr>
+          <w:rFonts w:ascii="Times New Roman" w:eastAsia="Times New Roman" w:hAnsi="Times New Roman" w:cs="Times New Roman"/>
+          <w:bCs/>
+          <w:sz w:val="20"/>
+          <w:szCs w:val="20"/>
+        </w:rPr>
+        <w:t>ClusterIP</w:t>
+      </w:r>
+      <w:proofErr w:type="spellEnd"/>
+      <w:r>
+        <w:rPr>
+          <w:rFonts w:ascii="Times New Roman" w:eastAsia="Times New Roman" w:hAnsi="Times New Roman" w:cs="Times New Roman"/>
+          <w:bCs/>
+          <w:sz w:val="20"/>
+          <w:szCs w:val="20"/>
+        </w:rPr>
+        <w:t>/</w:t>
+      </w:r>
+      <w:proofErr w:type="spellStart"/>
+      <w:r>
+        <w:rPr>
+          <w:rFonts w:ascii="Times New Roman" w:eastAsia="Times New Roman" w:hAnsi="Times New Roman" w:cs="Times New Roman"/>
+          <w:bCs/>
+          <w:sz w:val="20"/>
+          <w:szCs w:val="20"/>
+        </w:rPr>
+        <w:t>NodePort</w:t>
+      </w:r>
+      <w:proofErr w:type="spellEnd"/>
+      <w:r>
+        <w:rPr>
+          <w:rFonts w:ascii="Times New Roman" w:eastAsia="Times New Roman" w:hAnsi="Times New Roman" w:cs="Times New Roman"/>
+          <w:bCs/>
+          <w:sz w:val="20"/>
+          <w:szCs w:val="20"/>
+        </w:rPr>
+        <w:t xml:space="preserve"> Services, </w:t>
+      </w:r>
+      <w:proofErr w:type="spellStart"/>
+      <w:r>
+        <w:rPr>
+          <w:rFonts w:ascii="Times New Roman" w:eastAsia="Times New Roman" w:hAnsi="Times New Roman" w:cs="Times New Roman"/>
+          <w:bCs/>
+          <w:sz w:val="20"/>
+          <w:szCs w:val="20"/>
+        </w:rPr>
+        <w:t>ConfigMaps</w:t>
+      </w:r>
+      <w:proofErr w:type="spellEnd"/>
+      <w:r>
+        <w:rPr>
+          <w:rFonts w:ascii="Times New Roman" w:eastAsia="Times New Roman" w:hAnsi="Times New Roman" w:cs="Times New Roman"/>
+          <w:bCs/>
+          <w:sz w:val="20"/>
+          <w:szCs w:val="20"/>
+        </w:rPr>
+        <w:t>, and Secrets.</w:t>
+      </w:r>
+    </w:p>
+    <w:p>
+      <w:pPr>
+        <w:pStyle w:val="ListParagraph"/>
         <w:numPr>
           <w:ilvl w:val="0"/>
-          <w:numId w:val="6"/>
+          <w:numId w:val="13"/>
         </w:numPr>
         <w:spacing w:before="100" w:beforeAutospacing="1" w:after="100" w:afterAutospacing="1" w:line="240" w:lineRule="auto"/>
-        <w:rPr>
-          <w:rFonts w:ascii="Times New Roman" w:eastAsia="Times New Roman" w:hAnsi="Times New Roman" w:cs="Times New Roman"/>
-          <w:sz w:val="20"/>
-          <w:szCs w:val="20"/>
-        </w:rPr>
-      </w:pPr>
-      <w:r>
-        <w:rPr>
-          <w:rFonts w:ascii="Times New Roman" w:eastAsia="Times New Roman" w:hAnsi="Times New Roman" w:cs="Times New Roman"/>
-          <w:sz w:val="20"/>
-          <w:szCs w:val="20"/>
-        </w:rPr>
-        <w:t xml:space="preserve">Practiced Docker container lifecycle management including image, container, start/stop/restart, removal, and troubleshooting. </w:t>
-      </w:r>
-    </w:p>
-    <w:p>
-      <w:pPr>
+        <w:outlineLvl w:val="2"/>
+        <w:rPr>
+          <w:rFonts w:ascii="Times New Roman" w:eastAsia="Times New Roman" w:hAnsi="Times New Roman" w:cs="Times New Roman"/>
+          <w:bCs/>
+          <w:sz w:val="20"/>
+          <w:szCs w:val="20"/>
+        </w:rPr>
+      </w:pPr>
+      <w:r>
+        <w:rPr>
+          <w:rFonts w:ascii="Times New Roman" w:eastAsia="Times New Roman" w:hAnsi="Times New Roman" w:cs="Times New Roman"/>
+          <w:bCs/>
+          <w:sz w:val="20"/>
+          <w:szCs w:val="20"/>
+        </w:rPr>
+        <w:t xml:space="preserve">Verified service discovery, pod auto-recovery, persistent storage mapping, and inter-service communication across </w:t>
+      </w:r>
+      <w:proofErr w:type="spellStart"/>
+      <w:r>
+        <w:rPr>
+          <w:rFonts w:ascii="Times New Roman" w:eastAsia="Times New Roman" w:hAnsi="Times New Roman" w:cs="Times New Roman"/>
+          <w:bCs/>
+          <w:sz w:val="20"/>
+          <w:szCs w:val="20"/>
+        </w:rPr>
+        <w:t>microservice</w:t>
+      </w:r>
+      <w:proofErr w:type="spellEnd"/>
+      <w:r>
+        <w:rPr>
+          <w:rFonts w:ascii="Times New Roman" w:eastAsia="Times New Roman" w:hAnsi="Times New Roman" w:cs="Times New Roman"/>
+          <w:bCs/>
+          <w:sz w:val="20"/>
+          <w:szCs w:val="20"/>
+        </w:rPr>
+        <w:t xml:space="preserve"> tiers.</w:t>
+      </w:r>
+    </w:p>
+    <w:p>
+      <w:pPr>
+        <w:spacing w:before="100" w:beforeAutospacing="1" w:after="100" w:afterAutospacing="1" w:line="240" w:lineRule="auto"/>
+        <w:outlineLvl w:val="2"/>
+        <w:rPr>
+          <w:rFonts w:ascii="Times New Roman" w:eastAsia="Times New Roman" w:hAnsi="Times New Roman" w:cs="Times New Roman"/>
+          <w:b/>
+          <w:bCs/>
+          <w:sz w:val="24"/>
+          <w:szCs w:val="24"/>
+        </w:rPr>
+      </w:pPr>
+      <w:r>
+        <w:rPr>
+          <w:rFonts w:ascii="Times New Roman" w:eastAsia="Times New Roman" w:hAnsi="Times New Roman" w:cs="Times New Roman"/>
+          <w:b/>
+          <w:bCs/>
+          <w:sz w:val="24"/>
+          <w:szCs w:val="24"/>
+        </w:rPr>
+        <w:t>Linux Server Health Check Automation</w:t>
+      </w:r>
+    </w:p>
+    <w:p>
+      <w:pPr>
+        <w:spacing w:before="100" w:beforeAutospacing="1" w:after="100" w:afterAutospacing="1" w:line="240" w:lineRule="auto"/>
+        <w:rPr>
+          <w:rFonts w:ascii="Times New Roman" w:eastAsia="Times New Roman" w:hAnsi="Times New Roman" w:cs="Times New Roman"/>
+          <w:sz w:val="20"/>
+          <w:szCs w:val="20"/>
+        </w:rPr>
+      </w:pPr>
+      <w:r>
+        <w:rPr>
+          <w:rFonts w:ascii="Times New Roman" w:eastAsia="Times New Roman" w:hAnsi="Times New Roman" w:cs="Times New Roman"/>
+          <w:b/>
+          <w:bCs/>
+          <w:sz w:val="20"/>
+          <w:szCs w:val="20"/>
+        </w:rPr>
+        <w:t xml:space="preserve">Bash | Linux | </w:t>
+      </w:r>
+      <w:proofErr w:type="spellStart"/>
+      <w:r>
+        <w:rPr>
+          <w:rFonts w:ascii="Times New Roman" w:eastAsia="Times New Roman" w:hAnsi="Times New Roman" w:cs="Times New Roman"/>
+          <w:b/>
+          <w:bCs/>
+          <w:sz w:val="20"/>
+          <w:szCs w:val="20"/>
+        </w:rPr>
+        <w:t>Cron</w:t>
+      </w:r>
+      <w:proofErr w:type="spellEnd"/>
+      <w:r>
+        <w:rPr>
+          <w:rFonts w:ascii="Times New Roman" w:eastAsia="Times New Roman" w:hAnsi="Times New Roman" w:cs="Times New Roman"/>
+          <w:b/>
+          <w:bCs/>
+          <w:sz w:val="20"/>
+          <w:szCs w:val="20"/>
+        </w:rPr>
+        <w:t xml:space="preserve"> | System Monitoring | Automation</w:t>
+      </w:r>
+    </w:p>
+    <w:p>
+      <w:pPr>
+        <w:pStyle w:val="ListParagraph"/>
         <w:numPr>
           <w:ilvl w:val="0"/>
-          <w:numId w:val="6"/>
+          <w:numId w:val="14"/>
         </w:numPr>
-        <w:spacing w:before="100" w:beforeAutospacing="1" w:after="100" w:afterAutospacing="1" w:line="240" w:lineRule="auto"/>
-        <w:rPr>
-          <w:rFonts w:ascii="Times New Roman" w:eastAsia="Times New Roman" w:hAnsi="Times New Roman" w:cs="Times New Roman"/>
-          <w:sz w:val="20"/>
-          <w:szCs w:val="20"/>
-        </w:rPr>
-      </w:pPr>
-      <w:r>
-        <w:rPr>
-          <w:rFonts w:ascii="Times New Roman" w:eastAsia="Times New Roman" w:hAnsi="Times New Roman" w:cs="Times New Roman"/>
-          <w:sz w:val="20"/>
-          <w:szCs w:val="20"/>
-        </w:rPr>
-        <w:t xml:space="preserve">Implemented </w:t>
-      </w:r>
-      <w:r>
-        <w:rPr>
-          <w:rFonts w:ascii="Times New Roman" w:eastAsia="Times New Roman" w:hAnsi="Times New Roman" w:cs="Times New Roman"/>
-          <w:b/>
-          <w:bCs/>
-          <w:sz w:val="20"/>
-          <w:szCs w:val="20"/>
-        </w:rPr>
-        <w:t>custom bridge networks and Docker DNS/service discovery</w:t>
-      </w:r>
-      <w:r>
-        <w:rPr>
-          <w:rFonts w:ascii="Times New Roman" w:eastAsia="Times New Roman" w:hAnsi="Times New Roman" w:cs="Times New Roman"/>
-          <w:sz w:val="20"/>
-          <w:szCs w:val="20"/>
-        </w:rPr>
-        <w:t xml:space="preserve"> for container-to-container communication. </w:t>
-      </w:r>
-    </w:p>
-    <w:p>
-      <w:pPr>
+        <w:spacing w:after="0" w:line="240" w:lineRule="auto"/>
+        <w:rPr>
+          <w:rFonts w:ascii="Times New Roman" w:eastAsia="Times New Roman" w:hAnsi="Times New Roman" w:cs="Times New Roman"/>
+          <w:sz w:val="20"/>
+          <w:szCs w:val="20"/>
+        </w:rPr>
+      </w:pPr>
+      <w:r>
+        <w:rPr>
+          <w:rFonts w:ascii="Times New Roman" w:eastAsia="Times New Roman" w:hAnsi="Times New Roman" w:cs="Times New Roman"/>
+          <w:sz w:val="20"/>
+          <w:szCs w:val="20"/>
+        </w:rPr>
+        <w:t xml:space="preserve">Developed a modular, Bash-based health check automation scheduled via </w:t>
+      </w:r>
+      <w:proofErr w:type="spellStart"/>
+      <w:r>
+        <w:rPr>
+          <w:rFonts w:ascii="Times New Roman" w:eastAsia="Times New Roman" w:hAnsi="Times New Roman" w:cs="Times New Roman"/>
+          <w:sz w:val="20"/>
+          <w:szCs w:val="20"/>
+        </w:rPr>
+        <w:t>Cron</w:t>
+      </w:r>
+      <w:proofErr w:type="spellEnd"/>
+      <w:r>
+        <w:rPr>
+          <w:rFonts w:ascii="Times New Roman" w:eastAsia="Times New Roman" w:hAnsi="Times New Roman" w:cs="Times New Roman"/>
+          <w:sz w:val="20"/>
+          <w:szCs w:val="20"/>
+        </w:rPr>
+        <w:t xml:space="preserve"> to continuously monitor server metrics (disk, memory) and core services (SSH, </w:t>
+      </w:r>
+      <w:proofErr w:type="spellStart"/>
+      <w:r>
+        <w:rPr>
+          <w:rFonts w:ascii="Times New Roman" w:eastAsia="Times New Roman" w:hAnsi="Times New Roman" w:cs="Times New Roman"/>
+          <w:sz w:val="20"/>
+          <w:szCs w:val="20"/>
+        </w:rPr>
+        <w:t>Cron</w:t>
+      </w:r>
+      <w:proofErr w:type="spellEnd"/>
+      <w:r>
+        <w:rPr>
+          <w:rFonts w:ascii="Times New Roman" w:eastAsia="Times New Roman" w:hAnsi="Times New Roman" w:cs="Times New Roman"/>
+          <w:sz w:val="20"/>
+          <w:szCs w:val="20"/>
+        </w:rPr>
+        <w:t xml:space="preserve">, Docker).  </w:t>
+      </w:r>
+    </w:p>
+    <w:p>
+      <w:pPr>
+        <w:pStyle w:val="ListParagraph"/>
         <w:numPr>
           <w:ilvl w:val="0"/>
-          <w:numId w:val="6"/>
+          <w:numId w:val="14"/>
         </w:numPr>
-        <w:spacing w:before="100" w:beforeAutospacing="1" w:after="100" w:afterAutospacing="1" w:line="240" w:lineRule="auto"/>
-        <w:rPr>
-          <w:rFonts w:ascii="Times New Roman" w:eastAsia="Times New Roman" w:hAnsi="Times New Roman" w:cs="Times New Roman"/>
-          <w:sz w:val="20"/>
-          <w:szCs w:val="20"/>
-        </w:rPr>
-      </w:pPr>
-      <w:r>
-        <w:rPr>
-          <w:rFonts w:ascii="Times New Roman" w:eastAsia="Times New Roman" w:hAnsi="Times New Roman" w:cs="Times New Roman"/>
-          <w:sz w:val="20"/>
-          <w:szCs w:val="20"/>
-        </w:rPr>
-        <w:t xml:space="preserve">Practiced environment-based application configuration using Docker environment variables. </w:t>
-      </w:r>
-    </w:p>
-    <w:p>
-      <w:pPr>
+        <w:spacing w:after="0" w:line="240" w:lineRule="auto"/>
+        <w:rPr>
+          <w:rFonts w:ascii="Times New Roman" w:eastAsia="Times New Roman" w:hAnsi="Times New Roman" w:cs="Times New Roman"/>
+          <w:sz w:val="20"/>
+          <w:szCs w:val="20"/>
+        </w:rPr>
+      </w:pPr>
+      <w:r>
+        <w:rPr>
+          <w:rFonts w:ascii="Times New Roman" w:eastAsia="Times New Roman" w:hAnsi="Times New Roman" w:cs="Times New Roman"/>
+          <w:sz w:val="20"/>
+          <w:szCs w:val="20"/>
+        </w:rPr>
+        <w:t xml:space="preserve">Designed an aggregated validation engine using standard exit codes (0 for healthy, 1 for unhealthy) to enable seamless integration with upstream monitoring systems.  </w:t>
+      </w:r>
+    </w:p>
+    <w:p>
+      <w:pPr>
+        <w:pStyle w:val="ListParagraph"/>
         <w:numPr>
           <w:ilvl w:val="0"/>
-          <w:numId w:val="6"/>
+          <w:numId w:val="14"/>
         </w:numPr>
-        <w:spacing w:before="100" w:beforeAutospacing="1" w:after="100" w:afterAutospacing="1" w:line="240" w:lineRule="auto"/>
-        <w:rPr>
-          <w:rFonts w:ascii="Times New Roman" w:eastAsia="Times New Roman" w:hAnsi="Times New Roman" w:cs="Times New Roman"/>
-          <w:sz w:val="20"/>
-          <w:szCs w:val="20"/>
-        </w:rPr>
-      </w:pPr>
-      <w:r>
-        <w:rPr>
-          <w:rFonts w:ascii="Times New Roman" w:eastAsia="Times New Roman" w:hAnsi="Times New Roman" w:cs="Times New Roman"/>
-          <w:sz w:val="20"/>
-          <w:szCs w:val="20"/>
-        </w:rPr>
-        <w:t xml:space="preserve">Implemented Docker </w:t>
-      </w:r>
-      <w:r>
-        <w:rPr>
-          <w:rFonts w:ascii="Times New Roman" w:eastAsia="Times New Roman" w:hAnsi="Times New Roman" w:cs="Times New Roman"/>
-          <w:b/>
-          <w:bCs/>
-          <w:sz w:val="20"/>
-          <w:szCs w:val="20"/>
-        </w:rPr>
-        <w:t>named volumes</w:t>
-      </w:r>
-      <w:r>
-        <w:rPr>
-          <w:rFonts w:ascii="Times New Roman" w:eastAsia="Times New Roman" w:hAnsi="Times New Roman" w:cs="Times New Roman"/>
-          <w:sz w:val="20"/>
-          <w:szCs w:val="20"/>
-        </w:rPr>
-        <w:t xml:space="preserve"> for persistent container storage and tested data persistence across container recreation. </w:t>
-      </w:r>
-    </w:p>
-    <w:p>
-      <w:pPr>
-        <w:numPr>
-          <w:ilvl w:val="0"/>
-          <w:numId w:val="6"/>
-        </w:numPr>
-        <w:spacing w:before="100" w:beforeAutospacing="1" w:after="100" w:afterAutospacing="1" w:line="240" w:lineRule="auto"/>
-        <w:rPr>
-          <w:rFonts w:ascii="Times New Roman" w:eastAsia="Times New Roman" w:hAnsi="Times New Roman" w:cs="Times New Roman"/>
-          <w:sz w:val="20"/>
-          <w:szCs w:val="20"/>
-        </w:rPr>
-      </w:pPr>
-      <w:r>
-        <w:rPr>
-          <w:rFonts w:ascii="Times New Roman" w:eastAsia="Times New Roman" w:hAnsi="Times New Roman" w:cs="Times New Roman"/>
-          <w:sz w:val="20"/>
-          <w:szCs w:val="20"/>
-        </w:rPr>
-        <w:t xml:space="preserve">Investigated container failures using </w:t>
-      </w:r>
-      <w:proofErr w:type="spellStart"/>
-      <w:r>
-        <w:rPr>
-          <w:rFonts w:ascii="Courier New" w:eastAsia="Times New Roman" w:hAnsi="Courier New" w:cs="Courier New"/>
-          <w:sz w:val="20"/>
-          <w:szCs w:val="20"/>
-        </w:rPr>
-        <w:t>docker</w:t>
-      </w:r>
-      <w:proofErr w:type="spellEnd"/>
-      <w:r>
-        <w:rPr>
-          <w:rFonts w:ascii="Courier New" w:eastAsia="Times New Roman" w:hAnsi="Courier New" w:cs="Courier New"/>
-          <w:sz w:val="20"/>
-          <w:szCs w:val="20"/>
-        </w:rPr>
-        <w:t xml:space="preserve"> logs</w:t>
-      </w:r>
-      <w:r>
-        <w:rPr>
-          <w:rFonts w:ascii="Times New Roman" w:eastAsia="Times New Roman" w:hAnsi="Times New Roman" w:cs="Times New Roman"/>
-          <w:sz w:val="20"/>
-          <w:szCs w:val="20"/>
-        </w:rPr>
-        <w:t xml:space="preserve">, </w:t>
-      </w:r>
-      <w:proofErr w:type="spellStart"/>
-      <w:r>
-        <w:rPr>
-          <w:rFonts w:ascii="Courier New" w:eastAsia="Times New Roman" w:hAnsi="Courier New" w:cs="Courier New"/>
-          <w:sz w:val="20"/>
-          <w:szCs w:val="20"/>
-        </w:rPr>
-        <w:t>docker</w:t>
-      </w:r>
-      <w:proofErr w:type="spellEnd"/>
-      <w:r>
-        <w:rPr>
-          <w:rFonts w:ascii="Courier New" w:eastAsia="Times New Roman" w:hAnsi="Courier New" w:cs="Courier New"/>
-          <w:sz w:val="20"/>
-          <w:szCs w:val="20"/>
-        </w:rPr>
-        <w:t xml:space="preserve"> inspect</w:t>
-      </w:r>
-      <w:r>
-        <w:rPr>
-          <w:rFonts w:ascii="Times New Roman" w:eastAsia="Times New Roman" w:hAnsi="Times New Roman" w:cs="Times New Roman"/>
-          <w:sz w:val="20"/>
-          <w:szCs w:val="20"/>
-        </w:rPr>
-        <w:t xml:space="preserve">, </w:t>
-      </w:r>
-      <w:proofErr w:type="spellStart"/>
-      <w:r>
-        <w:rPr>
-          <w:rFonts w:ascii="Courier New" w:eastAsia="Times New Roman" w:hAnsi="Courier New" w:cs="Courier New"/>
-          <w:sz w:val="20"/>
-          <w:szCs w:val="20"/>
-        </w:rPr>
-        <w:t>docker</w:t>
-      </w:r>
-      <w:proofErr w:type="spellEnd"/>
-      <w:r>
-        <w:rPr>
-          <w:rFonts w:ascii="Courier New" w:eastAsia="Times New Roman" w:hAnsi="Courier New" w:cs="Courier New"/>
-          <w:sz w:val="20"/>
-          <w:szCs w:val="20"/>
-        </w:rPr>
-        <w:t xml:space="preserve"> exec</w:t>
-      </w:r>
-      <w:r>
-        <w:rPr>
-          <w:rFonts w:ascii="Times New Roman" w:eastAsia="Times New Roman" w:hAnsi="Times New Roman" w:cs="Times New Roman"/>
-          <w:sz w:val="20"/>
-          <w:szCs w:val="20"/>
-        </w:rPr>
-        <w:t xml:space="preserve">, </w:t>
-      </w:r>
-      <w:proofErr w:type="spellStart"/>
-      <w:r>
-        <w:rPr>
-          <w:rFonts w:ascii="Courier New" w:eastAsia="Times New Roman" w:hAnsi="Courier New" w:cs="Courier New"/>
-          <w:sz w:val="20"/>
-          <w:szCs w:val="20"/>
-        </w:rPr>
-        <w:t>docker</w:t>
-      </w:r>
-      <w:proofErr w:type="spellEnd"/>
-      <w:r>
-        <w:rPr>
-          <w:rFonts w:ascii="Courier New" w:eastAsia="Times New Roman" w:hAnsi="Courier New" w:cs="Courier New"/>
-          <w:sz w:val="20"/>
-          <w:szCs w:val="20"/>
-        </w:rPr>
-        <w:t xml:space="preserve"> stats</w:t>
-      </w:r>
-      <w:r>
-        <w:rPr>
-          <w:rFonts w:ascii="Times New Roman" w:eastAsia="Times New Roman" w:hAnsi="Times New Roman" w:cs="Times New Roman"/>
-          <w:sz w:val="20"/>
-          <w:szCs w:val="20"/>
-        </w:rPr>
-        <w:t xml:space="preserve">, and </w:t>
-      </w:r>
-      <w:proofErr w:type="spellStart"/>
-      <w:r>
-        <w:rPr>
-          <w:rFonts w:ascii="Courier New" w:eastAsia="Times New Roman" w:hAnsi="Courier New" w:cs="Courier New"/>
-          <w:sz w:val="20"/>
-          <w:szCs w:val="20"/>
-        </w:rPr>
-        <w:t>docker</w:t>
-      </w:r>
-      <w:proofErr w:type="spellEnd"/>
-      <w:r>
-        <w:rPr>
-          <w:rFonts w:ascii="Courier New" w:eastAsia="Times New Roman" w:hAnsi="Courier New" w:cs="Courier New"/>
-          <w:sz w:val="20"/>
-          <w:szCs w:val="20"/>
-        </w:rPr>
-        <w:t xml:space="preserve"> top</w:t>
-      </w:r>
-      <w:r>
-        <w:rPr>
-          <w:rFonts w:ascii="Times New Roman" w:eastAsia="Times New Roman" w:hAnsi="Times New Roman" w:cs="Times New Roman"/>
-          <w:sz w:val="20"/>
-          <w:szCs w:val="20"/>
-        </w:rPr>
-        <w:t xml:space="preserve">. </w:t>
-      </w:r>
-    </w:p>
-    <w:p>
-      <w:pPr>
-        <w:numPr>
-          <w:ilvl w:val="0"/>
-          <w:numId w:val="6"/>
-        </w:numPr>
-        <w:spacing w:before="100" w:beforeAutospacing="1" w:after="100" w:afterAutospacing="1" w:line="240" w:lineRule="auto"/>
-        <w:rPr>
-          <w:rFonts w:ascii="Times New Roman" w:eastAsia="Times New Roman" w:hAnsi="Times New Roman" w:cs="Times New Roman"/>
-          <w:sz w:val="20"/>
-          <w:szCs w:val="20"/>
-        </w:rPr>
-      </w:pPr>
-      <w:r>
-        <w:rPr>
-          <w:rFonts w:ascii="Times New Roman" w:eastAsia="Times New Roman" w:hAnsi="Times New Roman" w:cs="Times New Roman"/>
-          <w:sz w:val="20"/>
-          <w:szCs w:val="20"/>
-        </w:rPr>
-        <w:t xml:space="preserve">Practiced container networking, resource monitoring, persistent storage, and production-oriented troubleshooting scenarios. </w:t>
-      </w:r>
-    </w:p>
-    <w:p>
-      <w:pPr>
         <w:spacing w:after="0" w:line="240" w:lineRule="auto"/>
         <w:rPr>
           <w:rFonts w:ascii="Times New Roman" w:eastAsia="Times New Roman" w:hAnsi="Times New Roman" w:cs="Times New Roman"/>
@@ -2721,10 +2766,27 @@
       <w:r>
         <w:rPr>
           <w:rFonts w:ascii="Times New Roman" w:eastAsia="Times New Roman" w:hAnsi="Times New Roman" w:cs="Times New Roman"/>
-          <w:sz w:val="24"/>
-          <w:szCs w:val="24"/>
-        </w:rPr>
-        <w:lastRenderedPageBreak/>
+          <w:sz w:val="20"/>
+          <w:szCs w:val="20"/>
+        </w:rPr>
+        <w:t>Implemented structured system logging capturing ISO timestamps, hostnames, severity levels, and holistic operational status for efficient triage and auditing.</w:t>
+      </w:r>
+    </w:p>
+    <w:p>
+      <w:pPr>
+        <w:spacing w:after="0" w:line="240" w:lineRule="auto"/>
+        <w:rPr>
+          <w:rFonts w:ascii="Times New Roman" w:eastAsia="Times New Roman" w:hAnsi="Times New Roman" w:cs="Times New Roman"/>
+          <w:sz w:val="24"/>
+          <w:szCs w:val="24"/>
+        </w:rPr>
+      </w:pPr>
+      <w:r>
+        <w:rPr>
+          <w:rFonts w:ascii="Times New Roman" w:eastAsia="Times New Roman" w:hAnsi="Times New Roman" w:cs="Times New Roman"/>
+          <w:sz w:val="24"/>
+          <w:szCs w:val="24"/>
+        </w:rPr>
         <w:pict>
           <v:rect id="_x0000_i1032" style="width:0;height:1.5pt" o:hralign="center" o:hrstd="t" o:hr="t" fillcolor="#a0a0a0" stroked="f"/>
         </w:pict>
@@ -2732,23 +2794,18 @@
     </w:p>
     <w:p>
       <w:pPr>
-        <w:spacing w:before="100" w:beforeAutospacing="1" w:after="100" w:afterAutospacing="1" w:line="240" w:lineRule="auto"/>
-        <w:outlineLvl w:val="0"/>
-        <w:rPr>
-          <w:rFonts w:ascii="Times New Roman" w:eastAsia="Times New Roman" w:hAnsi="Times New Roman" w:cs="Times New Roman"/>
-          <w:b/>
-          <w:bCs/>
-          <w:kern w:val="36"/>
-          <w:sz w:val="24"/>
-          <w:szCs w:val="24"/>
-        </w:rPr>
-      </w:pPr>
-      <w:r>
-        <w:rPr>
-          <w:rFonts w:ascii="Times New Roman" w:eastAsia="Times New Roman" w:hAnsi="Times New Roman" w:cs="Times New Roman"/>
-          <w:b/>
-          <w:bCs/>
-          <w:kern w:val="36"/>
+        <w:spacing w:after="0" w:line="240" w:lineRule="auto"/>
+        <w:rPr>
+          <w:rFonts w:ascii="Times New Roman" w:eastAsia="Times New Roman" w:hAnsi="Times New Roman" w:cs="Times New Roman"/>
+          <w:b/>
+          <w:sz w:val="24"/>
+          <w:szCs w:val="24"/>
+        </w:rPr>
+      </w:pPr>
+      <w:r>
+        <w:rPr>
+          <w:rFonts w:ascii="Times New Roman" w:eastAsia="Times New Roman" w:hAnsi="Times New Roman" w:cs="Times New Roman"/>
+          <w:b/>
           <w:sz w:val="24"/>
           <w:szCs w:val="24"/>
         </w:rPr>
@@ -2757,37 +2814,27 @@
     </w:p>
     <w:p>
       <w:pPr>
-        <w:spacing w:before="100" w:beforeAutospacing="1" w:after="100" w:afterAutospacing="1" w:line="240" w:lineRule="auto"/>
-        <w:rPr>
-          <w:rFonts w:ascii="Times New Roman" w:eastAsia="Times New Roman" w:hAnsi="Times New Roman" w:cs="Times New Roman"/>
-          <w:sz w:val="20"/>
-          <w:szCs w:val="20"/>
-        </w:rPr>
-      </w:pPr>
-      <w:r>
-        <w:rPr>
-          <w:rFonts w:ascii="Times New Roman" w:eastAsia="Times New Roman" w:hAnsi="Times New Roman" w:cs="Times New Roman"/>
-          <w:b/>
-          <w:bCs/>
-          <w:sz w:val="20"/>
-          <w:szCs w:val="20"/>
-        </w:rPr>
-        <w:t>Bachelor of Computer Engineering</w:t>
-      </w:r>
-      <w:r>
-        <w:rPr>
-          <w:rFonts w:ascii="Times New Roman" w:eastAsia="Times New Roman" w:hAnsi="Times New Roman" w:cs="Times New Roman"/>
-          <w:sz w:val="20"/>
-          <w:szCs w:val="20"/>
-        </w:rPr>
-        <w:br/>
+        <w:spacing w:after="0" w:line="240" w:lineRule="auto"/>
+        <w:rPr>
+          <w:rFonts w:ascii="Times New Roman" w:eastAsia="Times New Roman" w:hAnsi="Times New Roman" w:cs="Times New Roman"/>
+          <w:sz w:val="24"/>
+          <w:szCs w:val="24"/>
+        </w:rPr>
+      </w:pPr>
+      <w:r>
+        <w:rPr>
+          <w:rFonts w:ascii="Times New Roman" w:eastAsia="Times New Roman" w:hAnsi="Times New Roman" w:cs="Times New Roman"/>
+          <w:sz w:val="24"/>
+          <w:szCs w:val="24"/>
+        </w:rPr>
+        <w:t xml:space="preserve">Bachelor of Computer Engineering | </w:t>
       </w:r>
       <w:proofErr w:type="spellStart"/>
       <w:r>
         <w:rPr>
           <w:rFonts w:ascii="Times New Roman" w:eastAsia="Times New Roman" w:hAnsi="Times New Roman" w:cs="Times New Roman"/>
-          <w:sz w:val="20"/>
-          <w:szCs w:val="20"/>
+          <w:sz w:val="24"/>
+          <w:szCs w:val="24"/>
         </w:rPr>
         <w:t>Andalas</w:t>
       </w:r>
@@ -2795,38 +2842,20 @@
       <w:r>
         <w:rPr>
           <w:rFonts w:ascii="Times New Roman" w:eastAsia="Times New Roman" w:hAnsi="Times New Roman" w:cs="Times New Roman"/>
-          <w:sz w:val="20"/>
-          <w:szCs w:val="20"/>
-        </w:rPr>
-        <w:t xml:space="preserve"> University</w:t>
-      </w:r>
-      <w:r>
-        <w:rPr>
-          <w:rFonts w:ascii="Times New Roman" w:eastAsia="Times New Roman" w:hAnsi="Times New Roman" w:cs="Times New Roman"/>
-          <w:sz w:val="20"/>
-          <w:szCs w:val="20"/>
-        </w:rPr>
-        <w:br/>
-        <w:t xml:space="preserve">GPA: </w:t>
-      </w:r>
-      <w:r>
-        <w:rPr>
-          <w:rFonts w:ascii="Times New Roman" w:eastAsia="Times New Roman" w:hAnsi="Times New Roman" w:cs="Times New Roman"/>
-          <w:b/>
-          <w:bCs/>
-          <w:sz w:val="20"/>
-          <w:szCs w:val="20"/>
-        </w:rPr>
-        <w:t>3.15 / 4.00</w:t>
-      </w:r>
-      <w:r>
-        <w:rPr>
-          <w:rFonts w:ascii="Times New Roman" w:eastAsia="Times New Roman" w:hAnsi="Times New Roman" w:cs="Times New Roman"/>
-          <w:sz w:val="20"/>
-          <w:szCs w:val="20"/>
-        </w:rPr>
-        <w:br/>
-        <w:t>Graduated: 2017</w:t>
+          <w:sz w:val="24"/>
+          <w:szCs w:val="24"/>
+        </w:rPr>
+        <w:t xml:space="preserve"> University | GPA: 3.15 / 4.00 | Graduated: 2017</w:t>
+      </w:r>
+      <w:r>
+        <w:rPr>
+          <w:rFonts w:ascii="Times New Roman" w:eastAsia="Times New Roman" w:hAnsi="Times New Roman" w:cs="Times New Roman"/>
+          <w:sz w:val="24"/>
+          <w:szCs w:val="24"/>
+        </w:rPr>
+        <w:pict>
+          <v:rect id="_x0000_i1030" style="width:0;height:1.5pt" o:hralign="center" o:hrstd="t" o:hr="t" fillcolor="#a0a0a0" stroked="f"/>
+        </w:pict>
       </w:r>
     </w:p>
     <w:p>
@@ -2834,6 +2863,44 @@
         <w:spacing w:after="0" w:line="240" w:lineRule="auto"/>
         <w:rPr>
           <w:rFonts w:ascii="Times New Roman" w:eastAsia="Times New Roman" w:hAnsi="Times New Roman" w:cs="Times New Roman"/>
+          <w:b/>
+          <w:sz w:val="20"/>
+          <w:szCs w:val="20"/>
+        </w:rPr>
+      </w:pPr>
+      <w:r>
+        <w:rPr>
+          <w:rFonts w:ascii="Times New Roman" w:eastAsia="Times New Roman" w:hAnsi="Times New Roman" w:cs="Times New Roman"/>
+          <w:b/>
+          <w:sz w:val="20"/>
+          <w:szCs w:val="20"/>
+        </w:rPr>
+        <w:t>CERTIFICATIONS &amp; PROFESSIONAL DEVELOPMENT</w:t>
+      </w:r>
+    </w:p>
+    <w:p>
+      <w:pPr>
+        <w:spacing w:after="0" w:line="240" w:lineRule="auto"/>
+        <w:rPr>
+          <w:rFonts w:ascii="Times New Roman" w:eastAsia="Times New Roman" w:hAnsi="Times New Roman" w:cs="Times New Roman"/>
+          <w:sz w:val="20"/>
+          <w:szCs w:val="20"/>
+        </w:rPr>
+      </w:pPr>
+      <w:r>
+        <w:rPr>
+          <w:rFonts w:ascii="Times New Roman" w:eastAsia="Times New Roman" w:hAnsi="Times New Roman" w:cs="Times New Roman"/>
+          <w:sz w:val="20"/>
+          <w:szCs w:val="20"/>
+        </w:rPr>
+        <w:t>AWS Cloud Engineering (In Progress) | Linux System Administration &amp; Bash Automation | Docker &amp; Containerization | Cloud Infrastructure &amp; DevOps</w:t>
+      </w:r>
+    </w:p>
+    <w:p>
+      <w:pPr>
+        <w:spacing w:after="0" w:line="240" w:lineRule="auto"/>
+        <w:rPr>
+          <w:rFonts w:ascii="Times New Roman" w:eastAsia="Times New Roman" w:hAnsi="Times New Roman" w:cs="Times New Roman"/>
           <w:sz w:val="24"/>
           <w:szCs w:val="24"/>
         </w:rPr>
@@ -2845,246 +2912,24 @@
           <w:szCs w:val="24"/>
         </w:rPr>
         <w:pict>
-          <v:rect id="_x0000_i1033" style="width:0;height:1.5pt" o:hralign="center" o:hrstd="t" o:hr="t" fillcolor="#a0a0a0" stroked="f"/>
+          <v:rect id="_x0000_i1031" style="width:0;height:1.5pt" o:hralign="center" o:hrstd="t" o:hr="t" fillcolor="#a0a0a0" stroked="f"/>
         </w:pict>
       </w:r>
     </w:p>
     <w:p>
       <w:pPr>
-        <w:spacing w:before="100" w:beforeAutospacing="1" w:after="100" w:afterAutospacing="1" w:line="240" w:lineRule="auto"/>
-        <w:outlineLvl w:val="0"/>
-        <w:rPr>
-          <w:rFonts w:ascii="Times New Roman" w:eastAsia="Times New Roman" w:hAnsi="Times New Roman" w:cs="Times New Roman"/>
-          <w:b/>
-          <w:bCs/>
-          <w:kern w:val="36"/>
-          <w:sz w:val="24"/>
-          <w:szCs w:val="24"/>
-        </w:rPr>
-      </w:pPr>
-      <w:r>
-        <w:rPr>
-          <w:rFonts w:ascii="Times New Roman" w:eastAsia="Times New Roman" w:hAnsi="Times New Roman" w:cs="Times New Roman"/>
-          <w:b/>
-          <w:bCs/>
-          <w:kern w:val="36"/>
-          <w:sz w:val="24"/>
-          <w:szCs w:val="24"/>
-        </w:rPr>
-        <w:t>CERTIFICATIONS &amp; PROFESSIONAL DEVELOPMENT</w:t>
-      </w:r>
-    </w:p>
-    <w:p>
-      <w:pPr>
-        <w:spacing w:before="100" w:beforeAutospacing="1" w:after="100" w:afterAutospacing="1" w:line="240" w:lineRule="auto"/>
-        <w:rPr>
-          <w:rFonts w:ascii="Times New Roman" w:eastAsia="Times New Roman" w:hAnsi="Times New Roman" w:cs="Times New Roman"/>
-          <w:sz w:val="20"/>
-          <w:szCs w:val="20"/>
-        </w:rPr>
-      </w:pPr>
-      <w:r>
-        <w:rPr>
-          <w:rFonts w:ascii="Times New Roman" w:eastAsia="Times New Roman" w:hAnsi="Times New Roman" w:cs="Times New Roman"/>
-          <w:b/>
-          <w:bCs/>
-          <w:sz w:val="20"/>
-          <w:szCs w:val="20"/>
-        </w:rPr>
-        <w:t>Cloud / DevOps Learning</w:t>
-      </w:r>
-    </w:p>
-    <w:p>
-      <w:pPr>
-        <w:numPr>
-          <w:ilvl w:val="0"/>
-          <w:numId w:val="7"/>
-        </w:numPr>
-        <w:spacing w:before="100" w:beforeAutospacing="1" w:after="100" w:afterAutospacing="1" w:line="240" w:lineRule="auto"/>
-        <w:rPr>
-          <w:rFonts w:ascii="Times New Roman" w:eastAsia="Times New Roman" w:hAnsi="Times New Roman" w:cs="Times New Roman"/>
-          <w:sz w:val="20"/>
-          <w:szCs w:val="20"/>
-        </w:rPr>
-      </w:pPr>
-      <w:r>
-        <w:rPr>
-          <w:rFonts w:ascii="Times New Roman" w:eastAsia="Times New Roman" w:hAnsi="Times New Roman" w:cs="Times New Roman"/>
-          <w:sz w:val="20"/>
-          <w:szCs w:val="20"/>
-        </w:rPr>
-        <w:t xml:space="preserve">AWS Cloud Engineering Roadmap — In Progress </w:t>
-      </w:r>
-    </w:p>
-    <w:p>
-      <w:pPr>
-        <w:numPr>
-          <w:ilvl w:val="0"/>
-          <w:numId w:val="7"/>
-        </w:numPr>
-        <w:spacing w:before="100" w:beforeAutospacing="1" w:after="100" w:afterAutospacing="1" w:line="240" w:lineRule="auto"/>
-        <w:rPr>
-          <w:rFonts w:ascii="Times New Roman" w:eastAsia="Times New Roman" w:hAnsi="Times New Roman" w:cs="Times New Roman"/>
-          <w:sz w:val="20"/>
-          <w:szCs w:val="20"/>
-        </w:rPr>
-      </w:pPr>
-      <w:r>
-        <w:rPr>
-          <w:rFonts w:ascii="Times New Roman" w:eastAsia="Times New Roman" w:hAnsi="Times New Roman" w:cs="Times New Roman"/>
-          <w:sz w:val="20"/>
-          <w:szCs w:val="20"/>
-        </w:rPr>
-        <w:t xml:space="preserve">Linux &amp; System Administration — Hands-on </w:t>
-      </w:r>
-    </w:p>
-    <w:p>
-      <w:pPr>
-        <w:numPr>
-          <w:ilvl w:val="0"/>
-          <w:numId w:val="7"/>
-        </w:numPr>
-        <w:spacing w:before="100" w:beforeAutospacing="1" w:after="100" w:afterAutospacing="1" w:line="240" w:lineRule="auto"/>
-        <w:rPr>
-          <w:rFonts w:ascii="Times New Roman" w:eastAsia="Times New Roman" w:hAnsi="Times New Roman" w:cs="Times New Roman"/>
-          <w:sz w:val="20"/>
-          <w:szCs w:val="20"/>
-        </w:rPr>
-      </w:pPr>
-      <w:r>
-        <w:rPr>
-          <w:rFonts w:ascii="Times New Roman" w:eastAsia="Times New Roman" w:hAnsi="Times New Roman" w:cs="Times New Roman"/>
-          <w:sz w:val="20"/>
-          <w:szCs w:val="20"/>
-        </w:rPr>
-        <w:t xml:space="preserve">Docker &amp; Containerization — Hands-on </w:t>
-      </w:r>
-    </w:p>
-    <w:p>
-      <w:pPr>
-        <w:numPr>
-          <w:ilvl w:val="0"/>
-          <w:numId w:val="7"/>
-        </w:numPr>
-        <w:spacing w:before="100" w:beforeAutospacing="1" w:after="100" w:afterAutospacing="1" w:line="240" w:lineRule="auto"/>
-        <w:rPr>
-          <w:rFonts w:ascii="Times New Roman" w:eastAsia="Times New Roman" w:hAnsi="Times New Roman" w:cs="Times New Roman"/>
-          <w:sz w:val="20"/>
-          <w:szCs w:val="20"/>
-        </w:rPr>
-      </w:pPr>
-      <w:r>
-        <w:rPr>
-          <w:rFonts w:ascii="Times New Roman" w:eastAsia="Times New Roman" w:hAnsi="Times New Roman" w:cs="Times New Roman"/>
-          <w:sz w:val="20"/>
-          <w:szCs w:val="20"/>
-        </w:rPr>
-        <w:t xml:space="preserve">Cloud Infrastructure &amp; DevOps — In Progress </w:t>
-      </w:r>
-    </w:p>
-    <w:p>
-      <w:pPr>
-        <w:spacing w:before="100" w:beforeAutospacing="1" w:after="100" w:afterAutospacing="1" w:line="240" w:lineRule="auto"/>
-        <w:rPr>
-          <w:rFonts w:ascii="Times New Roman" w:eastAsia="Times New Roman" w:hAnsi="Times New Roman" w:cs="Times New Roman"/>
-          <w:sz w:val="20"/>
-          <w:szCs w:val="20"/>
-        </w:rPr>
-      </w:pPr>
-      <w:r>
-        <w:rPr>
-          <w:rFonts w:ascii="Times New Roman" w:eastAsia="Times New Roman" w:hAnsi="Times New Roman" w:cs="Times New Roman"/>
-          <w:b/>
-          <w:bCs/>
-          <w:sz w:val="20"/>
-          <w:szCs w:val="20"/>
-        </w:rPr>
-        <w:t>Planned / Target Certifications</w:t>
-      </w:r>
-    </w:p>
-    <w:p>
-      <w:pPr>
-        <w:numPr>
-          <w:ilvl w:val="0"/>
-          <w:numId w:val="8"/>
-        </w:numPr>
-        <w:spacing w:before="100" w:beforeAutospacing="1" w:after="100" w:afterAutospacing="1" w:line="240" w:lineRule="auto"/>
-        <w:rPr>
-          <w:rFonts w:ascii="Times New Roman" w:eastAsia="Times New Roman" w:hAnsi="Times New Roman" w:cs="Times New Roman"/>
-          <w:sz w:val="20"/>
-          <w:szCs w:val="20"/>
-        </w:rPr>
-      </w:pPr>
-      <w:r>
-        <w:rPr>
-          <w:rFonts w:ascii="Times New Roman" w:eastAsia="Times New Roman" w:hAnsi="Times New Roman" w:cs="Times New Roman"/>
-          <w:sz w:val="20"/>
-          <w:szCs w:val="20"/>
-        </w:rPr>
-        <w:t xml:space="preserve">AWS Certified Cloud Practitioner / Associate-level certification pathway </w:t>
-      </w:r>
-    </w:p>
-    <w:p>
-      <w:pPr>
-        <w:numPr>
-          <w:ilvl w:val="0"/>
-          <w:numId w:val="8"/>
-        </w:numPr>
-        <w:spacing w:before="100" w:beforeAutospacing="1" w:after="100" w:afterAutospacing="1" w:line="240" w:lineRule="auto"/>
-        <w:rPr>
-          <w:rFonts w:ascii="Times New Roman" w:eastAsia="Times New Roman" w:hAnsi="Times New Roman" w:cs="Times New Roman"/>
-          <w:sz w:val="20"/>
-          <w:szCs w:val="20"/>
-        </w:rPr>
-      </w:pPr>
-      <w:r>
-        <w:rPr>
-          <w:rFonts w:ascii="Times New Roman" w:eastAsia="Times New Roman" w:hAnsi="Times New Roman" w:cs="Times New Roman"/>
-          <w:sz w:val="20"/>
-          <w:szCs w:val="20"/>
-        </w:rPr>
-        <w:t xml:space="preserve">Google Cloud Associate Cloud Engineer — Opportunity under evaluation </w:t>
-      </w:r>
-    </w:p>
-    <w:p>
-      <w:pPr>
         <w:spacing w:after="0" w:line="240" w:lineRule="auto"/>
         <w:rPr>
           <w:rFonts w:ascii="Times New Roman" w:eastAsia="Times New Roman" w:hAnsi="Times New Roman" w:cs="Times New Roman"/>
-          <w:sz w:val="24"/>
-          <w:szCs w:val="24"/>
-        </w:rPr>
-      </w:pPr>
-      <w:r>
-        <w:rPr>
-          <w:rFonts w:ascii="Times New Roman" w:eastAsia="Times New Roman" w:hAnsi="Times New Roman" w:cs="Times New Roman"/>
-          <w:sz w:val="24"/>
-          <w:szCs w:val="24"/>
-        </w:rPr>
-        <w:pict>
-          <v:rect id="_x0000_i1034" style="width:0;height:1.5pt" o:hralign="center" o:hrstd="t" o:hr="t" fillcolor="#a0a0a0" stroked="f"/>
-        </w:pict>
-      </w:r>
-    </w:p>
-    <w:p>
-      <w:pPr>
-        <w:spacing w:before="100" w:beforeAutospacing="1" w:after="100" w:afterAutospacing="1" w:line="240" w:lineRule="auto"/>
-        <w:outlineLvl w:val="0"/>
-        <w:rPr>
-          <w:rFonts w:ascii="Times New Roman" w:eastAsia="Times New Roman" w:hAnsi="Times New Roman" w:cs="Times New Roman"/>
-          <w:b/>
-          <w:bCs/>
-          <w:kern w:val="36"/>
-          <w:sz w:val="24"/>
-          <w:szCs w:val="24"/>
-        </w:rPr>
-      </w:pPr>
-      <w:r>
-        <w:rPr>
-          <w:rFonts w:ascii="Times New Roman" w:eastAsia="Times New Roman" w:hAnsi="Times New Roman" w:cs="Times New Roman"/>
-          <w:b/>
-          <w:bCs/>
-          <w:kern w:val="36"/>
+          <w:b/>
+          <w:sz w:val="24"/>
+          <w:szCs w:val="24"/>
+        </w:rPr>
+      </w:pPr>
+      <w:r>
+        <w:rPr>
+          <w:rFonts w:ascii="Times New Roman" w:eastAsia="Times New Roman" w:hAnsi="Times New Roman" w:cs="Times New Roman"/>
+          <w:b/>
           <w:sz w:val="24"/>
           <w:szCs w:val="24"/>
         </w:rPr>
@@ -3093,62 +2938,25 @@
     </w:p>
     <w:p>
       <w:pPr>
-        <w:spacing w:before="100" w:beforeAutospacing="1" w:after="100" w:afterAutospacing="1" w:line="240" w:lineRule="auto"/>
-        <w:rPr>
-          <w:rFonts w:ascii="Times New Roman" w:eastAsia="Times New Roman" w:hAnsi="Times New Roman" w:cs="Times New Roman"/>
-          <w:sz w:val="20"/>
-          <w:szCs w:val="20"/>
-        </w:rPr>
-      </w:pPr>
-      <w:r>
-        <w:rPr>
-          <w:rFonts w:ascii="Times New Roman" w:eastAsia="Times New Roman" w:hAnsi="Times New Roman" w:cs="Times New Roman"/>
-          <w:b/>
-          <w:bCs/>
-          <w:sz w:val="20"/>
-          <w:szCs w:val="20"/>
-        </w:rPr>
-        <w:t>Indonesian:</w:t>
-      </w:r>
-      <w:r>
-        <w:rPr>
-          <w:rFonts w:ascii="Times New Roman" w:eastAsia="Times New Roman" w:hAnsi="Times New Roman" w:cs="Times New Roman"/>
-          <w:sz w:val="20"/>
-          <w:szCs w:val="20"/>
-        </w:rPr>
-        <w:t xml:space="preserve"> Native</w:t>
-      </w:r>
-      <w:r>
-        <w:rPr>
-          <w:rFonts w:ascii="Times New Roman" w:eastAsia="Times New Roman" w:hAnsi="Times New Roman" w:cs="Times New Roman"/>
-          <w:sz w:val="20"/>
-          <w:szCs w:val="20"/>
-        </w:rPr>
-        <w:br/>
-      </w:r>
-      <w:r>
-        <w:rPr>
-          <w:rFonts w:ascii="Times New Roman" w:eastAsia="Times New Roman" w:hAnsi="Times New Roman" w:cs="Times New Roman"/>
-          <w:b/>
-          <w:bCs/>
-          <w:sz w:val="20"/>
-          <w:szCs w:val="20"/>
-        </w:rPr>
-        <w:t>English:</w:t>
-      </w:r>
-      <w:r>
-        <w:rPr>
-          <w:rFonts w:ascii="Times New Roman" w:eastAsia="Times New Roman" w:hAnsi="Times New Roman" w:cs="Times New Roman"/>
-          <w:sz w:val="20"/>
-          <w:szCs w:val="20"/>
-        </w:rPr>
-        <w:t xml:space="preserve"> Professional Working Proficiency</w:t>
-      </w:r>
-    </w:p>
-    <w:p/>
+        <w:spacing w:after="0" w:line="240" w:lineRule="auto"/>
+        <w:rPr>
+          <w:rFonts w:ascii="Times New Roman" w:eastAsia="Times New Roman" w:hAnsi="Times New Roman" w:cs="Times New Roman"/>
+          <w:sz w:val="24"/>
+          <w:szCs w:val="24"/>
+        </w:rPr>
+      </w:pPr>
+      <w:r>
+        <w:rPr>
+          <w:rFonts w:ascii="Times New Roman" w:eastAsia="Times New Roman" w:hAnsi="Times New Roman" w:cs="Times New Roman"/>
+          <w:sz w:val="24"/>
+          <w:szCs w:val="24"/>
+        </w:rPr>
+        <w:t>Indonesian (Native) | English (Professional Working Proficiency)</w:t>
+      </w:r>
+    </w:p>
     <w:sectPr>
       <w:pgSz w:w="12240" w:h="15840"/>
-      <w:pgMar w:top="1440" w:right="1440" w:bottom="1440" w:left="1440" w:header="720" w:footer="720" w:gutter="0"/>
+      <w:pgMar w:top="720" w:right="720" w:bottom="720" w:left="720" w:header="720" w:footer="720" w:gutter="0"/>
       <w:cols w:space="720"/>
       <w:docGrid w:linePitch="360"/>
     </w:sectPr>
@@ -3457,6 +3265,231 @@
     </w:lvl>
   </w:abstractNum>
   <w:abstractNum w:abstractNumId="2" w15:restartNumberingAfterBreak="0">
+    <w:nsid w:val="18B21C46"/>
+    <w:multiLevelType w:val="hybridMultilevel"/>
+    <w:tmpl w:val="B9D49A80"/>
+    <w:lvl w:ilvl="0" w:tplc="04090001">
+      <w:start w:val="1"/>
+      <w:numFmt w:val="bullet"/>
+      <w:lvlText w:val=""/>
+      <w:lvlJc w:val="left"/>
+      <w:pPr>
+        <w:ind w:left="720" w:hanging="360"/>
+      </w:pPr>
+      <w:rPr>
+        <w:rFonts w:ascii="Symbol" w:hAnsi="Symbol" w:hint="default"/>
+      </w:rPr>
+    </w:lvl>
+    <w:lvl w:ilvl="1" w:tplc="04090003" w:tentative="1">
+      <w:start w:val="1"/>
+      <w:numFmt w:val="bullet"/>
+      <w:lvlText w:val="o"/>
+      <w:lvlJc w:val="left"/>
+      <w:pPr>
+        <w:ind w:left="1440" w:hanging="360"/>
+      </w:pPr>
+      <w:rPr>
+        <w:rFonts w:ascii="Courier New" w:hAnsi="Courier New" w:cs="Courier New" w:hint="default"/>
+      </w:rPr>
+    </w:lvl>
+    <w:lvl w:ilvl="2" w:tplc="04090005" w:tentative="1">
+      <w:start w:val="1"/>
+      <w:numFmt w:val="bullet"/>
+      <w:lvlText w:val=""/>
+      <w:lvlJc w:val="left"/>
+      <w:pPr>
+        <w:ind w:left="2160" w:hanging="360"/>
+      </w:pPr>
+      <w:rPr>
+        <w:rFonts w:ascii="Wingdings" w:hAnsi="Wingdings" w:hint="default"/>
+      </w:rPr>
+    </w:lvl>
+    <w:lvl w:ilvl="3" w:tplc="04090001" w:tentative="1">
+      <w:start w:val="1"/>
+      <w:numFmt w:val="bullet"/>
+      <w:lvlText w:val=""/>
+      <w:lvlJc w:val="left"/>
+      <w:pPr>
+        <w:ind w:left="2880" w:hanging="360"/>
+      </w:pPr>
+      <w:rPr>
+        <w:rFonts w:ascii="Symbol" w:hAnsi="Symbol" w:hint="default"/>
+      </w:rPr>
+    </w:lvl>
+    <w:lvl w:ilvl="4" w:tplc="04090003" w:tentative="1">
+      <w:start w:val="1"/>
+      <w:numFmt w:val="bullet"/>
+      <w:lvlText w:val="o"/>
+      <w:lvlJc w:val="left"/>
+      <w:pPr>
+        <w:ind w:left="3600" w:hanging="360"/>
+      </w:pPr>
+      <w:rPr>
+        <w:rFonts w:ascii="Courier New" w:hAnsi="Courier New" w:cs="Courier New" w:hint="default"/>
+      </w:rPr>
+    </w:lvl>
+    <w:lvl w:ilvl="5" w:tplc="04090005" w:tentative="1">
+      <w:start w:val="1"/>
+      <w:numFmt w:val="bullet"/>
+      <w:lvlText w:val=""/>
+      <w:lvlJc w:val="left"/>
+      <w:pPr>
+        <w:ind w:left="4320" w:hanging="360"/>
+      </w:pPr>
+      <w:rPr>
+        <w:rFonts w:ascii="Wingdings" w:hAnsi="Wingdings" w:hint="default"/>
+      </w:rPr>
+    </w:lvl>
+    <w:lvl w:ilvl="6" w:tplc="04090001" w:tentative="1">
+      <w:start w:val="1"/>
+      <w:numFmt w:val="bullet"/>
+      <w:lvlText w:val=""/>
+      <w:lvlJc w:val="left"/>
+      <w:pPr>
+        <w:ind w:left="5040" w:hanging="360"/>
+      </w:pPr>
+      <w:rPr>
+        <w:rFonts w:ascii="Symbol" w:hAnsi="Symbol" w:hint="default"/>
+      </w:rPr>
+    </w:lvl>
+    <w:lvl w:ilvl="7" w:tplc="04090003" w:tentative="1">
+      <w:start w:val="1"/>
+      <w:numFmt w:val="bullet"/>
+      <w:lvlText w:val="o"/>
+      <w:lvlJc w:val="left"/>
+      <w:pPr>
+        <w:ind w:left="5760" w:hanging="360"/>
+      </w:pPr>
+      <w:rPr>
+        <w:rFonts w:ascii="Courier New" w:hAnsi="Courier New" w:cs="Courier New" w:hint="default"/>
+      </w:rPr>
+    </w:lvl>
+    <w:lvl w:ilvl="8" w:tplc="04090005" w:tentative="1">
+      <w:start w:val="1"/>
+      <w:numFmt w:val="bullet"/>
+      <w:lvlText w:val=""/>
+      <w:lvlJc w:val="left"/>
+      <w:pPr>
+        <w:ind w:left="6480" w:hanging="360"/>
+      </w:pPr>
+      <w:rPr>
+        <w:rFonts w:ascii="Wingdings" w:hAnsi="Wingdings" w:hint="default"/>
+      </w:rPr>
+    </w:lvl>
+  </w:abstractNum>
+  <w:abstractNum w:abstractNumId="3" w15:restartNumberingAfterBreak="0">
+    <w:nsid w:val="1CAB0DA6"/>
+    <w:multiLevelType w:val="hybridMultilevel"/>
+    <w:tmpl w:val="CAE2EAB6"/>
+    <w:lvl w:ilvl="0" w:tplc="FFA06798">
+      <w:numFmt w:val="bullet"/>
+      <w:lvlText w:val=""/>
+      <w:lvlJc w:val="left"/>
+      <w:pPr>
+        <w:ind w:left="720" w:hanging="360"/>
+      </w:pPr>
+      <w:rPr>
+        <w:rFonts w:ascii="Times New Roman" w:eastAsia="Times New Roman" w:hAnsi="Times New Roman" w:cs="Times New Roman" w:hint="default"/>
+      </w:rPr>
+    </w:lvl>
+    <w:lvl w:ilvl="1" w:tplc="04090003" w:tentative="1">
+      <w:start w:val="1"/>
+      <w:numFmt w:val="bullet"/>
+      <w:lvlText w:val="o"/>
+      <w:lvlJc w:val="left"/>
+      <w:pPr>
+        <w:ind w:left="1440" w:hanging="360"/>
+      </w:pPr>
+      <w:rPr>
+        <w:rFonts w:ascii="Courier New" w:hAnsi="Courier New" w:cs="Courier New" w:hint="default"/>
+      </w:rPr>
+    </w:lvl>
+    <w:lvl w:ilvl="2" w:tplc="04090005" w:tentative="1">
+      <w:start w:val="1"/>
+      <w:numFmt w:val="bullet"/>
+      <w:lvlText w:val=""/>
+      <w:lvlJc w:val="left"/>
+      <w:pPr>
+        <w:ind w:left="2160" w:hanging="360"/>
+      </w:pPr>
+      <w:rPr>
+        <w:rFonts w:ascii="Wingdings" w:hAnsi="Wingdings" w:hint="default"/>
+      </w:rPr>
+    </w:lvl>
+    <w:lvl w:ilvl="3" w:tplc="04090001" w:tentative="1">
+      <w:start w:val="1"/>
+      <w:numFmt w:val="bullet"/>
+      <w:lvlText w:val=""/>
+      <w:lvlJc w:val="left"/>
+      <w:pPr>
+        <w:ind w:left="2880" w:hanging="360"/>
+      </w:pPr>
+      <w:rPr>
+        <w:rFonts w:ascii="Symbol" w:hAnsi="Symbol" w:hint="default"/>
+      </w:rPr>
+    </w:lvl>
+    <w:lvl w:ilvl="4" w:tplc="04090003" w:tentative="1">
+      <w:start w:val="1"/>
+      <w:numFmt w:val="bullet"/>
+      <w:lvlText w:val="o"/>
+      <w:lvlJc w:val="left"/>
+      <w:pPr>
+        <w:ind w:left="3600" w:hanging="360"/>
+      </w:pPr>
+      <w:rPr>
+        <w:rFonts w:ascii="Courier New" w:hAnsi="Courier New" w:cs="Courier New" w:hint="default"/>
+      </w:rPr>
+    </w:lvl>
+    <w:lvl w:ilvl="5" w:tplc="04090005" w:tentative="1">
+      <w:start w:val="1"/>
+      <w:numFmt w:val="bullet"/>
+      <w:lvlText w:val=""/>
+      <w:lvlJc w:val="left"/>
+      <w:pPr>
+        <w:ind w:left="4320" w:hanging="360"/>
+      </w:pPr>
+      <w:rPr>
+        <w:rFonts w:ascii="Wingdings" w:hAnsi="Wingdings" w:hint="default"/>
+      </w:rPr>
+    </w:lvl>
+    <w:lvl w:ilvl="6" w:tplc="04090001" w:tentative="1">
+      <w:start w:val="1"/>
+      <w:numFmt w:val="bullet"/>
+      <w:lvlText w:val=""/>
+      <w:lvlJc w:val="left"/>
+      <w:pPr>
+        <w:ind w:left="5040" w:hanging="360"/>
+      </w:pPr>
+      <w:rPr>
+        <w:rFonts w:ascii="Symbol" w:hAnsi="Symbol" w:hint="default"/>
+      </w:rPr>
+    </w:lvl>
+    <w:lvl w:ilvl="7" w:tplc="04090003" w:tentative="1">
+      <w:start w:val="1"/>
+      <w:numFmt w:val="bullet"/>
+      <w:lvlText w:val="o"/>
+      <w:lvlJc w:val="left"/>
+      <w:pPr>
+        <w:ind w:left="5760" w:hanging="360"/>
+      </w:pPr>
+      <w:rPr>
+        <w:rFonts w:ascii="Courier New" w:hAnsi="Courier New" w:cs="Courier New" w:hint="default"/>
+      </w:rPr>
+    </w:lvl>
+    <w:lvl w:ilvl="8" w:tplc="04090005" w:tentative="1">
+      <w:start w:val="1"/>
+      <w:numFmt w:val="bullet"/>
+      <w:lvlText w:val=""/>
+      <w:lvlJc w:val="left"/>
+      <w:pPr>
+        <w:ind w:left="6480" w:hanging="360"/>
+      </w:pPr>
+      <w:rPr>
+        <w:rFonts w:ascii="Wingdings" w:hAnsi="Wingdings" w:hint="default"/>
+      </w:rPr>
+    </w:lvl>
+  </w:abstractNum>
+  <w:abstractNum w:abstractNumId="4" w15:restartNumberingAfterBreak="0">
     <w:nsid w:val="352B67C0"/>
     <w:multiLevelType w:val="multilevel"/>
     <w:tmpl w:val="EBDE3788"/>
@@ -3605,7 +3638,120 @@
       </w:rPr>
     </w:lvl>
   </w:abstractNum>
-  <w:abstractNum w:abstractNumId="3" w15:restartNumberingAfterBreak="0">
+  <w:abstractNum w:abstractNumId="5" w15:restartNumberingAfterBreak="0">
+    <w:nsid w:val="3A940421"/>
+    <w:multiLevelType w:val="hybridMultilevel"/>
+    <w:tmpl w:val="4BECF55E"/>
+    <w:lvl w:ilvl="0" w:tplc="04090001">
+      <w:start w:val="1"/>
+      <w:numFmt w:val="bullet"/>
+      <w:lvlText w:val=""/>
+      <w:lvlJc w:val="left"/>
+      <w:pPr>
+        <w:ind w:left="720" w:hanging="360"/>
+      </w:pPr>
+      <w:rPr>
+        <w:rFonts w:ascii="Symbol" w:hAnsi="Symbol" w:hint="default"/>
+      </w:rPr>
+    </w:lvl>
+    <w:lvl w:ilvl="1" w:tplc="04090003" w:tentative="1">
+      <w:start w:val="1"/>
+      <w:numFmt w:val="bullet"/>
+      <w:lvlText w:val="o"/>
+      <w:lvlJc w:val="left"/>
+      <w:pPr>
+        <w:ind w:left="1440" w:hanging="360"/>
+      </w:pPr>
+      <w:rPr>
+        <w:rFonts w:ascii="Courier New" w:hAnsi="Courier New" w:cs="Courier New" w:hint="default"/>
+      </w:rPr>
+    </w:lvl>
+    <w:lvl w:ilvl="2" w:tplc="04090005" w:tentative="1">
+      <w:start w:val="1"/>
+      <w:numFmt w:val="bullet"/>
+      <w:lvlText w:val=""/>
+      <w:lvlJc w:val="left"/>
+      <w:pPr>
+        <w:ind w:left="2160" w:hanging="360"/>
+      </w:pPr>
+      <w:rPr>
+        <w:rFonts w:ascii="Wingdings" w:hAnsi="Wingdings" w:hint="default"/>
+      </w:rPr>
+    </w:lvl>
+    <w:lvl w:ilvl="3" w:tplc="04090001" w:tentative="1">
+      <w:start w:val="1"/>
+      <w:numFmt w:val="bullet"/>
+      <w:lvlText w:val=""/>
+      <w:lvlJc w:val="left"/>
+      <w:pPr>
+        <w:ind w:left="2880" w:hanging="360"/>
+      </w:pPr>
+      <w:rPr>
+        <w:rFonts w:ascii="Symbol" w:hAnsi="Symbol" w:hint="default"/>
+      </w:rPr>
+    </w:lvl>
+    <w:lvl w:ilvl="4" w:tplc="04090003" w:tentative="1">
+      <w:start w:val="1"/>
+      <w:numFmt w:val="bullet"/>
+      <w:lvlText w:val="o"/>
+      <w:lvlJc w:val="left"/>
+      <w:pPr>
+        <w:ind w:left="3600" w:hanging="360"/>
+      </w:pPr>
+      <w:rPr>
+        <w:rFonts w:ascii="Courier New" w:hAnsi="Courier New" w:cs="Courier New" w:hint="default"/>
+      </w:rPr>
+    </w:lvl>
+    <w:lvl w:ilvl="5" w:tplc="04090005" w:tentative="1">
+      <w:start w:val="1"/>
+      <w:numFmt w:val="bullet"/>
+      <w:lvlText w:val=""/>
+      <w:lvlJc w:val="left"/>
+      <w:pPr>
+        <w:ind w:left="4320" w:hanging="360"/>
+      </w:pPr>
+      <w:rPr>
+        <w:rFonts w:ascii="Wingdings" w:hAnsi="Wingdings" w:hint="default"/>
+      </w:rPr>
+    </w:lvl>
+    <w:lvl w:ilvl="6" w:tplc="04090001" w:tentative="1">
+      <w:start w:val="1"/>
+      <w:numFmt w:val="bullet"/>
+      <w:lvlText w:val=""/>
+      <w:lvlJc w:val="left"/>
+      <w:pPr>
+        <w:ind w:left="5040" w:hanging="360"/>
+      </w:pPr>
+      <w:rPr>
+        <w:rFonts w:ascii="Symbol" w:hAnsi="Symbol" w:hint="default"/>
+      </w:rPr>
+    </w:lvl>
+    <w:lvl w:ilvl="7" w:tplc="04090003" w:tentative="1">
+      <w:start w:val="1"/>
+      <w:numFmt w:val="bullet"/>
+      <w:lvlText w:val="o"/>
+      <w:lvlJc w:val="left"/>
+      <w:pPr>
+        <w:ind w:left="5760" w:hanging="360"/>
+      </w:pPr>
+      <w:rPr>
+        <w:rFonts w:ascii="Courier New" w:hAnsi="Courier New" w:cs="Courier New" w:hint="default"/>
+      </w:rPr>
+    </w:lvl>
+    <w:lvl w:ilvl="8" w:tplc="04090005" w:tentative="1">
+      <w:start w:val="1"/>
+      <w:numFmt w:val="bullet"/>
+      <w:lvlText w:val=""/>
+      <w:lvlJc w:val="left"/>
+      <w:pPr>
+        <w:ind w:left="6480" w:hanging="360"/>
+      </w:pPr>
+      <w:rPr>
+        <w:rFonts w:ascii="Wingdings" w:hAnsi="Wingdings" w:hint="default"/>
+      </w:rPr>
+    </w:lvl>
+  </w:abstractNum>
+  <w:abstractNum w:abstractNumId="6" w15:restartNumberingAfterBreak="0">
     <w:nsid w:val="56C51769"/>
     <w:multiLevelType w:val="multilevel"/>
     <w:tmpl w:val="83945DDA"/>
@@ -3754,7 +3900,7 @@
       </w:rPr>
     </w:lvl>
   </w:abstractNum>
-  <w:abstractNum w:abstractNumId="4" w15:restartNumberingAfterBreak="0">
+  <w:abstractNum w:abstractNumId="7" w15:restartNumberingAfterBreak="0">
     <w:nsid w:val="57AD62A3"/>
     <w:multiLevelType w:val="multilevel"/>
     <w:tmpl w:val="A2E23EBC"/>
@@ -3903,7 +4049,120 @@
       </w:rPr>
     </w:lvl>
   </w:abstractNum>
-  <w:abstractNum w:abstractNumId="5" w15:restartNumberingAfterBreak="0">
+  <w:abstractNum w:abstractNumId="8" w15:restartNumberingAfterBreak="0">
+    <w:nsid w:val="65721BC9"/>
+    <w:multiLevelType w:val="hybridMultilevel"/>
+    <w:tmpl w:val="683EA3FA"/>
+    <w:lvl w:ilvl="0" w:tplc="04090001">
+      <w:start w:val="1"/>
+      <w:numFmt w:val="bullet"/>
+      <w:lvlText w:val=""/>
+      <w:lvlJc w:val="left"/>
+      <w:pPr>
+        <w:ind w:left="720" w:hanging="360"/>
+      </w:pPr>
+      <w:rPr>
+        <w:rFonts w:ascii="Symbol" w:hAnsi="Symbol" w:hint="default"/>
+      </w:rPr>
+    </w:lvl>
+    <w:lvl w:ilvl="1" w:tplc="04090003" w:tentative="1">
+      <w:start w:val="1"/>
+      <w:numFmt w:val="bullet"/>
+      <w:lvlText w:val="o"/>
+      <w:lvlJc w:val="left"/>
+      <w:pPr>
+        <w:ind w:left="1440" w:hanging="360"/>
+      </w:pPr>
+      <w:rPr>
+        <w:rFonts w:ascii="Courier New" w:hAnsi="Courier New" w:cs="Courier New" w:hint="default"/>
+      </w:rPr>
+    </w:lvl>
+    <w:lvl w:ilvl="2" w:tplc="04090005" w:tentative="1">
+      <w:start w:val="1"/>
+      <w:numFmt w:val="bullet"/>
+      <w:lvlText w:val=""/>
+      <w:lvlJc w:val="left"/>
+      <w:pPr>
+        <w:ind w:left="2160" w:hanging="360"/>
+      </w:pPr>
+      <w:rPr>
+        <w:rFonts w:ascii="Wingdings" w:hAnsi="Wingdings" w:hint="default"/>
+      </w:rPr>
+    </w:lvl>
+    <w:lvl w:ilvl="3" w:tplc="04090001" w:tentative="1">
+      <w:start w:val="1"/>
+      <w:numFmt w:val="bullet"/>
+      <w:lvlText w:val=""/>
+      <w:lvlJc w:val="left"/>
+      <w:pPr>
+        <w:ind w:left="2880" w:hanging="360"/>
+      </w:pPr>
+      <w:rPr>
+        <w:rFonts w:ascii="Symbol" w:hAnsi="Symbol" w:hint="default"/>
+      </w:rPr>
+    </w:lvl>
+    <w:lvl w:ilvl="4" w:tplc="04090003" w:tentative="1">
+      <w:start w:val="1"/>
+      <w:numFmt w:val="bullet"/>
+      <w:lvlText w:val="o"/>
+      <w:lvlJc w:val="left"/>
+      <w:pPr>
+        <w:ind w:left="3600" w:hanging="360"/>
+      </w:pPr>
+      <w:rPr>
+        <w:rFonts w:ascii="Courier New" w:hAnsi="Courier New" w:cs="Courier New" w:hint="default"/>
+      </w:rPr>
+    </w:lvl>
+    <w:lvl w:ilvl="5" w:tplc="04090005" w:tentative="1">
+      <w:start w:val="1"/>
+      <w:numFmt w:val="bullet"/>
+      <w:lvlText w:val=""/>
+      <w:lvlJc w:val="left"/>
+      <w:pPr>
+        <w:ind w:left="4320" w:hanging="360"/>
+      </w:pPr>
+      <w:rPr>
+        <w:rFonts w:ascii="Wingdings" w:hAnsi="Wingdings" w:hint="default"/>
+      </w:rPr>
+    </w:lvl>
+    <w:lvl w:ilvl="6" w:tplc="04090001" w:tentative="1">
+      <w:start w:val="1"/>
+      <w:numFmt w:val="bullet"/>
+      <w:lvlText w:val=""/>
+      <w:lvlJc w:val="left"/>
+      <w:pPr>
+        <w:ind w:left="5040" w:hanging="360"/>
+      </w:pPr>
+      <w:rPr>
+        <w:rFonts w:ascii="Symbol" w:hAnsi="Symbol" w:hint="default"/>
+      </w:rPr>
+    </w:lvl>
+    <w:lvl w:ilvl="7" w:tplc="04090003" w:tentative="1">
+      <w:start w:val="1"/>
+      <w:numFmt w:val="bullet"/>
+      <w:lvlText w:val="o"/>
+      <w:lvlJc w:val="left"/>
+      <w:pPr>
+        <w:ind w:left="5760" w:hanging="360"/>
+      </w:pPr>
+      <w:rPr>
+        <w:rFonts w:ascii="Courier New" w:hAnsi="Courier New" w:cs="Courier New" w:hint="default"/>
+      </w:rPr>
+    </w:lvl>
+    <w:lvl w:ilvl="8" w:tplc="04090005" w:tentative="1">
+      <w:start w:val="1"/>
+      <w:numFmt w:val="bullet"/>
+      <w:lvlText w:val=""/>
+      <w:lvlJc w:val="left"/>
+      <w:pPr>
+        <w:ind w:left="6480" w:hanging="360"/>
+      </w:pPr>
+      <w:rPr>
+        <w:rFonts w:ascii="Wingdings" w:hAnsi="Wingdings" w:hint="default"/>
+      </w:rPr>
+    </w:lvl>
+  </w:abstractNum>
+  <w:abstractNum w:abstractNumId="9" w15:restartNumberingAfterBreak="0">
     <w:nsid w:val="67A868AF"/>
     <w:multiLevelType w:val="multilevel"/>
     <w:tmpl w:val="9B6AD4AE"/>
@@ -4052,7 +4311,7 @@
       </w:rPr>
     </w:lvl>
   </w:abstractNum>
-  <w:abstractNum w:abstractNumId="6" w15:restartNumberingAfterBreak="0">
+  <w:abstractNum w:abstractNumId="10" w15:restartNumberingAfterBreak="0">
     <w:nsid w:val="6C1C3EA2"/>
     <w:multiLevelType w:val="multilevel"/>
     <w:tmpl w:val="FCDE753A"/>
@@ -4201,7 +4460,233 @@
       </w:rPr>
     </w:lvl>
   </w:abstractNum>
-  <w:abstractNum w:abstractNumId="7" w15:restartNumberingAfterBreak="0">
+  <w:abstractNum w:abstractNumId="11" w15:restartNumberingAfterBreak="0">
+    <w:nsid w:val="70902018"/>
+    <w:multiLevelType w:val="hybridMultilevel"/>
+    <w:tmpl w:val="CA6AC634"/>
+    <w:lvl w:ilvl="0" w:tplc="04090001">
+      <w:start w:val="1"/>
+      <w:numFmt w:val="bullet"/>
+      <w:lvlText w:val=""/>
+      <w:lvlJc w:val="left"/>
+      <w:pPr>
+        <w:ind w:left="720" w:hanging="360"/>
+      </w:pPr>
+      <w:rPr>
+        <w:rFonts w:ascii="Symbol" w:hAnsi="Symbol" w:hint="default"/>
+      </w:rPr>
+    </w:lvl>
+    <w:lvl w:ilvl="1" w:tplc="04090003" w:tentative="1">
+      <w:start w:val="1"/>
+      <w:numFmt w:val="bullet"/>
+      <w:lvlText w:val="o"/>
+      <w:lvlJc w:val="left"/>
+      <w:pPr>
+        <w:ind w:left="1440" w:hanging="360"/>
+      </w:pPr>
+      <w:rPr>
+        <w:rFonts w:ascii="Courier New" w:hAnsi="Courier New" w:cs="Courier New" w:hint="default"/>
+      </w:rPr>
+    </w:lvl>
+    <w:lvl w:ilvl="2" w:tplc="04090005" w:tentative="1">
+      <w:start w:val="1"/>
+      <w:numFmt w:val="bullet"/>
+      <w:lvlText w:val=""/>
+      <w:lvlJc w:val="left"/>
+      <w:pPr>
+        <w:ind w:left="2160" w:hanging="360"/>
+      </w:pPr>
+      <w:rPr>
+        <w:rFonts w:ascii="Wingdings" w:hAnsi="Wingdings" w:hint="default"/>
+      </w:rPr>
+    </w:lvl>
+    <w:lvl w:ilvl="3" w:tplc="04090001" w:tentative="1">
+      <w:start w:val="1"/>
+      <w:numFmt w:val="bullet"/>
+      <w:lvlText w:val=""/>
+      <w:lvlJc w:val="left"/>
+      <w:pPr>
+        <w:ind w:left="2880" w:hanging="360"/>
+      </w:pPr>
+      <w:rPr>
+        <w:rFonts w:ascii="Symbol" w:hAnsi="Symbol" w:hint="default"/>
+      </w:rPr>
+    </w:lvl>
+    <w:lvl w:ilvl="4" w:tplc="04090003" w:tentative="1">
+      <w:start w:val="1"/>
+      <w:numFmt w:val="bullet"/>
+      <w:lvlText w:val="o"/>
+      <w:lvlJc w:val="left"/>
+      <w:pPr>
+        <w:ind w:left="3600" w:hanging="360"/>
+      </w:pPr>
+      <w:rPr>
+        <w:rFonts w:ascii="Courier New" w:hAnsi="Courier New" w:cs="Courier New" w:hint="default"/>
+      </w:rPr>
+    </w:lvl>
+    <w:lvl w:ilvl="5" w:tplc="04090005" w:tentative="1">
+      <w:start w:val="1"/>
+      <w:numFmt w:val="bullet"/>
+      <w:lvlText w:val=""/>
+      <w:lvlJc w:val="left"/>
+      <w:pPr>
+        <w:ind w:left="4320" w:hanging="360"/>
+      </w:pPr>
+      <w:rPr>
+        <w:rFonts w:ascii="Wingdings" w:hAnsi="Wingdings" w:hint="default"/>
+      </w:rPr>
+    </w:lvl>
+    <w:lvl w:ilvl="6" w:tplc="04090001" w:tentative="1">
+      <w:start w:val="1"/>
+      <w:numFmt w:val="bullet"/>
+      <w:lvlText w:val=""/>
+      <w:lvlJc w:val="left"/>
+      <w:pPr>
+        <w:ind w:left="5040" w:hanging="360"/>
+      </w:pPr>
+      <w:rPr>
+        <w:rFonts w:ascii="Symbol" w:hAnsi="Symbol" w:hint="default"/>
+      </w:rPr>
+    </w:lvl>
+    <w:lvl w:ilvl="7" w:tplc="04090003" w:tentative="1">
+      <w:start w:val="1"/>
+      <w:numFmt w:val="bullet"/>
+      <w:lvlText w:val="o"/>
+      <w:lvlJc w:val="left"/>
+      <w:pPr>
+        <w:ind w:left="5760" w:hanging="360"/>
+      </w:pPr>
+      <w:rPr>
+        <w:rFonts w:ascii="Courier New" w:hAnsi="Courier New" w:cs="Courier New" w:hint="default"/>
+      </w:rPr>
+    </w:lvl>
+    <w:lvl w:ilvl="8" w:tplc="04090005" w:tentative="1">
+      <w:start w:val="1"/>
+      <w:numFmt w:val="bullet"/>
+      <w:lvlText w:val=""/>
+      <w:lvlJc w:val="left"/>
+      <w:pPr>
+        <w:ind w:left="6480" w:hanging="360"/>
+      </w:pPr>
+      <w:rPr>
+        <w:rFonts w:ascii="Wingdings" w:hAnsi="Wingdings" w:hint="default"/>
+      </w:rPr>
+    </w:lvl>
+  </w:abstractNum>
+  <w:abstractNum w:abstractNumId="12" w15:restartNumberingAfterBreak="0">
+    <w:nsid w:val="710A5914"/>
+    <w:multiLevelType w:val="hybridMultilevel"/>
+    <w:tmpl w:val="24A899D6"/>
+    <w:lvl w:ilvl="0" w:tplc="04090001">
+      <w:start w:val="1"/>
+      <w:numFmt w:val="bullet"/>
+      <w:lvlText w:val=""/>
+      <w:lvlJc w:val="left"/>
+      <w:pPr>
+        <w:ind w:left="720" w:hanging="360"/>
+      </w:pPr>
+      <w:rPr>
+        <w:rFonts w:ascii="Symbol" w:hAnsi="Symbol" w:hint="default"/>
+      </w:rPr>
+    </w:lvl>
+    <w:lvl w:ilvl="1" w:tplc="04090003" w:tentative="1">
+      <w:start w:val="1"/>
+      <w:numFmt w:val="bullet"/>
+      <w:lvlText w:val="o"/>
+      <w:lvlJc w:val="left"/>
+      <w:pPr>
+        <w:ind w:left="1440" w:hanging="360"/>
+      </w:pPr>
+      <w:rPr>
+        <w:rFonts w:ascii="Courier New" w:hAnsi="Courier New" w:cs="Courier New" w:hint="default"/>
+      </w:rPr>
+    </w:lvl>
+    <w:lvl w:ilvl="2" w:tplc="04090005" w:tentative="1">
+      <w:start w:val="1"/>
+      <w:numFmt w:val="bullet"/>
+      <w:lvlText w:val=""/>
+      <w:lvlJc w:val="left"/>
+      <w:pPr>
+        <w:ind w:left="2160" w:hanging="360"/>
+      </w:pPr>
+      <w:rPr>
+        <w:rFonts w:ascii="Wingdings" w:hAnsi="Wingdings" w:hint="default"/>
+      </w:rPr>
+    </w:lvl>
+    <w:lvl w:ilvl="3" w:tplc="04090001" w:tentative="1">
+      <w:start w:val="1"/>
+      <w:numFmt w:val="bullet"/>
+      <w:lvlText w:val=""/>
+      <w:lvlJc w:val="left"/>
+      <w:pPr>
+        <w:ind w:left="2880" w:hanging="360"/>
+      </w:pPr>
+      <w:rPr>
+        <w:rFonts w:ascii="Symbol" w:hAnsi="Symbol" w:hint="default"/>
+      </w:rPr>
+    </w:lvl>
+    <w:lvl w:ilvl="4" w:tplc="04090003" w:tentative="1">
+      <w:start w:val="1"/>
+      <w:numFmt w:val="bullet"/>
+      <w:lvlText w:val="o"/>
+      <w:lvlJc w:val="left"/>
+      <w:pPr>
+        <w:ind w:left="3600" w:hanging="360"/>
+      </w:pPr>
+      <w:rPr>
+        <w:rFonts w:ascii="Courier New" w:hAnsi="Courier New" w:cs="Courier New" w:hint="default"/>
+      </w:rPr>
+    </w:lvl>
+    <w:lvl w:ilvl="5" w:tplc="04090005" w:tentative="1">
+      <w:start w:val="1"/>
+      <w:numFmt w:val="bullet"/>
+      <w:lvlText w:val=""/>
+      <w:lvlJc w:val="left"/>
+      <w:pPr>
+        <w:ind w:left="4320" w:hanging="360"/>
+      </w:pPr>
+      <w:rPr>
+        <w:rFonts w:ascii="Wingdings" w:hAnsi="Wingdings" w:hint="default"/>
+      </w:rPr>
+    </w:lvl>
+    <w:lvl w:ilvl="6" w:tplc="04090001" w:tentative="1">
+      <w:start w:val="1"/>
+      <w:numFmt w:val="bullet"/>
+      <w:lvlText w:val=""/>
+      <w:lvlJc w:val="left"/>
+      <w:pPr>
+        <w:ind w:left="5040" w:hanging="360"/>
+      </w:pPr>
+      <w:rPr>
+        <w:rFonts w:ascii="Symbol" w:hAnsi="Symbol" w:hint="default"/>
+      </w:rPr>
+    </w:lvl>
+    <w:lvl w:ilvl="7" w:tplc="04090003" w:tentative="1">
+      <w:start w:val="1"/>
+      <w:numFmt w:val="bullet"/>
+      <w:lvlText w:val="o"/>
+      <w:lvlJc w:val="left"/>
+      <w:pPr>
+        <w:ind w:left="5760" w:hanging="360"/>
+      </w:pPr>
+      <w:rPr>
+        <w:rFonts w:ascii="Courier New" w:hAnsi="Courier New" w:cs="Courier New" w:hint="default"/>
+      </w:rPr>
+    </w:lvl>
+    <w:lvl w:ilvl="8" w:tplc="04090005" w:tentative="1">
+      <w:start w:val="1"/>
+      <w:numFmt w:val="bullet"/>
+      <w:lvlText w:val=""/>
+      <w:lvlJc w:val="left"/>
+      <w:pPr>
+        <w:ind w:left="6480" w:hanging="360"/>
+      </w:pPr>
+      <w:rPr>
+        <w:rFonts w:ascii="Wingdings" w:hAnsi="Wingdings" w:hint="default"/>
+      </w:rPr>
+    </w:lvl>
+  </w:abstractNum>
+  <w:abstractNum w:abstractNumId="13" w15:restartNumberingAfterBreak="0">
     <w:nsid w:val="7A14115B"/>
     <w:multiLevelType w:val="multilevel"/>
     <w:tmpl w:val="1A3E0B38"/>
@@ -4354,25 +4839,43 @@
     <w:abstractNumId w:val="1"/>
   </w:num>
   <w:num w:numId="2">
-    <w:abstractNumId w:val="2"/>
+    <w:abstractNumId w:val="4"/>
   </w:num>
   <w:num w:numId="3">
-    <w:abstractNumId w:val="5"/>
+    <w:abstractNumId w:val="9"/>
   </w:num>
   <w:num w:numId="4">
-    <w:abstractNumId w:val="4"/>
+    <w:abstractNumId w:val="7"/>
   </w:num>
   <w:num w:numId="5">
     <w:abstractNumId w:val="0"/>
   </w:num>
   <w:num w:numId="6">
+    <w:abstractNumId w:val="6"/>
+  </w:num>
+  <w:num w:numId="7">
+    <w:abstractNumId w:val="13"/>
+  </w:num>
+  <w:num w:numId="8">
+    <w:abstractNumId w:val="10"/>
+  </w:num>
+  <w:num w:numId="9">
+    <w:abstractNumId w:val="8"/>
+  </w:num>
+  <w:num w:numId="10">
     <w:abstractNumId w:val="3"/>
   </w:num>
-  <w:num w:numId="7">
-    <w:abstractNumId w:val="7"/>
+  <w:num w:numId="11">
+    <w:abstractNumId w:val="12"/>
   </w:num>
-  <w:num w:numId="8">
-    <w:abstractNumId w:val="6"/>
+  <w:num w:numId="12">
+    <w:abstractNumId w:val="5"/>
+  </w:num>
+  <w:num w:numId="13">
+    <w:abstractNumId w:val="2"/>
+  </w:num>
+  <w:num w:numId="14">
+    <w:abstractNumId w:val="11"/>
   </w:num>
 </w:numbering>
 </file>
@@ -4939,6 +5442,17 @@
       <w:szCs w:val="20"/>
     </w:rPr>
   </w:style>
+  <w:style w:type="paragraph" w:styleId="ListParagraph">
+    <w:name w:val="List Paragraph"/>
+    <w:basedOn w:val="Normal"/>
+    <w:uiPriority w:val="34"/>
+    <w:qFormat/>
+    <w:rsid w:val="00BD58C9"/>
+    <w:pPr>
+      <w:ind w:left="720"/>
+      <w:contextualSpacing/>
+    </w:pPr>
+  </w:style>
 </w:styles>
 </file>
 

</xml_diff>